<commit_message>
Adopt the safety-audited coastal route (13 days, ~484 km)
Per the route safety audit, switch the live route from the Putty Road
line to the audited coastal corridor: New England Hwy to the Hunter,
then Newcastle, the Fernleigh Track, the Central Coast and the Old
Pacific Highway into Sydney, finishing at the SCG via the Harbour Bridge
walkway. 13 days, ~484 km, arrive 4 Jan 2027.

- the-415: new 13-day stages with inline safety flags; replace the Putty
  caution with the audit's 'biggest safety checks' callout; header/draft/
  facts (13 days) and the audit note updated (this corridor is now the
  route; finish is the SCG).
- Train page Stage 1 -> Attunga - Tamworth (~20 km), thirteen days.
- Regenerate the route book for the 13 coastal stages (finish sheet via
  the Harbour Bridge walkway). Bumps cache to limn-v13.

Co-Authored-By: Claude Opus 4.8 <noreply@anthropic.com>
Claude-Session: https://claude.ai/code/session_013RVgf2bvsePuKFKTHq9q9K
</commit_message>
<xml_diff>
--- a/Love-in-Motion-Route-Book.docx
+++ b/Love-in-Motion-Route-Book.docx
@@ -47,7 +47,7 @@
           <w:color w:val="7A6A5C"/>
           <w:sz w:val="21"/>
         </w:rPr>
-        <w:t>Attunga → Sydney Cricket Ground · ~490 km · 14 days · arrive 4 Jan 2027</w:t>
+        <w:t>Attunga → Sydney Cricket Ground · ~484 km · 13 days · arrive 4 Jan 2027</w:t>
       </w:r>
     </w:p>
     <w:p>
@@ -126,7 +126,7 @@
           <w:color w:val="3B2A1D"/>
           <w:sz w:val="21"/>
         </w:rPr>
-        <w:t>This route runs south down the New England Highway, through the Hunter Valley and Wollombi, then over the remote Putty Road into Sydney, finishing at the Sydney Cricket Ground on 4 January 2027. Estimated ~490 km over 14 days. Days 11–12 (Putty Road) are remote with no towns and are the highest-risk section — plan tight support-vehicle safety cover, or an alternative.</w:t>
+        <w:t>This is the safety-audited route: south down the New England Highway to the Hunter, then the coast through Newcastle, the Fernleigh Track and the Central Coast, and the Old Pacific Highway into Sydney, finishing at the Sydney Cricket Ground on 4 January 2027 via the Harbour Bridge walkway. Estimated ~484 km over 13 days (the M1 can't be run, so the legal route diverts to the coast). Biggest safety checks: Day 2 (~54 km, least-mapped), shoulder gaps on Days 2-4 and 6, keeping Day 7 off the Hunter Expressway, and the Hexham bridge and Hawkesbury crossings.</w:t>
       </w:r>
     </w:p>
     <w:tbl>
@@ -269,7 +269,7 @@
                 <w:color w:val="3B2A1D"/>
                 <w:sz w:val="19"/>
               </w:rPr>
-              <w:t>~30 km</w:t>
+              <w:t>~20 km</w:t>
             </w:r>
           </w:p>
         </w:tc>
@@ -331,7 +331,7 @@
                 <w:color w:val="3B2A1D"/>
                 <w:sz w:val="19"/>
               </w:rPr>
-              <w:t>~36 km</w:t>
+              <w:t>~54 km</w:t>
             </w:r>
           </w:p>
         </w:tc>
@@ -455,7 +455,7 @@
                 <w:color w:val="3B2A1D"/>
                 <w:sz w:val="19"/>
               </w:rPr>
-              <w:t>~39 km</w:t>
+              <w:t>~40 km</w:t>
             </w:r>
           </w:p>
         </w:tc>
@@ -517,7 +517,7 @@
                 <w:color w:val="3B2A1D"/>
                 <w:sz w:val="19"/>
               </w:rPr>
-              <w:t>~36 km</w:t>
+              <w:t>~26 km</w:t>
             </w:r>
           </w:p>
         </w:tc>
@@ -579,7 +579,7 @@
                 <w:color w:val="3B2A1D"/>
                 <w:sz w:val="19"/>
               </w:rPr>
-              <w:t>~43 km</w:t>
+              <w:t>~47 km</w:t>
             </w:r>
           </w:p>
         </w:tc>
@@ -626,7 +626,7 @@
                 <w:color w:val="3B2A1D"/>
                 <w:sz w:val="19"/>
               </w:rPr>
-              <w:t>Broke</w:t>
+              <w:t>Maitland</w:t>
             </w:r>
           </w:p>
         </w:tc>
@@ -641,7 +641,7 @@
                 <w:color w:val="3B2A1D"/>
                 <w:sz w:val="19"/>
               </w:rPr>
-              <w:t>~28 km</w:t>
+              <w:t>~49 km</w:t>
             </w:r>
           </w:p>
         </w:tc>
@@ -673,7 +673,7 @@
                 <w:color w:val="3B2A1D"/>
                 <w:sz w:val="19"/>
               </w:rPr>
-              <w:t>Broke</w:t>
+              <w:t>Maitland</w:t>
             </w:r>
           </w:p>
         </w:tc>
@@ -688,7 +688,7 @@
                 <w:color w:val="3B2A1D"/>
                 <w:sz w:val="19"/>
               </w:rPr>
-              <w:t>Pokolbin</w:t>
+              <w:t>Newcastle</w:t>
             </w:r>
           </w:p>
         </w:tc>
@@ -703,7 +703,7 @@
                 <w:color w:val="3B2A1D"/>
                 <w:sz w:val="19"/>
               </w:rPr>
-              <w:t>~27 km</w:t>
+              <w:t>~35 km</w:t>
             </w:r>
           </w:p>
         </w:tc>
@@ -735,7 +735,7 @@
                 <w:color w:val="3B2A1D"/>
                 <w:sz w:val="19"/>
               </w:rPr>
-              <w:t>Pokolbin</w:t>
+              <w:t>Newcastle</w:t>
             </w:r>
           </w:p>
         </w:tc>
@@ -750,7 +750,7 @@
                 <w:color w:val="3B2A1D"/>
                 <w:sz w:val="19"/>
               </w:rPr>
-              <w:t>Cessnock</w:t>
+              <w:t>Budgewoi</w:t>
             </w:r>
           </w:p>
         </w:tc>
@@ -765,7 +765,7 @@
                 <w:color w:val="3B2A1D"/>
                 <w:sz w:val="19"/>
               </w:rPr>
-              <w:t>~22 km</w:t>
+              <w:t>~50 km</w:t>
             </w:r>
           </w:p>
         </w:tc>
@@ -797,7 +797,7 @@
                 <w:color w:val="3B2A1D"/>
                 <w:sz w:val="19"/>
               </w:rPr>
-              <w:t>Cessnock</w:t>
+              <w:t>Budgewoi</w:t>
             </w:r>
           </w:p>
         </w:tc>
@@ -812,7 +812,7 @@
                 <w:color w:val="3B2A1D"/>
                 <w:sz w:val="19"/>
               </w:rPr>
-              <w:t>Wollombi</w:t>
+              <w:t>Gosford</w:t>
             </w:r>
           </w:p>
         </w:tc>
@@ -859,7 +859,7 @@
                 <w:color w:val="3B2A1D"/>
                 <w:sz w:val="19"/>
               </w:rPr>
-              <w:t>Wollombi</w:t>
+              <w:t>Gosford</w:t>
             </w:r>
           </w:p>
         </w:tc>
@@ -874,7 +874,7 @@
                 <w:color w:val="3B2A1D"/>
                 <w:sz w:val="19"/>
               </w:rPr>
-              <w:t>Putty Road support camp</w:t>
+              <w:t>Mooney Mooney</w:t>
             </w:r>
           </w:p>
         </w:tc>
@@ -889,7 +889,7 @@
                 <w:color w:val="3B2A1D"/>
                 <w:sz w:val="19"/>
               </w:rPr>
-              <w:t>~35 km</w:t>
+              <w:t>~28 km</w:t>
             </w:r>
           </w:p>
         </w:tc>
@@ -921,7 +921,7 @@
                 <w:color w:val="3B2A1D"/>
                 <w:sz w:val="19"/>
               </w:rPr>
-              <w:t>Putty Road support camp</w:t>
+              <w:t>Mooney Mooney</w:t>
             </w:r>
           </w:p>
         </w:tc>
@@ -936,7 +936,7 @@
                 <w:color w:val="3B2A1D"/>
                 <w:sz w:val="19"/>
               </w:rPr>
-              <w:t>Colo Heights</w:t>
+              <w:t>Hornsby</w:t>
             </w:r>
           </w:p>
         </w:tc>
@@ -983,7 +983,7 @@
                 <w:color w:val="3B2A1D"/>
                 <w:sz w:val="19"/>
               </w:rPr>
-              <w:t>Colo Heights</w:t>
+              <w:t>Hornsby</w:t>
             </w:r>
           </w:p>
         </w:tc>
@@ -998,7 +998,7 @@
                 <w:color w:val="3B2A1D"/>
                 <w:sz w:val="19"/>
               </w:rPr>
-              <w:t>Windsor</w:t>
+              <w:t>Sydney Cricket Ground</w:t>
             </w:r>
           </w:p>
         </w:tc>
@@ -1013,69 +1013,7 @@
                 <w:color w:val="3B2A1D"/>
                 <w:sz w:val="19"/>
               </w:rPr>
-              <w:t>~39 km</w:t>
-            </w:r>
-          </w:p>
-        </w:tc>
-      </w:tr>
-      <w:tr>
-        <w:tc>
-          <w:tcPr>
-            <w:tcW w:type="dxa" w:w="680"/>
-          </w:tcPr>
-          <w:p>
-            <w:r/>
-            <w:r>
-              <w:rPr>
-                <w:color w:val="3B2A1D"/>
-                <w:sz w:val="19"/>
-              </w:rPr>
-              <w:t>14</w:t>
-            </w:r>
-          </w:p>
-        </w:tc>
-        <w:tc>
-          <w:tcPr>
-            <w:tcW w:type="dxa" w:w="2608"/>
-          </w:tcPr>
-          <w:p>
-            <w:r/>
-            <w:r>
-              <w:rPr>
-                <w:color w:val="3B2A1D"/>
-                <w:sz w:val="19"/>
-              </w:rPr>
-              <w:t>Windsor</w:t>
-            </w:r>
-          </w:p>
-        </w:tc>
-        <w:tc>
-          <w:tcPr>
-            <w:tcW w:type="dxa" w:w="3515"/>
-          </w:tcPr>
-          <w:p>
-            <w:r/>
-            <w:r>
-              <w:rPr>
-                <w:color w:val="3B2A1D"/>
-                <w:sz w:val="19"/>
-              </w:rPr>
-              <w:t>Sydney Cricket Ground</w:t>
-            </w:r>
-          </w:p>
-        </w:tc>
-        <w:tc>
-          <w:tcPr>
-            <w:tcW w:type="dxa" w:w="1701"/>
-          </w:tcPr>
-          <w:p>
-            <w:r/>
-            <w:r>
-              <w:rPr>
-                <w:color w:val="3B2A1D"/>
-                <w:sz w:val="19"/>
-              </w:rPr>
-              <w:t>~44 km</w:t>
+              <w:t>~30 km</w:t>
             </w:r>
           </w:p>
         </w:tc>
@@ -1098,7 +1036,7 @@
           <w:color w:val="7A6A5C"/>
           <w:sz w:val="18"/>
         </w:rPr>
-        <w:t>Distances are planning estimates from the draft route and must be measured. Note: a 26 Dec start plus 14 days lands on ~8 Jan; to arrive on 4 Jan the start needs to be ~22 Dec (or the day count reduced) — reconcile before locking dates.</w:t>
+        <w:t>Distances are planning estimates from the draft route and must be measured. Note: a 26 Dec start plus 13 days lands on ~7 Jan; to arrive on 4 Jan the start needs to be ~23 Dec (or the day count reduced) — reconcile before locking dates.</w:t>
       </w:r>
     </w:p>
     <w:p>
@@ -1532,7 +1470,15 @@
           <w:color w:val="B87A2E"/>
           <w:sz w:val="22"/>
         </w:rPr>
-        <w:t>Approx. ~30 km</w:t>
+        <w:t>Approx. ~20 km</w:t>
+      </w:r>
+      <w:r>
+        <w:rPr>
+          <w:i/>
+          <w:color w:val="7A6A5C"/>
+          <w:sz w:val="19"/>
+        </w:rPr>
+        <w:t xml:space="preserve">   Launch day.</w:t>
       </w:r>
     </w:p>
     <w:p>
@@ -1790,7 +1736,7 @@
                 <w:color w:val="3B2A1D"/>
                 <w:sz w:val="18"/>
               </w:rPr>
-              <w:t>R2</w:t>
+              <w:t>Finish</w:t>
             </w:r>
           </w:p>
         </w:tc>
@@ -1805,67 +1751,7 @@
                 <w:color w:val="3B2A1D"/>
                 <w:sz w:val="18"/>
               </w:rPr>
-              <w:t>24</w:t>
-            </w:r>
-          </w:p>
-        </w:tc>
-        <w:tc>
-          <w:tcPr>
-            <w:tcW w:type="dxa" w:w="3515"/>
-          </w:tcPr>
-          <w:p>
-            <w:r/>
-            <w:r>
-              <w:rPr>
-                <w:color w:val="3B2A1D"/>
-                <w:sz w:val="18"/>
-              </w:rPr>
-            </w:r>
-          </w:p>
-        </w:tc>
-        <w:tc>
-          <w:tcPr>
-            <w:tcW w:type="dxa" w:w="3628"/>
-          </w:tcPr>
-          <w:p>
-            <w:r/>
-            <w:r>
-              <w:rPr>
-                <w:color w:val="3B2A1D"/>
-                <w:sz w:val="18"/>
-              </w:rPr>
-            </w:r>
-          </w:p>
-        </w:tc>
-      </w:tr>
-      <w:tr>
-        <w:tc>
-          <w:tcPr>
-            <w:tcW w:type="dxa" w:w="1020"/>
-          </w:tcPr>
-          <w:p>
-            <w:r/>
-            <w:r>
-              <w:rPr>
-                <w:color w:val="3B2A1D"/>
-                <w:sz w:val="18"/>
-              </w:rPr>
-              <w:t>Finish</w:t>
-            </w:r>
-          </w:p>
-        </w:tc>
-        <w:tc>
-          <w:tcPr>
-            <w:tcW w:type="dxa" w:w="907"/>
-          </w:tcPr>
-          <w:p>
-            <w:r/>
-            <w:r>
-              <w:rPr>
-                <w:color w:val="3B2A1D"/>
-                <w:sz w:val="18"/>
-              </w:rPr>
-              <w:t>30</w:t>
+              <w:t>20</w:t>
             </w:r>
           </w:p>
         </w:tc>
@@ -2708,7 +2594,7 @@
           <w:color w:val="B87A2E"/>
           <w:sz w:val="22"/>
         </w:rPr>
-        <w:t>Approx. ~36 km</w:t>
+        <w:t>Approx. ~54 km</w:t>
       </w:r>
       <w:r>
         <w:rPr>
@@ -2716,7 +2602,7 @@
           <w:color w:val="7A6A5C"/>
           <w:sz w:val="19"/>
         </w:rPr>
-        <w:t xml:space="preserve">   New England Highway, heading south. Small village — confirm services/accommodation.</w:t>
+        <w:t xml:space="preserve">   LONGEST &amp; least-mapped day — Street View pass + all-day support-vehicle shadowing essential.</w:t>
       </w:r>
     </w:p>
     <w:p>
@@ -3034,6 +2920,126 @@
                 <w:color w:val="3B2A1D"/>
                 <w:sz w:val="18"/>
               </w:rPr>
+              <w:t>R3</w:t>
+            </w:r>
+          </w:p>
+        </w:tc>
+        <w:tc>
+          <w:tcPr>
+            <w:tcW w:type="dxa" w:w="907"/>
+          </w:tcPr>
+          <w:p>
+            <w:r/>
+            <w:r>
+              <w:rPr>
+                <w:color w:val="3B2A1D"/>
+                <w:sz w:val="18"/>
+              </w:rPr>
+              <w:t>36</w:t>
+            </w:r>
+          </w:p>
+        </w:tc>
+        <w:tc>
+          <w:tcPr>
+            <w:tcW w:type="dxa" w:w="3515"/>
+          </w:tcPr>
+          <w:p>
+            <w:r/>
+            <w:r>
+              <w:rPr>
+                <w:color w:val="3B2A1D"/>
+                <w:sz w:val="18"/>
+              </w:rPr>
+            </w:r>
+          </w:p>
+        </w:tc>
+        <w:tc>
+          <w:tcPr>
+            <w:tcW w:type="dxa" w:w="3628"/>
+          </w:tcPr>
+          <w:p>
+            <w:r/>
+            <w:r>
+              <w:rPr>
+                <w:color w:val="3B2A1D"/>
+                <w:sz w:val="18"/>
+              </w:rPr>
+            </w:r>
+          </w:p>
+        </w:tc>
+      </w:tr>
+      <w:tr>
+        <w:tc>
+          <w:tcPr>
+            <w:tcW w:type="dxa" w:w="1020"/>
+          </w:tcPr>
+          <w:p>
+            <w:r/>
+            <w:r>
+              <w:rPr>
+                <w:color w:val="3B2A1D"/>
+                <w:sz w:val="18"/>
+              </w:rPr>
+              <w:t>R4</w:t>
+            </w:r>
+          </w:p>
+        </w:tc>
+        <w:tc>
+          <w:tcPr>
+            <w:tcW w:type="dxa" w:w="907"/>
+          </w:tcPr>
+          <w:p>
+            <w:r/>
+            <w:r>
+              <w:rPr>
+                <w:color w:val="3B2A1D"/>
+                <w:sz w:val="18"/>
+              </w:rPr>
+              <w:t>48</w:t>
+            </w:r>
+          </w:p>
+        </w:tc>
+        <w:tc>
+          <w:tcPr>
+            <w:tcW w:type="dxa" w:w="3515"/>
+          </w:tcPr>
+          <w:p>
+            <w:r/>
+            <w:r>
+              <w:rPr>
+                <w:color w:val="3B2A1D"/>
+                <w:sz w:val="18"/>
+              </w:rPr>
+            </w:r>
+          </w:p>
+        </w:tc>
+        <w:tc>
+          <w:tcPr>
+            <w:tcW w:type="dxa" w:w="3628"/>
+          </w:tcPr>
+          <w:p>
+            <w:r/>
+            <w:r>
+              <w:rPr>
+                <w:color w:val="3B2A1D"/>
+                <w:sz w:val="18"/>
+              </w:rPr>
+            </w:r>
+          </w:p>
+        </w:tc>
+      </w:tr>
+      <w:tr>
+        <w:tc>
+          <w:tcPr>
+            <w:tcW w:type="dxa" w:w="1020"/>
+          </w:tcPr>
+          <w:p>
+            <w:r/>
+            <w:r>
+              <w:rPr>
+                <w:color w:val="3B2A1D"/>
+                <w:sz w:val="18"/>
+              </w:rPr>
               <w:t>Finish</w:t>
             </w:r>
           </w:p>
@@ -3049,7 +3055,7 @@
                 <w:color w:val="3B2A1D"/>
                 <w:sz w:val="18"/>
               </w:rPr>
-              <w:t>36</w:t>
+              <w:t>54</w:t>
             </w:r>
           </w:p>
         </w:tc>
@@ -3900,7 +3906,7 @@
           <w:color w:val="7A6A5C"/>
           <w:sz w:val="19"/>
         </w:rPr>
-        <w:t xml:space="preserve">   Via Willow Tree (Willow Tree Inn / services).</w:t>
+        <w:t xml:space="preserve">   Via Willow Tree. Pass-country shoulder gaps around the climb to the Gap — verify.</w:t>
       </w:r>
     </w:p>
     <w:p>
@@ -5136,7 +5142,15 @@
           <w:color w:val="B87A2E"/>
           <w:sz w:val="22"/>
         </w:rPr>
-        <w:t>Approx. ~39 km</w:t>
+        <w:t>Approx. ~40 km</w:t>
+      </w:r>
+      <w:r>
+        <w:rPr>
+          <w:i/>
+          <w:color w:val="7A6A5C"/>
+          <w:sz w:val="19"/>
+        </w:rPr>
+        <w:t xml:space="preserve">   Murrurundi Gap climb early; mark exact gap chainages.</w:t>
       </w:r>
     </w:p>
     <w:p>
@@ -5529,7 +5543,7 @@
                 <w:color w:val="3B2A1D"/>
                 <w:sz w:val="18"/>
               </w:rPr>
-              <w:t>39</w:t>
+              <w:t>40</w:t>
             </w:r>
           </w:p>
         </w:tc>
@@ -6372,7 +6386,15 @@
           <w:color w:val="B87A2E"/>
           <w:sz w:val="22"/>
         </w:rPr>
-        <w:t>Approx. ~36 km</w:t>
+        <w:t>Approx. ~26 km</w:t>
+      </w:r>
+      <w:r>
+        <w:rPr>
+          <w:i/>
+          <w:color w:val="7A6A5C"/>
+          <w:sz w:val="19"/>
+        </w:rPr>
+        <w:t xml:space="preserve">   Recovery day. Scone &amp; Muswellbrook hospitals — confirm.</w:t>
       </w:r>
     </w:p>
     <w:p>
@@ -6705,7 +6727,7 @@
                 <w:color w:val="3B2A1D"/>
                 <w:sz w:val="18"/>
               </w:rPr>
-              <w:t>36</w:t>
+              <w:t>26</w:t>
             </w:r>
           </w:p>
         </w:tc>
@@ -7548,7 +7570,15 @@
           <w:color w:val="B87A2E"/>
           <w:sz w:val="22"/>
         </w:rPr>
-        <w:t>Approx. ~43 km</w:t>
+        <w:t>Approx. ~47 km</w:t>
+      </w:r>
+      <w:r>
+        <w:rPr>
+          <w:i/>
+          <w:color w:val="7A6A5C"/>
+          <w:sz w:val="19"/>
+        </w:rPr>
+        <w:t xml:space="preserve">   Coal-traffic corridor; verify shoulder gaps and plan crew points.</w:t>
       </w:r>
     </w:p>
     <w:p>
@@ -7941,7 +7971,7 @@
                 <w:color w:val="3B2A1D"/>
                 <w:sz w:val="18"/>
               </w:rPr>
-              <w:t>43</w:t>
+              <w:t>47</w:t>
             </w:r>
           </w:p>
         </w:tc>
@@ -8771,7 +8801,7 @@
           <w:color w:val="9C4526"/>
           <w:sz w:val="32"/>
         </w:rPr>
-        <w:t>Singleton → Broke</w:t>
+        <w:t>Singleton → Maitland</w:t>
       </w:r>
     </w:p>
     <w:p>
@@ -8784,7 +8814,7 @@
           <w:color w:val="B87A2E"/>
           <w:sz w:val="22"/>
         </w:rPr>
-        <w:t>Approx. ~28 km</w:t>
+        <w:t>Approx. ~49 km</w:t>
       </w:r>
       <w:r>
         <w:rPr>
@@ -8792,7 +8822,7 @@
           <w:color w:val="7A6A5C"/>
           <w:sz w:val="19"/>
         </w:rPr>
-        <w:t xml:space="preserve">   Into the Hunter vineyards.</w:t>
+        <w:t xml:space="preserve">   Via Branxton. Stay on the old New England Hwy — running is excluded on the Hunter Expressway.</w:t>
       </w:r>
     </w:p>
     <w:p>
@@ -9110,6 +9140,126 @@
                 <w:color w:val="3B2A1D"/>
                 <w:sz w:val="18"/>
               </w:rPr>
+              <w:t>R3</w:t>
+            </w:r>
+          </w:p>
+        </w:tc>
+        <w:tc>
+          <w:tcPr>
+            <w:tcW w:type="dxa" w:w="907"/>
+          </w:tcPr>
+          <w:p>
+            <w:r/>
+            <w:r>
+              <w:rPr>
+                <w:color w:val="3B2A1D"/>
+                <w:sz w:val="18"/>
+              </w:rPr>
+              <w:t>36</w:t>
+            </w:r>
+          </w:p>
+        </w:tc>
+        <w:tc>
+          <w:tcPr>
+            <w:tcW w:type="dxa" w:w="3515"/>
+          </w:tcPr>
+          <w:p>
+            <w:r/>
+            <w:r>
+              <w:rPr>
+                <w:color w:val="3B2A1D"/>
+                <w:sz w:val="18"/>
+              </w:rPr>
+            </w:r>
+          </w:p>
+        </w:tc>
+        <w:tc>
+          <w:tcPr>
+            <w:tcW w:type="dxa" w:w="3628"/>
+          </w:tcPr>
+          <w:p>
+            <w:r/>
+            <w:r>
+              <w:rPr>
+                <w:color w:val="3B2A1D"/>
+                <w:sz w:val="18"/>
+              </w:rPr>
+            </w:r>
+          </w:p>
+        </w:tc>
+      </w:tr>
+      <w:tr>
+        <w:tc>
+          <w:tcPr>
+            <w:tcW w:type="dxa" w:w="1020"/>
+          </w:tcPr>
+          <w:p>
+            <w:r/>
+            <w:r>
+              <w:rPr>
+                <w:color w:val="3B2A1D"/>
+                <w:sz w:val="18"/>
+              </w:rPr>
+              <w:t>R4</w:t>
+            </w:r>
+          </w:p>
+        </w:tc>
+        <w:tc>
+          <w:tcPr>
+            <w:tcW w:type="dxa" w:w="907"/>
+          </w:tcPr>
+          <w:p>
+            <w:r/>
+            <w:r>
+              <w:rPr>
+                <w:color w:val="3B2A1D"/>
+                <w:sz w:val="18"/>
+              </w:rPr>
+              <w:t>48</w:t>
+            </w:r>
+          </w:p>
+        </w:tc>
+        <w:tc>
+          <w:tcPr>
+            <w:tcW w:type="dxa" w:w="3515"/>
+          </w:tcPr>
+          <w:p>
+            <w:r/>
+            <w:r>
+              <w:rPr>
+                <w:color w:val="3B2A1D"/>
+                <w:sz w:val="18"/>
+              </w:rPr>
+            </w:r>
+          </w:p>
+        </w:tc>
+        <w:tc>
+          <w:tcPr>
+            <w:tcW w:type="dxa" w:w="3628"/>
+          </w:tcPr>
+          <w:p>
+            <w:r/>
+            <w:r>
+              <w:rPr>
+                <w:color w:val="3B2A1D"/>
+                <w:sz w:val="18"/>
+              </w:rPr>
+            </w:r>
+          </w:p>
+        </w:tc>
+      </w:tr>
+      <w:tr>
+        <w:tc>
+          <w:tcPr>
+            <w:tcW w:type="dxa" w:w="1020"/>
+          </w:tcPr>
+          <w:p>
+            <w:r/>
+            <w:r>
+              <w:rPr>
+                <w:color w:val="3B2A1D"/>
+                <w:sz w:val="18"/>
+              </w:rPr>
               <w:t>Finish</w:t>
             </w:r>
           </w:p>
@@ -9125,7 +9275,7 @@
                 <w:color w:val="3B2A1D"/>
                 <w:sz w:val="18"/>
               </w:rPr>
-              <w:t>28</w:t>
+              <w:t>49</w:t>
             </w:r>
           </w:p>
         </w:tc>
@@ -9140,7 +9290,7 @@
                 <w:color w:val="3B2A1D"/>
                 <w:sz w:val="18"/>
               </w:rPr>
-              <w:t>Broke</w:t>
+              <w:t>Maitland</w:t>
             </w:r>
           </w:p>
         </w:tc>
@@ -9217,7 +9367,7 @@
           <w:color w:val="26190F"/>
           <w:sz w:val="20"/>
         </w:rPr>
-        <w:t xml:space="preserve">Accommodation in Broke:  </w:t>
+        <w:t xml:space="preserve">Accommodation in Maitland:  </w:t>
       </w:r>
       <w:r>
         <w:rPr>
@@ -9955,7 +10105,7 @@
           <w:color w:val="9C4526"/>
           <w:sz w:val="32"/>
         </w:rPr>
-        <w:t>Broke → Pokolbin</w:t>
+        <w:t>Maitland → Newcastle</w:t>
       </w:r>
     </w:p>
     <w:p>
@@ -9968,7 +10118,7 @@
           <w:color w:val="B87A2E"/>
           <w:sz w:val="22"/>
         </w:rPr>
-        <w:t>Approx. ~27 km</w:t>
+        <w:t>Approx. ~35 km</w:t>
       </w:r>
       <w:r>
         <w:rPr>
@@ -9976,7 +10126,7 @@
           <w:color w:val="7A6A5C"/>
           <w:sz w:val="19"/>
         </w:rPr>
-        <w:t xml:space="preserve">   Pokolbin wine country.</w:t>
+        <w:t xml:space="preserve">   Urban shared paths; Hexham bridge pinch point — verify.</w:t>
       </w:r>
     </w:p>
     <w:p>
@@ -10309,7 +10459,7 @@
                 <w:color w:val="3B2A1D"/>
                 <w:sz w:val="18"/>
               </w:rPr>
-              <w:t>27</w:t>
+              <w:t>35</w:t>
             </w:r>
           </w:p>
         </w:tc>
@@ -10324,7 +10474,7 @@
                 <w:color w:val="3B2A1D"/>
                 <w:sz w:val="18"/>
               </w:rPr>
-              <w:t>Pokolbin</w:t>
+              <w:t>Newcastle</w:t>
             </w:r>
           </w:p>
         </w:tc>
@@ -10401,7 +10551,7 @@
           <w:color w:val="26190F"/>
           <w:sz w:val="20"/>
         </w:rPr>
-        <w:t xml:space="preserve">Accommodation in Pokolbin:  </w:t>
+        <w:t xml:space="preserve">Accommodation in Newcastle:  </w:t>
       </w:r>
       <w:r>
         <w:rPr>
@@ -11139,7 +11289,7 @@
           <w:color w:val="9C4526"/>
           <w:sz w:val="32"/>
         </w:rPr>
-        <w:t>Pokolbin → Cessnock</w:t>
+        <w:t>Newcastle → Budgewoi</w:t>
       </w:r>
     </w:p>
     <w:p>
@@ -11152,7 +11302,7 @@
           <w:color w:val="B87A2E"/>
           <w:sz w:val="22"/>
         </w:rPr>
-        <w:t>Approx. ~22 km</w:t>
+        <w:t>Approx. ~50 km</w:t>
       </w:r>
       <w:r>
         <w:rPr>
@@ -11160,7 +11310,7 @@
           <w:color w:val="7A6A5C"/>
           <w:sz w:val="19"/>
         </w:rPr>
-        <w:t xml:space="preserve">   Short day — recover before the remote section.</w:t>
+        <w:t xml:space="preserve">   Fernleigh Track (15 km off-road) + coastal paths — the best-protected long day.</w:t>
       </w:r>
     </w:p>
     <w:p>
@@ -11418,6 +11568,186 @@
                 <w:color w:val="3B2A1D"/>
                 <w:sz w:val="18"/>
               </w:rPr>
+              <w:t>R2</w:t>
+            </w:r>
+          </w:p>
+        </w:tc>
+        <w:tc>
+          <w:tcPr>
+            <w:tcW w:type="dxa" w:w="907"/>
+          </w:tcPr>
+          <w:p>
+            <w:r/>
+            <w:r>
+              <w:rPr>
+                <w:color w:val="3B2A1D"/>
+                <w:sz w:val="18"/>
+              </w:rPr>
+              <w:t>24</w:t>
+            </w:r>
+          </w:p>
+        </w:tc>
+        <w:tc>
+          <w:tcPr>
+            <w:tcW w:type="dxa" w:w="3515"/>
+          </w:tcPr>
+          <w:p>
+            <w:r/>
+            <w:r>
+              <w:rPr>
+                <w:color w:val="3B2A1D"/>
+                <w:sz w:val="18"/>
+              </w:rPr>
+            </w:r>
+          </w:p>
+        </w:tc>
+        <w:tc>
+          <w:tcPr>
+            <w:tcW w:type="dxa" w:w="3628"/>
+          </w:tcPr>
+          <w:p>
+            <w:r/>
+            <w:r>
+              <w:rPr>
+                <w:color w:val="3B2A1D"/>
+                <w:sz w:val="18"/>
+              </w:rPr>
+            </w:r>
+          </w:p>
+        </w:tc>
+      </w:tr>
+      <w:tr>
+        <w:tc>
+          <w:tcPr>
+            <w:tcW w:type="dxa" w:w="1020"/>
+          </w:tcPr>
+          <w:p>
+            <w:r/>
+            <w:r>
+              <w:rPr>
+                <w:color w:val="3B2A1D"/>
+                <w:sz w:val="18"/>
+              </w:rPr>
+              <w:t>R3</w:t>
+            </w:r>
+          </w:p>
+        </w:tc>
+        <w:tc>
+          <w:tcPr>
+            <w:tcW w:type="dxa" w:w="907"/>
+          </w:tcPr>
+          <w:p>
+            <w:r/>
+            <w:r>
+              <w:rPr>
+                <w:color w:val="3B2A1D"/>
+                <w:sz w:val="18"/>
+              </w:rPr>
+              <w:t>36</w:t>
+            </w:r>
+          </w:p>
+        </w:tc>
+        <w:tc>
+          <w:tcPr>
+            <w:tcW w:type="dxa" w:w="3515"/>
+          </w:tcPr>
+          <w:p>
+            <w:r/>
+            <w:r>
+              <w:rPr>
+                <w:color w:val="3B2A1D"/>
+                <w:sz w:val="18"/>
+              </w:rPr>
+            </w:r>
+          </w:p>
+        </w:tc>
+        <w:tc>
+          <w:tcPr>
+            <w:tcW w:type="dxa" w:w="3628"/>
+          </w:tcPr>
+          <w:p>
+            <w:r/>
+            <w:r>
+              <w:rPr>
+                <w:color w:val="3B2A1D"/>
+                <w:sz w:val="18"/>
+              </w:rPr>
+            </w:r>
+          </w:p>
+        </w:tc>
+      </w:tr>
+      <w:tr>
+        <w:tc>
+          <w:tcPr>
+            <w:tcW w:type="dxa" w:w="1020"/>
+          </w:tcPr>
+          <w:p>
+            <w:r/>
+            <w:r>
+              <w:rPr>
+                <w:color w:val="3B2A1D"/>
+                <w:sz w:val="18"/>
+              </w:rPr>
+              <w:t>R4</w:t>
+            </w:r>
+          </w:p>
+        </w:tc>
+        <w:tc>
+          <w:tcPr>
+            <w:tcW w:type="dxa" w:w="907"/>
+          </w:tcPr>
+          <w:p>
+            <w:r/>
+            <w:r>
+              <w:rPr>
+                <w:color w:val="3B2A1D"/>
+                <w:sz w:val="18"/>
+              </w:rPr>
+              <w:t>48</w:t>
+            </w:r>
+          </w:p>
+        </w:tc>
+        <w:tc>
+          <w:tcPr>
+            <w:tcW w:type="dxa" w:w="3515"/>
+          </w:tcPr>
+          <w:p>
+            <w:r/>
+            <w:r>
+              <w:rPr>
+                <w:color w:val="3B2A1D"/>
+                <w:sz w:val="18"/>
+              </w:rPr>
+            </w:r>
+          </w:p>
+        </w:tc>
+        <w:tc>
+          <w:tcPr>
+            <w:tcW w:type="dxa" w:w="3628"/>
+          </w:tcPr>
+          <w:p>
+            <w:r/>
+            <w:r>
+              <w:rPr>
+                <w:color w:val="3B2A1D"/>
+                <w:sz w:val="18"/>
+              </w:rPr>
+            </w:r>
+          </w:p>
+        </w:tc>
+      </w:tr>
+      <w:tr>
+        <w:tc>
+          <w:tcPr>
+            <w:tcW w:type="dxa" w:w="1020"/>
+          </w:tcPr>
+          <w:p>
+            <w:r/>
+            <w:r>
+              <w:rPr>
+                <w:color w:val="3B2A1D"/>
+                <w:sz w:val="18"/>
+              </w:rPr>
               <w:t>Finish</w:t>
             </w:r>
           </w:p>
@@ -11433,7 +11763,7 @@
                 <w:color w:val="3B2A1D"/>
                 <w:sz w:val="18"/>
               </w:rPr>
-              <w:t>22</w:t>
+              <w:t>50</w:t>
             </w:r>
           </w:p>
         </w:tc>
@@ -11448,7 +11778,7 @@
                 <w:color w:val="3B2A1D"/>
                 <w:sz w:val="18"/>
               </w:rPr>
-              <w:t>Cessnock</w:t>
+              <w:t>Budgewoi</w:t>
             </w:r>
           </w:p>
         </w:tc>
@@ -11525,7 +11855,7 @@
           <w:color w:val="26190F"/>
           <w:sz w:val="20"/>
         </w:rPr>
-        <w:t xml:space="preserve">Accommodation in Cessnock:  </w:t>
+        <w:t xml:space="preserve">Accommodation in Budgewoi:  </w:t>
       </w:r>
       <w:r>
         <w:rPr>
@@ -12263,7 +12593,7 @@
           <w:color w:val="9C4526"/>
           <w:sz w:val="32"/>
         </w:rPr>
-        <w:t>Cessnock → Wollombi</w:t>
+        <w:t>Budgewoi → Gosford</w:t>
       </w:r>
     </w:p>
     <w:p>
@@ -12284,7 +12614,7 @@
           <w:color w:val="7A6A5C"/>
           <w:sz w:val="19"/>
         </w:rPr>
-        <w:t xml:space="preserve">   Last town before the remote stretch — stock up.</w:t>
+        <w:t xml:space="preserve">   Central Coast shared-path network; The Entrance waterfront.</w:t>
       </w:r>
     </w:p>
     <w:p>
@@ -12692,7 +13022,7 @@
                 <w:color w:val="3B2A1D"/>
                 <w:sz w:val="18"/>
               </w:rPr>
-              <w:t>Wollombi</w:t>
+              <w:t>Gosford</w:t>
             </w:r>
           </w:p>
         </w:tc>
@@ -12769,7 +13099,7 @@
           <w:color w:val="26190F"/>
           <w:sz w:val="20"/>
         </w:rPr>
-        <w:t xml:space="preserve">Accommodation in Wollombi:  </w:t>
+        <w:t xml:space="preserve">Accommodation in Gosford:  </w:t>
       </w:r>
       <w:r>
         <w:rPr>
@@ -13507,7 +13837,7 @@
           <w:color w:val="9C4526"/>
           <w:sz w:val="32"/>
         </w:rPr>
-        <w:t>Wollombi → Putty Road support camp</w:t>
+        <w:t>Gosford → Mooney Mooney</w:t>
       </w:r>
     </w:p>
     <w:p>
@@ -13520,7 +13850,7 @@
           <w:color w:val="B87A2E"/>
           <w:sz w:val="22"/>
         </w:rPr>
-        <w:t>Approx. ~35 km</w:t>
+        <w:t>Approx. ~28 km</w:t>
       </w:r>
       <w:r>
         <w:rPr>
@@ -13528,7 +13858,7 @@
           <w:color w:val="7A6A5C"/>
           <w:sz w:val="19"/>
         </w:rPr>
-        <w:t xml:space="preserve">   REMOTE — no town. Pre-arranged support-vehicle stop and camping. Grey Gum Cafe is the only services on the Putty Road (halfway Windsor-Singleton).</w:t>
+        <w:t xml:space="preserve">   Onto the Old Pacific Hwy. Short on purpose — fresh legs for the Old Pac climbs.</w:t>
       </w:r>
     </w:p>
     <w:p>
@@ -13861,7 +14191,7 @@
                 <w:color w:val="3B2A1D"/>
                 <w:sz w:val="18"/>
               </w:rPr>
-              <w:t>35</w:t>
+              <w:t>28</w:t>
             </w:r>
           </w:p>
         </w:tc>
@@ -13876,7 +14206,7 @@
                 <w:color w:val="3B2A1D"/>
                 <w:sz w:val="18"/>
               </w:rPr>
-              <w:t>Putty Road support camp</w:t>
+              <w:t>Mooney Mooney</w:t>
             </w:r>
           </w:p>
         </w:tc>
@@ -13953,7 +14283,7 @@
           <w:color w:val="26190F"/>
           <w:sz w:val="20"/>
         </w:rPr>
-        <w:t xml:space="preserve">Accommodation in Putty Road support camp:  </w:t>
+        <w:t xml:space="preserve">Accommodation in Mooney Mooney:  </w:t>
       </w:r>
       <w:r>
         <w:rPr>
@@ -14691,7 +15021,7 @@
           <w:color w:val="9C4526"/>
           <w:sz w:val="32"/>
         </w:rPr>
-        <w:t>Putty Road support camp → Colo Heights</w:t>
+        <w:t>Mooney Mooney → Hornsby</w:t>
       </w:r>
     </w:p>
     <w:p>
@@ -14712,7 +15042,7 @@
           <w:color w:val="7A6A5C"/>
           <w:sz w:val="19"/>
         </w:rPr>
-        <w:t xml:space="preserve">   REMOTE — Putty Road: winding, popular with fast motorcycles, minimal shoulder. Vehicle-escort safety cover essential; no night running.</w:t>
+        <w:t xml:space="preserve">   Via Brooklyn. Confirm the Hawkesbury crossing; Pie in the Sky / Cowan climbs.</w:t>
       </w:r>
     </w:p>
     <w:p>
@@ -15060,7 +15390,7 @@
                 <w:color w:val="3B2A1D"/>
                 <w:sz w:val="18"/>
               </w:rPr>
-              <w:t>Colo Heights</w:t>
+              <w:t>Hornsby</w:t>
             </w:r>
           </w:p>
         </w:tc>
@@ -15137,7 +15467,7 @@
           <w:color w:val="26190F"/>
           <w:sz w:val="20"/>
         </w:rPr>
-        <w:t xml:space="preserve">Accommodation in Colo Heights:  </w:t>
+        <w:t xml:space="preserve">Accommodation in Hornsby:  </w:t>
       </w:r>
       <w:r>
         <w:rPr>
@@ -15875,7 +16205,7 @@
           <w:color w:val="9C4526"/>
           <w:sz w:val="32"/>
         </w:rPr>
-        <w:t>Colo Heights → Windsor</w:t>
+        <w:t>Hornsby → Sydney Cricket Ground</w:t>
       </w:r>
     </w:p>
     <w:p>
@@ -15888,7 +16218,15 @@
           <w:color w:val="B87A2E"/>
           <w:sz w:val="22"/>
         </w:rPr>
-        <w:t>Approx. ~39 km</w:t>
+        <w:t>Approx. ~30 km</w:t>
+      </w:r>
+      <w:r>
+        <w:rPr>
+          <w:i/>
+          <w:color w:val="7A6A5C"/>
+          <w:sz w:val="19"/>
+        </w:rPr>
+        <w:t xml:space="preserve">   Finish day — via the Sydney Harbour Bridge walkway to the SCG. Arrive Sun 4 Jan 2027.</w:t>
       </w:r>
     </w:p>
     <w:p>
@@ -16206,7 +16544,7 @@
                 <w:color w:val="3B2A1D"/>
                 <w:sz w:val="18"/>
               </w:rPr>
-              <w:t>R3</w:t>
+              <w:t>Finish</w:t>
             </w:r>
           </w:p>
         </w:tc>
@@ -16221,7 +16559,7 @@
                 <w:color w:val="3B2A1D"/>
                 <w:sz w:val="18"/>
               </w:rPr>
-              <w:t>36</w:t>
+              <w:t>30</w:t>
             </w:r>
           </w:p>
         </w:tc>
@@ -16236,67 +16574,7 @@
                 <w:color w:val="3B2A1D"/>
                 <w:sz w:val="18"/>
               </w:rPr>
-            </w:r>
-          </w:p>
-        </w:tc>
-        <w:tc>
-          <w:tcPr>
-            <w:tcW w:type="dxa" w:w="3628"/>
-          </w:tcPr>
-          <w:p>
-            <w:r/>
-            <w:r>
-              <w:rPr>
-                <w:color w:val="3B2A1D"/>
-                <w:sz w:val="18"/>
-              </w:rPr>
-            </w:r>
-          </w:p>
-        </w:tc>
-      </w:tr>
-      <w:tr>
-        <w:tc>
-          <w:tcPr>
-            <w:tcW w:type="dxa" w:w="1020"/>
-          </w:tcPr>
-          <w:p>
-            <w:r/>
-            <w:r>
-              <w:rPr>
-                <w:color w:val="3B2A1D"/>
-                <w:sz w:val="18"/>
-              </w:rPr>
-              <w:t>Finish</w:t>
-            </w:r>
-          </w:p>
-        </w:tc>
-        <w:tc>
-          <w:tcPr>
-            <w:tcW w:type="dxa" w:w="907"/>
-          </w:tcPr>
-          <w:p>
-            <w:r/>
-            <w:r>
-              <w:rPr>
-                <w:color w:val="3B2A1D"/>
-                <w:sz w:val="18"/>
-              </w:rPr>
-              <w:t>39</w:t>
-            </w:r>
-          </w:p>
-        </w:tc>
-        <w:tc>
-          <w:tcPr>
-            <w:tcW w:type="dxa" w:w="3515"/>
-          </w:tcPr>
-          <w:p>
-            <w:r/>
-            <w:r>
-              <w:rPr>
-                <w:color w:val="3B2A1D"/>
-                <w:sz w:val="18"/>
-              </w:rPr>
-              <w:t>Windsor</w:t>
+              <w:t>Sydney Cricket Ground</w:t>
             </w:r>
           </w:p>
         </w:tc>
@@ -16373,7 +16651,7 @@
           <w:color w:val="26190F"/>
           <w:sz w:val="20"/>
         </w:rPr>
-        <w:t xml:space="preserve">Accommodation in Windsor:  </w:t>
+        <w:t xml:space="preserve">Accommodation in Sydney Cricket Ground:  </w:t>
       </w:r>
       <w:r>
         <w:rPr>
@@ -17097,7 +17375,7 @@
           <w:color w:val="9C4526"/>
           <w:sz w:val="18"/>
         </w:rPr>
-        <w:t>DAY 14</w:t>
+        <w:t>THE SYDNEY FINISH</w:t>
       </w:r>
     </w:p>
     <w:p>
@@ -17111,1251 +17389,7 @@
           <w:color w:val="9C4526"/>
           <w:sz w:val="32"/>
         </w:rPr>
-        <w:t>Windsor → Sydney Cricket Ground</w:t>
-      </w:r>
-    </w:p>
-    <w:p>
-      <w:pPr>
-        <w:spacing w:after="160"/>
-      </w:pPr>
-      <w:r>
-        <w:rPr>
-          <w:b/>
-          <w:color w:val="B87A2E"/>
-          <w:sz w:val="22"/>
-        </w:rPr>
-        <w:t>Approx. ~44 km</w:t>
-      </w:r>
-      <w:r>
-        <w:rPr>
-          <w:i/>
-          <w:color w:val="7A6A5C"/>
-          <w:sz w:val="19"/>
-        </w:rPr>
-        <w:t xml:space="preserve">   Final approach from the north-west; arrive Sun 4 Jan 2027. Consider a shorter final leg for a supporter/media finish.</w:t>
-      </w:r>
-    </w:p>
-    <w:p>
-      <w:pPr>
-        <w:spacing w:after="60"/>
-      </w:pPr>
-      <w:r>
-        <w:rPr>
-          <w:b/>
-          <w:color w:val="26190F"/>
-          <w:sz w:val="20"/>
-        </w:rPr>
-        <w:t xml:space="preserve">Terrain &amp; elevation profile:  </w:t>
-      </w:r>
-      <w:r>
-        <w:rPr>
-          <w:b/>
-          <w:color w:val="BC335F"/>
-          <w:sz w:val="18"/>
-        </w:rPr>
-        <w:t xml:space="preserve">[VERIFY] </w:t>
-      </w:r>
-      <w:r>
-        <w:rPr>
-          <w:i/>
-          <w:color w:val="7A6A5C"/>
-          <w:sz w:val="18"/>
-        </w:rPr>
-        <w:t>climbs, descents, surface</w:t>
-      </w:r>
-    </w:p>
-    <w:p>
-      <w:pPr>
-        <w:spacing w:after="60"/>
-      </w:pPr>
-      <w:r>
-        <w:rPr>
-          <w:b/>
-          <w:color w:val="26190F"/>
-          <w:sz w:val="20"/>
-        </w:rPr>
-        <w:t xml:space="preserve">Turn-by-turn roads:  </w:t>
-      </w:r>
-      <w:r>
-        <w:rPr>
-          <w:b/>
-          <w:color w:val="BC335F"/>
-          <w:sz w:val="18"/>
-        </w:rPr>
-        <w:t xml:space="preserve">[VERIFY] </w:t>
-      </w:r>
-      <w:r>
-        <w:rPr>
-          <w:i/>
-          <w:color w:val="7A6A5C"/>
-          <w:sz w:val="18"/>
-        </w:rPr>
-        <w:t>list each road, shoulder width, bridges, pedestrian/active-transport restrictions</w:t>
-      </w:r>
-    </w:p>
-    <w:p>
-      <w:pPr>
-        <w:spacing w:after="60"/>
-      </w:pPr>
-      <w:r>
-        <w:rPr>
-          <w:b/>
-          <w:color w:val="26190F"/>
-          <w:sz w:val="20"/>
-        </w:rPr>
-        <w:t xml:space="preserve">Map link / GPX file:  </w:t>
-      </w:r>
-      <w:r>
-        <w:rPr>
-          <w:b/>
-          <w:color w:val="BC335F"/>
-          <w:sz w:val="18"/>
-        </w:rPr>
-        <w:t xml:space="preserve">[VERIFY] </w:t>
-      </w:r>
-      <w:r>
-        <w:rPr>
-          <w:i/>
-          <w:color w:val="7A6A5C"/>
-          <w:sz w:val="18"/>
-        </w:rPr>
-        <w:t>attach GPX + Google Maps URL</w:t>
-      </w:r>
-    </w:p>
-    <w:p>
-      <w:pPr>
-        <w:spacing w:before="160" w:after="120"/>
-      </w:pPr>
-      <w:r>
-        <w:rPr>
-          <w:rFonts w:ascii="Calibri" w:hAnsi="Calibri"/>
-          <w:b/>
-          <w:color w:val="26190F"/>
-          <w:sz w:val="22"/>
-        </w:rPr>
-        <w:t>Support-vehicle rendezvous  (~every 12 km)</w:t>
-      </w:r>
-    </w:p>
-    <w:tbl>
-      <w:tblPr>
-        <w:tblStyle w:val="LightGrid-Accent1"/>
-        <w:tblW w:type="auto" w:w="0"/>
-        <w:tblLook w:firstColumn="1" w:firstRow="1" w:lastColumn="0" w:lastRow="0" w:noHBand="0" w:noVBand="1" w:val="04A0"/>
-      </w:tblPr>
-      <w:tblGrid>
-        <w:gridCol w:w="2493"/>
-        <w:gridCol w:w="2493"/>
-        <w:gridCol w:w="2493"/>
-        <w:gridCol w:w="2493"/>
-      </w:tblGrid>
-      <w:tr>
-        <w:tc>
-          <w:tcPr>
-            <w:tcW w:type="dxa" w:w="1020"/>
-            <w:shd w:val="clear" w:fill="F1E8DD"/>
-          </w:tcPr>
-          <w:p>
-            <w:r/>
-            <w:r>
-              <w:rPr>
-                <w:b/>
-                <w:color w:val="26190F"/>
-                <w:sz w:val="18"/>
-              </w:rPr>
-              <w:t>Point</w:t>
-            </w:r>
-          </w:p>
-        </w:tc>
-        <w:tc>
-          <w:tcPr>
-            <w:tcW w:type="dxa" w:w="907"/>
-            <w:shd w:val="clear" w:fill="F1E8DD"/>
-          </w:tcPr>
-          <w:p>
-            <w:r/>
-            <w:r>
-              <w:rPr>
-                <w:b/>
-                <w:color w:val="26190F"/>
-                <w:sz w:val="18"/>
-              </w:rPr>
-              <w:t>~km</w:t>
-            </w:r>
-          </w:p>
-        </w:tc>
-        <w:tc>
-          <w:tcPr>
-            <w:tcW w:type="dxa" w:w="3515"/>
-            <w:shd w:val="clear" w:fill="F1E8DD"/>
-          </w:tcPr>
-          <w:p>
-            <w:r/>
-            <w:r>
-              <w:rPr>
-                <w:b/>
-                <w:color w:val="26190F"/>
-                <w:sz w:val="18"/>
-              </w:rPr>
-              <w:t>Location (VERIFY)</w:t>
-            </w:r>
-          </w:p>
-        </w:tc>
-        <w:tc>
-          <w:tcPr>
-            <w:tcW w:type="dxa" w:w="3628"/>
-            <w:shd w:val="clear" w:fill="F1E8DD"/>
-          </w:tcPr>
-          <w:p>
-            <w:r/>
-            <w:r>
-              <w:rPr>
-                <w:b/>
-                <w:color w:val="26190F"/>
-                <w:sz w:val="18"/>
-              </w:rPr>
-              <w:t>Water / food / notes (VERIFY)</w:t>
-            </w:r>
-          </w:p>
-        </w:tc>
-      </w:tr>
-      <w:tr>
-        <w:tc>
-          <w:tcPr>
-            <w:tcW w:type="dxa" w:w="1020"/>
-          </w:tcPr>
-          <w:p>
-            <w:r/>
-            <w:r>
-              <w:rPr>
-                <w:color w:val="3B2A1D"/>
-                <w:sz w:val="18"/>
-              </w:rPr>
-              <w:t>R1</w:t>
-            </w:r>
-          </w:p>
-        </w:tc>
-        <w:tc>
-          <w:tcPr>
-            <w:tcW w:type="dxa" w:w="907"/>
-          </w:tcPr>
-          <w:p>
-            <w:r/>
-            <w:r>
-              <w:rPr>
-                <w:color w:val="3B2A1D"/>
-                <w:sz w:val="18"/>
-              </w:rPr>
-              <w:t>12</w:t>
-            </w:r>
-          </w:p>
-        </w:tc>
-        <w:tc>
-          <w:tcPr>
-            <w:tcW w:type="dxa" w:w="3515"/>
-          </w:tcPr>
-          <w:p>
-            <w:r/>
-            <w:r>
-              <w:rPr>
-                <w:color w:val="3B2A1D"/>
-                <w:sz w:val="18"/>
-              </w:rPr>
-            </w:r>
-          </w:p>
-        </w:tc>
-        <w:tc>
-          <w:tcPr>
-            <w:tcW w:type="dxa" w:w="3628"/>
-          </w:tcPr>
-          <w:p>
-            <w:r/>
-            <w:r>
-              <w:rPr>
-                <w:color w:val="3B2A1D"/>
-                <w:sz w:val="18"/>
-              </w:rPr>
-            </w:r>
-          </w:p>
-        </w:tc>
-      </w:tr>
-      <w:tr>
-        <w:tc>
-          <w:tcPr>
-            <w:tcW w:type="dxa" w:w="1020"/>
-          </w:tcPr>
-          <w:p>
-            <w:r/>
-            <w:r>
-              <w:rPr>
-                <w:color w:val="3B2A1D"/>
-                <w:sz w:val="18"/>
-              </w:rPr>
-              <w:t>R2</w:t>
-            </w:r>
-          </w:p>
-        </w:tc>
-        <w:tc>
-          <w:tcPr>
-            <w:tcW w:type="dxa" w:w="907"/>
-          </w:tcPr>
-          <w:p>
-            <w:r/>
-            <w:r>
-              <w:rPr>
-                <w:color w:val="3B2A1D"/>
-                <w:sz w:val="18"/>
-              </w:rPr>
-              <w:t>24</w:t>
-            </w:r>
-          </w:p>
-        </w:tc>
-        <w:tc>
-          <w:tcPr>
-            <w:tcW w:type="dxa" w:w="3515"/>
-          </w:tcPr>
-          <w:p>
-            <w:r/>
-            <w:r>
-              <w:rPr>
-                <w:color w:val="3B2A1D"/>
-                <w:sz w:val="18"/>
-              </w:rPr>
-            </w:r>
-          </w:p>
-        </w:tc>
-        <w:tc>
-          <w:tcPr>
-            <w:tcW w:type="dxa" w:w="3628"/>
-          </w:tcPr>
-          <w:p>
-            <w:r/>
-            <w:r>
-              <w:rPr>
-                <w:color w:val="3B2A1D"/>
-                <w:sz w:val="18"/>
-              </w:rPr>
-            </w:r>
-          </w:p>
-        </w:tc>
-      </w:tr>
-      <w:tr>
-        <w:tc>
-          <w:tcPr>
-            <w:tcW w:type="dxa" w:w="1020"/>
-          </w:tcPr>
-          <w:p>
-            <w:r/>
-            <w:r>
-              <w:rPr>
-                <w:color w:val="3B2A1D"/>
-                <w:sz w:val="18"/>
-              </w:rPr>
-              <w:t>R3</w:t>
-            </w:r>
-          </w:p>
-        </w:tc>
-        <w:tc>
-          <w:tcPr>
-            <w:tcW w:type="dxa" w:w="907"/>
-          </w:tcPr>
-          <w:p>
-            <w:r/>
-            <w:r>
-              <w:rPr>
-                <w:color w:val="3B2A1D"/>
-                <w:sz w:val="18"/>
-              </w:rPr>
-              <w:t>36</w:t>
-            </w:r>
-          </w:p>
-        </w:tc>
-        <w:tc>
-          <w:tcPr>
-            <w:tcW w:type="dxa" w:w="3515"/>
-          </w:tcPr>
-          <w:p>
-            <w:r/>
-            <w:r>
-              <w:rPr>
-                <w:color w:val="3B2A1D"/>
-                <w:sz w:val="18"/>
-              </w:rPr>
-            </w:r>
-          </w:p>
-        </w:tc>
-        <w:tc>
-          <w:tcPr>
-            <w:tcW w:type="dxa" w:w="3628"/>
-          </w:tcPr>
-          <w:p>
-            <w:r/>
-            <w:r>
-              <w:rPr>
-                <w:color w:val="3B2A1D"/>
-                <w:sz w:val="18"/>
-              </w:rPr>
-            </w:r>
-          </w:p>
-        </w:tc>
-      </w:tr>
-      <w:tr>
-        <w:tc>
-          <w:tcPr>
-            <w:tcW w:type="dxa" w:w="1020"/>
-          </w:tcPr>
-          <w:p>
-            <w:r/>
-            <w:r>
-              <w:rPr>
-                <w:color w:val="3B2A1D"/>
-                <w:sz w:val="18"/>
-              </w:rPr>
-              <w:t>Finish</w:t>
-            </w:r>
-          </w:p>
-        </w:tc>
-        <w:tc>
-          <w:tcPr>
-            <w:tcW w:type="dxa" w:w="907"/>
-          </w:tcPr>
-          <w:p>
-            <w:r/>
-            <w:r>
-              <w:rPr>
-                <w:color w:val="3B2A1D"/>
-                <w:sz w:val="18"/>
-              </w:rPr>
-              <w:t>44</w:t>
-            </w:r>
-          </w:p>
-        </w:tc>
-        <w:tc>
-          <w:tcPr>
-            <w:tcW w:type="dxa" w:w="3515"/>
-          </w:tcPr>
-          <w:p>
-            <w:r/>
-            <w:r>
-              <w:rPr>
-                <w:color w:val="3B2A1D"/>
-                <w:sz w:val="18"/>
-              </w:rPr>
-              <w:t>Sydney Cricket Ground</w:t>
-            </w:r>
-          </w:p>
-        </w:tc>
-        <w:tc>
-          <w:tcPr>
-            <w:tcW w:type="dxa" w:w="3628"/>
-          </w:tcPr>
-          <w:p>
-            <w:r/>
-            <w:r>
-              <w:rPr>
-                <w:color w:val="3B2A1D"/>
-                <w:sz w:val="18"/>
-              </w:rPr>
-            </w:r>
-          </w:p>
-        </w:tc>
-      </w:tr>
-    </w:tbl>
-    <w:p>
-      <w:pPr>
-        <w:spacing w:before="0" w:after="80"/>
-      </w:pPr>
-    </w:p>
-    <w:p>
-      <w:pPr>
-        <w:spacing w:after="60"/>
-      </w:pPr>
-      <w:r>
-        <w:rPr>
-          <w:b/>
-          <w:color w:val="26190F"/>
-          <w:sz w:val="20"/>
-        </w:rPr>
-        <w:t xml:space="preserve">Water refill points:  </w:t>
-      </w:r>
-      <w:r>
-        <w:rPr>
-          <w:b/>
-          <w:color w:val="BC335F"/>
-          <w:sz w:val="18"/>
-        </w:rPr>
-        <w:t xml:space="preserve">[VERIFY] </w:t>
-      </w:r>
-    </w:p>
-    <w:p>
-      <w:pPr>
-        <w:spacing w:after="60"/>
-      </w:pPr>
-      <w:r>
-        <w:rPr>
-          <w:b/>
-          <w:color w:val="26190F"/>
-          <w:sz w:val="20"/>
-        </w:rPr>
-        <w:t xml:space="preserve">Food / cafés:  </w:t>
-      </w:r>
-      <w:r>
-        <w:rPr>
-          <w:b/>
-          <w:color w:val="BC335F"/>
-          <w:sz w:val="18"/>
-        </w:rPr>
-        <w:t xml:space="preserve">[VERIFY] </w:t>
-      </w:r>
-    </w:p>
-    <w:p>
-      <w:pPr>
-        <w:spacing w:after="60"/>
-      </w:pPr>
-      <w:r>
-        <w:rPr>
-          <w:b/>
-          <w:color w:val="26190F"/>
-          <w:sz w:val="20"/>
-        </w:rPr>
-        <w:t xml:space="preserve">Accommodation in Sydney Cricket Ground:  </w:t>
-      </w:r>
-      <w:r>
-        <w:rPr>
-          <w:b/>
-          <w:color w:val="BC335F"/>
-          <w:sz w:val="18"/>
-        </w:rPr>
-        <w:t xml:space="preserve">[VERIFY] </w:t>
-      </w:r>
-      <w:r>
-        <w:rPr>
-          <w:i/>
-          <w:color w:val="7A6A5C"/>
-          <w:sz w:val="18"/>
-        </w:rPr>
-        <w:t>name · contact · booked? · ref</w:t>
-      </w:r>
-    </w:p>
-    <w:p>
-      <w:pPr>
-        <w:spacing w:after="60"/>
-      </w:pPr>
-      <w:r>
-        <w:rPr>
-          <w:b/>
-          <w:color w:val="26190F"/>
-          <w:sz w:val="20"/>
-        </w:rPr>
-        <w:t xml:space="preserve">Nearest hospital / ambulance / 24-hr pharmacy:  </w:t>
-      </w:r>
-      <w:r>
-        <w:rPr>
-          <w:b/>
-          <w:color w:val="BC335F"/>
-          <w:sz w:val="18"/>
-        </w:rPr>
-        <w:t xml:space="preserve">[VERIFY] </w:t>
-      </w:r>
-    </w:p>
-    <w:p>
-      <w:pPr>
-        <w:spacing w:after="60"/>
-      </w:pPr>
-      <w:r>
-        <w:rPr>
-          <w:b/>
-          <w:color w:val="26190F"/>
-          <w:sz w:val="20"/>
-        </w:rPr>
-        <w:t xml:space="preserve">Road-safety notes:  </w:t>
-      </w:r>
-      <w:r>
-        <w:rPr>
-          <w:b/>
-          <w:color w:val="BC335F"/>
-          <w:sz w:val="18"/>
-        </w:rPr>
-        <w:t xml:space="preserve">[VERIFY] </w:t>
-      </w:r>
-      <w:r>
-        <w:rPr>
-          <w:i/>
-          <w:color w:val="7A6A5C"/>
-          <w:sz w:val="18"/>
-        </w:rPr>
-        <w:t>no-shoulder sections, bridges, level crossings, night sections</w:t>
-      </w:r>
-    </w:p>
-    <w:p>
-      <w:pPr>
-        <w:spacing w:after="60"/>
-      </w:pPr>
-      <w:r>
-        <w:rPr>
-          <w:b/>
-          <w:color w:val="26190F"/>
-          <w:sz w:val="20"/>
-        </w:rPr>
-        <w:t xml:space="preserve">Contingency / bail-out:  </w:t>
-      </w:r>
-      <w:r>
-        <w:rPr>
-          <w:b/>
-          <w:color w:val="BC335F"/>
-          <w:sz w:val="18"/>
-        </w:rPr>
-        <w:t xml:space="preserve">[VERIFY] </w:t>
-      </w:r>
-      <w:r>
-        <w:rPr>
-          <w:i/>
-          <w:color w:val="7A6A5C"/>
-          <w:sz w:val="18"/>
-        </w:rPr>
-        <w:t>alternative road, pickup point, shorten plan</w:t>
-      </w:r>
-    </w:p>
-    <w:p>
-      <w:pPr>
-        <w:spacing w:before="160" w:after="120"/>
-      </w:pPr>
-      <w:r>
-        <w:rPr>
-          <w:rFonts w:ascii="Calibri" w:hAnsi="Calibri"/>
-          <w:b/>
-          <w:color w:val="26190F"/>
-          <w:sz w:val="22"/>
-        </w:rPr>
-        <w:t>Risk assessment</w:t>
-      </w:r>
-    </w:p>
-    <w:tbl>
-      <w:tblPr>
-        <w:tblStyle w:val="LightGrid-Accent1"/>
-        <w:tblW w:type="auto" w:w="0"/>
-        <w:tblLook w:firstColumn="1" w:firstRow="1" w:lastColumn="0" w:lastRow="0" w:noHBand="0" w:noVBand="1" w:val="04A0"/>
-      </w:tblPr>
-      <w:tblGrid>
-        <w:gridCol w:w="2493"/>
-        <w:gridCol w:w="2493"/>
-        <w:gridCol w:w="2493"/>
-        <w:gridCol w:w="2493"/>
-      </w:tblGrid>
-      <w:tr>
-        <w:tc>
-          <w:tcPr>
-            <w:tcW w:type="dxa" w:w="2041"/>
-            <w:shd w:val="clear" w:fill="F1E8DD"/>
-          </w:tcPr>
-          <w:p>
-            <w:r/>
-            <w:r>
-              <w:rPr>
-                <w:b/>
-                <w:color w:val="26190F"/>
-                <w:sz w:val="18"/>
-              </w:rPr>
-              <w:t>Hazard</w:t>
-            </w:r>
-          </w:p>
-        </w:tc>
-        <w:tc>
-          <w:tcPr>
-            <w:tcW w:type="dxa" w:w="1134"/>
-            <w:shd w:val="clear" w:fill="F1E8DD"/>
-          </w:tcPr>
-          <w:p>
-            <w:r/>
-            <w:r>
-              <w:rPr>
-                <w:b/>
-                <w:color w:val="26190F"/>
-                <w:sz w:val="18"/>
-              </w:rPr>
-              <w:t>Likelihood</w:t>
-            </w:r>
-          </w:p>
-        </w:tc>
-        <w:tc>
-          <w:tcPr>
-            <w:tcW w:type="dxa" w:w="1247"/>
-            <w:shd w:val="clear" w:fill="F1E8DD"/>
-          </w:tcPr>
-          <w:p>
-            <w:r/>
-            <w:r>
-              <w:rPr>
-                <w:b/>
-                <w:color w:val="26190F"/>
-                <w:sz w:val="18"/>
-              </w:rPr>
-              <w:t>Consequence</w:t>
-            </w:r>
-          </w:p>
-        </w:tc>
-        <w:tc>
-          <w:tcPr>
-            <w:tcW w:type="dxa" w:w="4649"/>
-            <w:shd w:val="clear" w:fill="F1E8DD"/>
-          </w:tcPr>
-          <w:p>
-            <w:r/>
-            <w:r>
-              <w:rPr>
-                <w:b/>
-                <w:color w:val="26190F"/>
-                <w:sz w:val="18"/>
-              </w:rPr>
-              <w:t>Mitigation</w:t>
-            </w:r>
-          </w:p>
-        </w:tc>
-      </w:tr>
-      <w:tr>
-        <w:tc>
-          <w:tcPr>
-            <w:tcW w:type="dxa" w:w="2041"/>
-          </w:tcPr>
-          <w:p>
-            <w:r/>
-            <w:r>
-              <w:rPr>
-                <w:color w:val="3B2A1D"/>
-                <w:sz w:val="17"/>
-              </w:rPr>
-              <w:t>Heat / heat illness</w:t>
-            </w:r>
-          </w:p>
-        </w:tc>
-        <w:tc>
-          <w:tcPr>
-            <w:tcW w:type="dxa" w:w="1134"/>
-          </w:tcPr>
-          <w:p>
-            <w:r/>
-            <w:r>
-              <w:rPr>
-                <w:color w:val="3B2A1D"/>
-                <w:sz w:val="17"/>
-              </w:rPr>
-              <w:t>High</w:t>
-            </w:r>
-          </w:p>
-        </w:tc>
-        <w:tc>
-          <w:tcPr>
-            <w:tcW w:type="dxa" w:w="1247"/>
-          </w:tcPr>
-          <w:p>
-            <w:r/>
-            <w:r>
-              <w:rPr>
-                <w:color w:val="3B2A1D"/>
-                <w:sz w:val="17"/>
-              </w:rPr>
-              <w:t>High</w:t>
-            </w:r>
-          </w:p>
-        </w:tc>
-        <w:tc>
-          <w:tcPr>
-            <w:tcW w:type="dxa" w:w="4649"/>
-          </w:tcPr>
-          <w:p>
-            <w:r/>
-            <w:r>
-              <w:rPr>
-                <w:color w:val="3B2A1D"/>
-                <w:sz w:val="17"/>
-              </w:rPr>
-              <w:t>Dawn start; shade rests through midday; electrolytes; cold water/ice at each R-point; monitor for cramps, nausea, confusion — stop early.</w:t>
-            </w:r>
-          </w:p>
-        </w:tc>
-      </w:tr>
-      <w:tr>
-        <w:tc>
-          <w:tcPr>
-            <w:tcW w:type="dxa" w:w="2041"/>
-          </w:tcPr>
-          <w:p>
-            <w:r/>
-            <w:r>
-              <w:rPr>
-                <w:color w:val="3B2A1D"/>
-                <w:sz w:val="17"/>
-              </w:rPr>
-              <w:t>Traffic / narrow shoulder</w:t>
-            </w:r>
-          </w:p>
-        </w:tc>
-        <w:tc>
-          <w:tcPr>
-            <w:tcW w:type="dxa" w:w="1134"/>
-          </w:tcPr>
-          <w:p>
-            <w:r/>
-            <w:r>
-              <w:rPr>
-                <w:color w:val="3B2A1D"/>
-                <w:sz w:val="17"/>
-              </w:rPr>
-              <w:t>Med</w:t>
-            </w:r>
-          </w:p>
-        </w:tc>
-        <w:tc>
-          <w:tcPr>
-            <w:tcW w:type="dxa" w:w="1247"/>
-          </w:tcPr>
-          <w:p>
-            <w:r/>
-            <w:r>
-              <w:rPr>
-                <w:color w:val="3B2A1D"/>
-                <w:sz w:val="17"/>
-              </w:rPr>
-              <w:t>High</w:t>
-            </w:r>
-          </w:p>
-        </w:tc>
-        <w:tc>
-          <w:tcPr>
-            <w:tcW w:type="dxa" w:w="4649"/>
-          </w:tcPr>
-          <w:p>
-            <w:r/>
-            <w:r>
-              <w:rPr>
-                <w:color w:val="3B2A1D"/>
-                <w:sz w:val="17"/>
-              </w:rPr>
-              <w:t>Hi-vis + lights; run facing traffic where safe; crew tail on blind sections; contingency route where no shoulder.</w:t>
-            </w:r>
-          </w:p>
-        </w:tc>
-      </w:tr>
-      <w:tr>
-        <w:tc>
-          <w:tcPr>
-            <w:tcW w:type="dxa" w:w="2041"/>
-          </w:tcPr>
-          <w:p>
-            <w:r/>
-            <w:r>
-              <w:rPr>
-                <w:color w:val="3B2A1D"/>
-                <w:sz w:val="17"/>
-              </w:rPr>
-              <w:t>Dehydration / under-fuelling</w:t>
-            </w:r>
-          </w:p>
-        </w:tc>
-        <w:tc>
-          <w:tcPr>
-            <w:tcW w:type="dxa" w:w="1134"/>
-          </w:tcPr>
-          <w:p>
-            <w:r/>
-            <w:r>
-              <w:rPr>
-                <w:color w:val="3B2A1D"/>
-                <w:sz w:val="17"/>
-              </w:rPr>
-              <w:t>Med</w:t>
-            </w:r>
-          </w:p>
-        </w:tc>
-        <w:tc>
-          <w:tcPr>
-            <w:tcW w:type="dxa" w:w="1247"/>
-          </w:tcPr>
-          <w:p>
-            <w:r/>
-            <w:r>
-              <w:rPr>
-                <w:color w:val="3B2A1D"/>
-                <w:sz w:val="17"/>
-              </w:rPr>
-              <w:t>Med</w:t>
-            </w:r>
-          </w:p>
-        </w:tc>
-        <w:tc>
-          <w:tcPr>
-            <w:tcW w:type="dxa" w:w="4649"/>
-          </w:tcPr>
-          <w:p>
-            <w:r/>
-            <w:r>
-              <w:rPr>
-                <w:color w:val="3B2A1D"/>
-                <w:sz w:val="17"/>
-              </w:rPr>
-              <w:t>Water + 60–90 g carbs/hr from km 1; never skip an R-point; weigh in/out where possible.</w:t>
-            </w:r>
-          </w:p>
-        </w:tc>
-      </w:tr>
-      <w:tr>
-        <w:tc>
-          <w:tcPr>
-            <w:tcW w:type="dxa" w:w="2041"/>
-          </w:tcPr>
-          <w:p>
-            <w:r/>
-            <w:r>
-              <w:rPr>
-                <w:color w:val="3B2A1D"/>
-                <w:sz w:val="17"/>
-              </w:rPr>
-              <w:t>Blisters / chafe / feet</w:t>
-            </w:r>
-          </w:p>
-        </w:tc>
-        <w:tc>
-          <w:tcPr>
-            <w:tcW w:type="dxa" w:w="1134"/>
-          </w:tcPr>
-          <w:p>
-            <w:r/>
-            <w:r>
-              <w:rPr>
-                <w:color w:val="3B2A1D"/>
-                <w:sz w:val="17"/>
-              </w:rPr>
-              <w:t>High</w:t>
-            </w:r>
-          </w:p>
-        </w:tc>
-        <w:tc>
-          <w:tcPr>
-            <w:tcW w:type="dxa" w:w="1247"/>
-          </w:tcPr>
-          <w:p>
-            <w:r/>
-            <w:r>
-              <w:rPr>
-                <w:color w:val="3B2A1D"/>
-                <w:sz w:val="17"/>
-              </w:rPr>
-              <w:t>Med</w:t>
-            </w:r>
-          </w:p>
-        </w:tc>
-        <w:tc>
-          <w:tcPr>
-            <w:tcW w:type="dxa" w:w="4649"/>
-          </w:tcPr>
-          <w:p>
-            <w:r/>
-            <w:r>
-              <w:rPr>
-                <w:color w:val="3B2A1D"/>
-                <w:sz w:val="17"/>
-              </w:rPr>
-              <w:t>Proven shoes &amp; socks; lube; treat hot spots immediately; sock change at halfway.</w:t>
-            </w:r>
-          </w:p>
-        </w:tc>
-      </w:tr>
-      <w:tr>
-        <w:tc>
-          <w:tcPr>
-            <w:tcW w:type="dxa" w:w="2041"/>
-          </w:tcPr>
-          <w:p>
-            <w:r/>
-            <w:r>
-              <w:rPr>
-                <w:color w:val="3B2A1D"/>
-                <w:sz w:val="17"/>
-              </w:rPr>
-              <w:t>Fatigue / overuse injury</w:t>
-            </w:r>
-          </w:p>
-        </w:tc>
-        <w:tc>
-          <w:tcPr>
-            <w:tcW w:type="dxa" w:w="1134"/>
-          </w:tcPr>
-          <w:p>
-            <w:r/>
-            <w:r>
-              <w:rPr>
-                <w:color w:val="3B2A1D"/>
-                <w:sz w:val="17"/>
-              </w:rPr>
-              <w:t>Med</w:t>
-            </w:r>
-          </w:p>
-        </w:tc>
-        <w:tc>
-          <w:tcPr>
-            <w:tcW w:type="dxa" w:w="1247"/>
-          </w:tcPr>
-          <w:p>
-            <w:r/>
-            <w:r>
-              <w:rPr>
-                <w:color w:val="3B2A1D"/>
-                <w:sz w:val="17"/>
-              </w:rPr>
-              <w:t>High</w:t>
-            </w:r>
-          </w:p>
-        </w:tc>
-        <w:tc>
-          <w:tcPr>
-            <w:tcW w:type="dxa" w:w="4649"/>
-          </w:tcPr>
-          <w:p>
-            <w:r/>
-            <w:r>
-              <w:rPr>
-                <w:color w:val="3B2A1D"/>
-                <w:sz w:val="17"/>
-              </w:rPr>
-              <w:t>Run/walk to plan; honest RPE; physio nightly; bail-out criteria agreed.</w:t>
-            </w:r>
-          </w:p>
-        </w:tc>
-      </w:tr>
-      <w:tr>
-        <w:tc>
-          <w:tcPr>
-            <w:tcW w:type="dxa" w:w="2041"/>
-          </w:tcPr>
-          <w:p>
-            <w:r/>
-            <w:r>
-              <w:rPr>
-                <w:color w:val="3B2A1D"/>
-                <w:sz w:val="17"/>
-              </w:rPr>
-              <w:t>Weather / storm / fire</w:t>
-            </w:r>
-          </w:p>
-        </w:tc>
-        <w:tc>
-          <w:tcPr>
-            <w:tcW w:type="dxa" w:w="1134"/>
-          </w:tcPr>
-          <w:p>
-            <w:r/>
-            <w:r>
-              <w:rPr>
-                <w:color w:val="3B2A1D"/>
-                <w:sz w:val="17"/>
-              </w:rPr>
-              <w:t>Low</w:t>
-            </w:r>
-          </w:p>
-        </w:tc>
-        <w:tc>
-          <w:tcPr>
-            <w:tcW w:type="dxa" w:w="1247"/>
-          </w:tcPr>
-          <w:p>
-            <w:r/>
-            <w:r>
-              <w:rPr>
-                <w:color w:val="3B2A1D"/>
-                <w:sz w:val="17"/>
-              </w:rPr>
-              <w:t>High</w:t>
-            </w:r>
-          </w:p>
-        </w:tc>
-        <w:tc>
-          <w:tcPr>
-            <w:tcW w:type="dxa" w:w="4649"/>
-          </w:tcPr>
-          <w:p>
-            <w:r/>
-            <w:r>
-              <w:rPr>
-                <w:color w:val="3B2A1D"/>
-                <w:sz w:val="17"/>
-              </w:rPr>
-              <w:t>Check forecast &amp; RFS the night before; contingency day; do not run in dangerous conditions.</w:t>
-            </w:r>
-          </w:p>
-        </w:tc>
-      </w:tr>
-      <w:tr>
-        <w:tc>
-          <w:tcPr>
-            <w:tcW w:type="dxa" w:w="2041"/>
-          </w:tcPr>
-          <w:p>
-            <w:r/>
-            <w:r>
-              <w:rPr>
-                <w:color w:val="3B2A1D"/>
-                <w:sz w:val="17"/>
-              </w:rPr>
-              <w:t>Wildlife / dogs / livestock</w:t>
-            </w:r>
-          </w:p>
-        </w:tc>
-        <w:tc>
-          <w:tcPr>
-            <w:tcW w:type="dxa" w:w="1134"/>
-          </w:tcPr>
-          <w:p>
-            <w:r/>
-            <w:r>
-              <w:rPr>
-                <w:color w:val="3B2A1D"/>
-                <w:sz w:val="17"/>
-              </w:rPr>
-              <w:t>Low</w:t>
-            </w:r>
-          </w:p>
-        </w:tc>
-        <w:tc>
-          <w:tcPr>
-            <w:tcW w:type="dxa" w:w="1247"/>
-          </w:tcPr>
-          <w:p>
-            <w:r/>
-            <w:r>
-              <w:rPr>
-                <w:color w:val="3B2A1D"/>
-                <w:sz w:val="17"/>
-              </w:rPr>
-              <w:t>Med</w:t>
-            </w:r>
-          </w:p>
-        </w:tc>
-        <w:tc>
-          <w:tcPr>
-            <w:tcW w:type="dxa" w:w="4649"/>
-          </w:tcPr>
-          <w:p>
-            <w:r/>
-            <w:r>
-              <w:rPr>
-                <w:color w:val="3B2A1D"/>
-                <w:sz w:val="17"/>
-              </w:rPr>
-              <w:t>Awareness; crew forewarns; carry plan for aggressive dogs.</w:t>
-            </w:r>
-          </w:p>
-        </w:tc>
-      </w:tr>
-    </w:tbl>
-    <w:p>
-      <w:pPr>
-        <w:spacing w:before="160" w:after="120"/>
-      </w:pPr>
-      <w:r>
-        <w:rPr>
-          <w:rFonts w:ascii="Calibri" w:hAnsi="Calibri"/>
-          <w:b/>
-          <w:color w:val="26190F"/>
-          <w:sz w:val="22"/>
-        </w:rPr>
-        <w:t>Heat plan</w:t>
-      </w:r>
-    </w:p>
-    <w:p>
-      <w:pPr>
-        <w:pStyle w:val="ListBullet"/>
-        <w:spacing w:after="20"/>
-      </w:pPr>
-      <w:r>
-        <w:rPr>
-          <w:color w:val="3B2A1D"/>
-          <w:sz w:val="19"/>
-        </w:rPr>
-        <w:t>Start time (VERIFY, first light): __________</w:t>
-      </w:r>
-    </w:p>
-    <w:p>
-      <w:pPr>
-        <w:pStyle w:val="ListBullet"/>
-        <w:spacing w:after="20"/>
-      </w:pPr>
-      <w:r>
-        <w:rPr>
-          <w:color w:val="3B2A1D"/>
-          <w:sz w:val="19"/>
-        </w:rPr>
-        <w:t>Forecast max / feels-like: __________</w:t>
-      </w:r>
-    </w:p>
-    <w:p>
-      <w:pPr>
-        <w:pStyle w:val="ListBullet"/>
-        <w:spacing w:after="20"/>
-      </w:pPr>
-      <w:r>
-        <w:rPr>
-          <w:color w:val="3B2A1D"/>
-          <w:sz w:val="19"/>
-        </w:rPr>
-        <w:t>Shade rest window (midday): __________</w:t>
-      </w:r>
-    </w:p>
-    <w:p>
-      <w:pPr>
-        <w:pStyle w:val="ListBullet"/>
-        <w:spacing w:after="20"/>
-      </w:pPr>
-      <w:r>
-        <w:rPr>
-          <w:color w:val="3B2A1D"/>
-          <w:sz w:val="19"/>
-        </w:rPr>
-        <w:t>Extra water/ice at R-points: yes / no</w:t>
-      </w:r>
-    </w:p>
-    <w:p>
-      <w:pPr>
-        <w:pStyle w:val="ListBullet"/>
-        <w:spacing w:after="20"/>
-      </w:pPr>
-      <w:r>
-        <w:rPr>
-          <w:color w:val="3B2A1D"/>
-          <w:sz w:val="19"/>
-        </w:rPr>
-        <w:t>Cut-off / go-slow trigger temperature: __________</w:t>
-      </w:r>
-    </w:p>
-    <w:p>
-      <w:r>
-        <w:br w:type="page"/>
-      </w:r>
-    </w:p>
-    <w:p>
-      <w:pPr>
-        <w:spacing w:after="40"/>
-      </w:pPr>
-      <w:r>
-        <w:rPr>
-          <w:rFonts w:ascii="Calibri" w:hAnsi="Calibri"/>
-          <w:b/>
-          <w:color w:val="9C4526"/>
-          <w:sz w:val="18"/>
-        </w:rPr>
-        <w:t>THE SYDNEY FINISH</w:t>
-      </w:r>
-    </w:p>
-    <w:p>
-      <w:pPr>
-        <w:spacing w:before="0" w:after="120"/>
-      </w:pPr>
-      <w:r>
-        <w:rPr>
-          <w:rFonts w:ascii="Calibri" w:hAnsi="Calibri"/>
-          <w:b/>
-          <w:color w:val="9C4526"/>
-          <w:sz w:val="32"/>
-        </w:rPr>
-        <w:t>Day 14 — Windsor into the Sydney Cricket Ground</w:t>
+        <w:t>Day 13 — Hornsby into the Sydney Cricket Ground</w:t>
       </w:r>
     </w:p>
     <w:p>
@@ -18370,7 +17404,91 @@
           <w:color w:val="3B2A1D"/>
           <w:sz w:val="20"/>
         </w:rPr>
-        <w:t>The route reaches Sydney from the north-west via Windsor, so the final approach into the SCG must be designed and verified (this is not the Harbour Bridge/north-shore line). Aim for a safe, supporter- and media-friendly finish, ideally a shorter final leg (25–30 km) so supporters can join, with time for interviews and a memorable arrival at the SCG on 4 January 2027.</w:t>
+        <w:t>The route reaches Sydney from the north via the Old Pacific Highway and Hornsby, then the North Shore and the Sydney Harbour Bridge walkway to the SCG. Confirm pedestrian access on every metro segment (Harbour Bridge walkway, city and Moore Park approaches). Aim for a supporter- and media-friendly finish — ideally a shorter final leg so supporters can join, with time for interviews and a memorable arrival at the SCG on 4 January 2027.</w:t>
+      </w:r>
+    </w:p>
+    <w:p>
+      <w:pPr>
+        <w:pStyle w:val="ListNumber"/>
+        <w:spacing w:after="20"/>
+      </w:pPr>
+      <w:r>
+        <w:rPr>
+          <w:b w:val="0"/>
+          <w:color w:val="3B2A1D"/>
+          <w:sz w:val="21"/>
+        </w:rPr>
+        <w:t>Hornsby</w:t>
+      </w:r>
+    </w:p>
+    <w:p>
+      <w:pPr>
+        <w:pStyle w:val="ListNumber"/>
+        <w:spacing w:after="20"/>
+      </w:pPr>
+      <w:r>
+        <w:rPr>
+          <w:b w:val="0"/>
+          <w:color w:val="3B2A1D"/>
+          <w:sz w:val="21"/>
+        </w:rPr>
+        <w:t>North Shore to the Harbour</w:t>
+      </w:r>
+    </w:p>
+    <w:p>
+      <w:pPr>
+        <w:pStyle w:val="ListNumber"/>
+        <w:spacing w:after="20"/>
+      </w:pPr>
+      <w:r>
+        <w:rPr>
+          <w:b w:val="0"/>
+          <w:color w:val="3B2A1D"/>
+          <w:sz w:val="21"/>
+        </w:rPr>
+        <w:t>Sydney Harbour Bridge walkway</w:t>
+      </w:r>
+    </w:p>
+    <w:p>
+      <w:pPr>
+        <w:pStyle w:val="ListNumber"/>
+        <w:spacing w:after="20"/>
+      </w:pPr>
+      <w:r>
+        <w:rPr>
+          <w:b w:val="0"/>
+          <w:color w:val="3B2A1D"/>
+          <w:sz w:val="21"/>
+        </w:rPr>
+        <w:t>Sydney city</w:t>
+      </w:r>
+    </w:p>
+    <w:p>
+      <w:pPr>
+        <w:pStyle w:val="ListNumber"/>
+        <w:spacing w:after="20"/>
+      </w:pPr>
+      <w:r>
+        <w:rPr>
+          <w:b w:val="0"/>
+          <w:color w:val="3B2A1D"/>
+          <w:sz w:val="21"/>
+        </w:rPr>
+        <w:t>Moore Park</w:t>
+      </w:r>
+    </w:p>
+    <w:p>
+      <w:pPr>
+        <w:pStyle w:val="ListNumber"/>
+        <w:spacing w:after="20"/>
+      </w:pPr>
+      <w:r>
+        <w:rPr>
+          <w:b/>
+          <w:color w:val="9C4526"/>
+          <w:sz w:val="21"/>
+        </w:rPr>
+        <w:t>Sydney Cricket Ground</w:t>
       </w:r>
     </w:p>
     <w:p>
@@ -20068,7 +19186,7 @@
                 <w:color w:val="3B2A1D"/>
                 <w:sz w:val="17"/>
               </w:rPr>
-              <w:t>7  Singleton→Broke</w:t>
+              <w:t>7  Singleton→Maitland</w:t>
             </w:r>
           </w:p>
         </w:tc>
@@ -20160,7 +19278,7 @@
                 <w:color w:val="3B2A1D"/>
                 <w:sz w:val="17"/>
               </w:rPr>
-              <w:t>8  Broke→Pokolbin</w:t>
+              <w:t>8  Maitland→Newcastle</w:t>
             </w:r>
           </w:p>
         </w:tc>
@@ -20252,7 +19370,7 @@
                 <w:color w:val="3B2A1D"/>
                 <w:sz w:val="17"/>
               </w:rPr>
-              <w:t>9  Pokolbin→Cessnock</w:t>
+              <w:t>9  Newcastle→Budgewoi</w:t>
             </w:r>
           </w:p>
         </w:tc>
@@ -20344,7 +19462,7 @@
                 <w:color w:val="3B2A1D"/>
                 <w:sz w:val="17"/>
               </w:rPr>
-              <w:t>10  Cessnock→Wollombi</w:t>
+              <w:t>10  Budgewoi→Gosford</w:t>
             </w:r>
           </w:p>
         </w:tc>
@@ -20436,7 +19554,7 @@
                 <w:color w:val="3B2A1D"/>
                 <w:sz w:val="17"/>
               </w:rPr>
-              <w:t>11  Wollombi→Putty Road support camp</w:t>
+              <w:t>11  Gosford→Mooney Mooney</w:t>
             </w:r>
           </w:p>
         </w:tc>
@@ -20528,7 +19646,7 @@
                 <w:color w:val="3B2A1D"/>
                 <w:sz w:val="17"/>
               </w:rPr>
-              <w:t>12  Putty Road support camp→Colo Heights</w:t>
+              <w:t>12  Mooney Mooney→Hornsby</w:t>
             </w:r>
           </w:p>
         </w:tc>
@@ -20620,99 +19738,7 @@
                 <w:color w:val="3B2A1D"/>
                 <w:sz w:val="17"/>
               </w:rPr>
-              <w:t>13  Colo Heights→Windsor</w:t>
-            </w:r>
-          </w:p>
-        </w:tc>
-        <w:tc>
-          <w:tcPr>
-            <w:tcW w:type="dxa" w:w="1701"/>
-          </w:tcPr>
-          <w:p>
-            <w:r/>
-            <w:r>
-              <w:rPr>
-                <w:color w:val="7A6A5C"/>
-                <w:sz w:val="20"/>
-              </w:rPr>
-              <w:t>☐</w:t>
-            </w:r>
-          </w:p>
-        </w:tc>
-        <w:tc>
-          <w:tcPr>
-            <w:tcW w:type="dxa" w:w="1701"/>
-          </w:tcPr>
-          <w:p>
-            <w:r/>
-            <w:r>
-              <w:rPr>
-                <w:color w:val="7A6A5C"/>
-                <w:sz w:val="20"/>
-              </w:rPr>
-              <w:t>☐</w:t>
-            </w:r>
-          </w:p>
-        </w:tc>
-        <w:tc>
-          <w:tcPr>
-            <w:tcW w:type="dxa" w:w="1474"/>
-          </w:tcPr>
-          <w:p>
-            <w:r/>
-            <w:r>
-              <w:rPr>
-                <w:color w:val="7A6A5C"/>
-                <w:sz w:val="20"/>
-              </w:rPr>
-              <w:t>☐</w:t>
-            </w:r>
-          </w:p>
-        </w:tc>
-        <w:tc>
-          <w:tcPr>
-            <w:tcW w:type="dxa" w:w="1361"/>
-          </w:tcPr>
-          <w:p>
-            <w:r/>
-            <w:r>
-              <w:rPr>
-                <w:color w:val="7A6A5C"/>
-                <w:sz w:val="20"/>
-              </w:rPr>
-              <w:t>☐</w:t>
-            </w:r>
-          </w:p>
-        </w:tc>
-        <w:tc>
-          <w:tcPr>
-            <w:tcW w:type="dxa" w:w="1361"/>
-          </w:tcPr>
-          <w:p>
-            <w:r/>
-            <w:r>
-              <w:rPr>
-                <w:color w:val="7A6A5C"/>
-                <w:sz w:val="20"/>
-              </w:rPr>
-              <w:t>☐</w:t>
-            </w:r>
-          </w:p>
-        </w:tc>
-      </w:tr>
-      <w:tr>
-        <w:tc>
-          <w:tcPr>
-            <w:tcW w:type="dxa" w:w="1928"/>
-          </w:tcPr>
-          <w:p>
-            <w:r/>
-            <w:r>
-              <w:rPr>
-                <w:color w:val="3B2A1D"/>
-                <w:sz w:val="17"/>
-              </w:rPr>
-              <w:t>14  Windsor→Sydney Cricket Ground</w:t>
+              <w:t>13  Hornsby→Sydney Cricket Ground</w:t>
             </w:r>
           </w:p>
         </w:tc>

</xml_diff>

<commit_message>
Lock dates (23 Dec -> 4 Jan, Pink Test) + mark verified route facts
Dates: the run now starts Wed 23 Dec 2026 and finishes Mon 4 Jan 2027 (13
days), in time for the Pink Test at the SCG. Update every countdown/EVENT
date and all '26 Dec'/'Boxing Day'/'Christmas Day' copy across Home, The
415, Train, Fuel, Meals and the README; Stage 1 is now Wed 23 Dec.

Firecrawl-verified safety facts folded in:
- Hawkesbury crossing (Day 12) is walkable — the Peats Ferry Bridge (old
  Pacific Hwy B83) has a footpath and permits pedestrians.
- The Hunter Expressway (Day 7) is a motorway — use the old New England
  Highway through Branxton/Greta/Lochinvar/Maitland.

Route book regenerated with the locked dates and verified facts. Bumps
cache to limn-v14.

Co-Authored-By: Claude Opus 4.8 <noreply@anthropic.com>
Claude-Session: https://claude.ai/code/session_013RVgf2bvsePuKFKTHq9q9K
</commit_message>
<xml_diff>
--- a/Love-in-Motion-Route-Book.docx
+++ b/Love-in-Motion-Route-Book.docx
@@ -47,7 +47,7 @@
           <w:color w:val="7A6A5C"/>
           <w:sz w:val="21"/>
         </w:rPr>
-        <w:t>Attunga → Sydney Cricket Ground · ~484 km · 13 days · arrive 4 Jan 2027</w:t>
+        <w:t>Attunga → Sydney Cricket Ground · Wed 23 Dec 2026 → Mon 4 Jan 2027 · ~484 km · 13 days</w:t>
       </w:r>
     </w:p>
     <w:p>
@@ -1036,7 +1036,7 @@
           <w:color w:val="7A6A5C"/>
           <w:sz w:val="18"/>
         </w:rPr>
-        <w:t>Distances are planning estimates from the draft route and must be measured. Note: a 26 Dec start plus 13 days lands on ~7 Jan; to arrive on 4 Jan the start needs to be ~23 Dec (or the day count reduced) — reconcile before locking dates.</w:t>
+        <w:t>Dates locked: start Wed 23 Dec 2026, 13 running days to a Mon 4 Jan 2027 finish at the SCG — in time for the Pink Test. Distances are planning estimates and must be measured.</w:t>
       </w:r>
     </w:p>
     <w:p>
@@ -8822,7 +8822,7 @@
           <w:color w:val="7A6A5C"/>
           <w:sz w:val="19"/>
         </w:rPr>
-        <w:t xml:space="preserve">   Via Branxton. Stay on the old New England Hwy — running is excluded on the Hunter Expressway.</w:t>
+        <w:t xml:space="preserve">   Via Branxton. The Hunter Expressway (M15) is a motorway — VERIFIED; use the old New England Hwy through Branxton/Greta/Lochinvar/Maitland.</w:t>
       </w:r>
     </w:p>
     <w:p>
@@ -15042,7 +15042,7 @@
           <w:color w:val="7A6A5C"/>
           <w:sz w:val="19"/>
         </w:rPr>
-        <w:t xml:space="preserve">   Via Brooklyn. Confirm the Hawkesbury crossing; Pie in the Sky / Cowan climbs.</w:t>
+        <w:t xml:space="preserve">   Via Brooklyn. Hawkesbury crossing VERIFIED walkable — the Peats Ferry Bridge (old Pacific Hwy B83) has a footpath and permits pedestrians. Pie in the Sky / Cowan climbs.</w:t>
       </w:r>
     </w:p>
     <w:p>
@@ -16226,7 +16226,7 @@
           <w:color w:val="7A6A5C"/>
           <w:sz w:val="19"/>
         </w:rPr>
-        <w:t xml:space="preserve">   Finish day — via the Sydney Harbour Bridge walkway to the SCG. Arrive Sun 4 Jan 2027.</w:t>
+        <w:t xml:space="preserve">   Finish day — via the Sydney Harbour Bridge walkway to the SCG. Arrive Mon 4 Jan 2027, in time for the Pink Test.</w:t>
       </w:r>
     </w:p>
     <w:p>

</xml_diff>

<commit_message>
Fold in Firecrawl route verifications
Verify the remaining audit items and mark them in the app + route book:
- Hexham crossing (Day 8): shared user paths + 2 m cycle shoulder (verified;
  low path can flood — check on the day).
- Distances confirmed vs road data: Tamworth-Wallabadah 54 km (longest day),
  Newcastle-Budgewoi ~49 km, Brooklyn-Hornsby ~27 km.
- Add a 'verified so far' summary to the audit note and route book; the only
  remaining item is shoulder-gap chainages (Days 2-4, 6) via a Street View
  pass. Bumps cache to limn-v15.

Co-Authored-By: Claude Opus 4.8 <noreply@anthropic.com>
Claude-Session: https://claude.ai/code/session_013RVgf2bvsePuKFKTHq9q9K
</commit_message>
<xml_diff>
--- a/Love-in-Motion-Route-Book.docx
+++ b/Love-in-Motion-Route-Book.docx
@@ -1036,7 +1036,7 @@
           <w:color w:val="7A6A5C"/>
           <w:sz w:val="18"/>
         </w:rPr>
-        <w:t>Dates locked: start Wed 23 Dec 2026, 13 running days to a Mon 4 Jan 2027 finish at the SCG — in time for the Pink Test. Distances are planning estimates and must be measured.</w:t>
+        <w:t>Dates locked: start Wed 23 Dec 2026, 13 running days to a Mon 4 Jan 2027 finish at the SCG — in time for the Pink Test. Verified (Firecrawl): Hawkesbury (Peats Ferry Bridge footpath) and Hexham crossings walkable; Hunter Expressway is a motorway (use the old hwy); distances Tamworth-Wallabadah 54 km, Newcastle-Budgewoi ~49 km, Brooklyn-Hornsby ~27 km all match. Still to verify: shoulder-gap chainages on Days 2-4 and 6.</w:t>
       </w:r>
     </w:p>
     <w:p>
@@ -2602,7 +2602,7 @@
           <w:color w:val="7A6A5C"/>
           <w:sz w:val="19"/>
         </w:rPr>
-        <w:t xml:space="preserve">   LONGEST &amp; least-mapped day — Street View pass + all-day support-vehicle shadowing essential.</w:t>
+        <w:t xml:space="preserve">   LONGEST day — 54 km road distance VERIFIED. Least-mapped for shoulders — Street View pass + all-day support-vehicle shadowing essential.</w:t>
       </w:r>
     </w:p>
     <w:p>
@@ -10126,7 +10126,7 @@
           <w:color w:val="7A6A5C"/>
           <w:sz w:val="19"/>
         </w:rPr>
-        <w:t xml:space="preserve">   Urban shared paths; Hexham bridge pinch point — verify.</w:t>
+        <w:t xml:space="preserve">   Urban shared paths. Hexham crossing has shared user paths + a 2 m cycle shoulder (VERIFIED) — but the low path can flood; check conditions on the day.</w:t>
       </w:r>
     </w:p>
     <w:p>

</xml_diff>

<commit_message>
Add shoulder-gap Street View checklist to the route book
Add a dedicated 'Shoulder-gap Street View checklist' section to the route
book for the last open audit item: per-stage log tables for Days 2, 3, 4
and 6 (the least-mapped highway stretches), each pre-listing the audit's
known concern zones (Nemingha, Willow Tree, Ardglen, Murrurundi Gap,
Wingen, the coal corridor) with columns for shoulder status, bridges/
hazards and contingency, plus how-to-run-the-pass instructions. Point the
app's audit note and route-book download at the checklist. Cache -> limn-v16.

Co-Authored-By: Claude Opus 4.8 <noreply@anthropic.com>
Claude-Session: https://claude.ai/code/session_013RVgf2bvsePuKFKTHq9q9K
</commit_message>
<xml_diff>
--- a/Love-in-Motion-Route-Book.docx
+++ b/Love-in-Motion-Route-Book.docx
@@ -17560,6 +17560,1828 @@
           <w:sz w:val="18"/>
         </w:rPr>
         <w:t xml:space="preserve">[VERIFY] </w:t>
+      </w:r>
+    </w:p>
+    <w:p>
+      <w:r>
+        <w:br w:type="page"/>
+      </w:r>
+    </w:p>
+    <w:p>
+      <w:pPr>
+        <w:spacing w:after="40"/>
+      </w:pPr>
+      <w:r>
+        <w:rPr>
+          <w:rFonts w:ascii="Calibri" w:hAnsi="Calibri"/>
+          <w:b/>
+          <w:color w:val="9C4526"/>
+          <w:sz w:val="18"/>
+        </w:rPr>
+        <w:t>VERIFICATION — THE LAST OPEN ITEM</w:t>
+      </w:r>
+    </w:p>
+    <w:p>
+      <w:pPr>
+        <w:spacing w:before="0" w:after="120"/>
+      </w:pPr>
+      <w:r>
+        <w:rPr>
+          <w:rFonts w:ascii="Calibri" w:hAnsi="Calibri"/>
+          <w:b/>
+          <w:color w:val="9C4526"/>
+          <w:sz w:val="30"/>
+        </w:rPr>
+        <w:t>Shoulder-gap Street View checklist</w:t>
+      </w:r>
+    </w:p>
+    <w:p>
+      <w:pPr>
+        <w:spacing w:before="0" w:after="120"/>
+      </w:pPr>
+      <w:r>
+        <w:rPr>
+          <w:rFonts w:ascii="Calibri" w:hAnsi="Calibri"/>
+          <w:b w:val="0"/>
+          <w:i w:val="0"/>
+          <w:color w:val="3B2A1D"/>
+          <w:sz w:val="21"/>
+        </w:rPr>
+        <w:t>Every crossing and distance on this route has been checked. The one thing still open is the sealed-shoulder coverage on the least-mapped highway stages. Work through Days 2, 3, 4 and 6 below with a Street View pass and log exactly where a shoulder starts and stops.</w:t>
+      </w:r>
+    </w:p>
+    <w:p>
+      <w:pPr>
+        <w:pStyle w:val="ListNumber"/>
+        <w:spacing w:after="20"/>
+      </w:pPr>
+      <w:r>
+        <w:rPr>
+          <w:color w:val="3B2A1D"/>
+          <w:sz w:val="19"/>
+        </w:rPr>
+        <w:t>Open the TfNSW Cycleway Finder and Google Street View side by side for the stage.</w:t>
+      </w:r>
+    </w:p>
+    <w:p>
+      <w:pPr>
+        <w:pStyle w:val="ListNumber"/>
+        <w:spacing w:after="20"/>
+      </w:pPr>
+      <w:r>
+        <w:rPr>
+          <w:color w:val="3B2A1D"/>
+          <w:sz w:val="19"/>
+        </w:rPr>
+        <w:t>'Drive' the route in Street View from the start town to the finish town.</w:t>
+      </w:r>
+    </w:p>
+    <w:p>
+      <w:pPr>
+        <w:pStyle w:val="ListNumber"/>
+        <w:spacing w:after="20"/>
+      </w:pPr>
+      <w:r>
+        <w:rPr>
+          <w:color w:val="3B2A1D"/>
+          <w:sz w:val="19"/>
+        </w:rPr>
+        <w:t>Each time the shoulder changes (sealed -&gt; narrow -&gt; none, or a bridge/guardrail pinch), log a row: where it changes (nearest km post, cross-street or landmark), what it becomes, and the action.</w:t>
+      </w:r>
+    </w:p>
+    <w:p>
+      <w:pPr>
+        <w:pStyle w:val="ListNumber"/>
+        <w:spacing w:after="20"/>
+      </w:pPr>
+      <w:r>
+        <w:rPr>
+          <w:color w:val="3B2A1D"/>
+          <w:sz w:val="19"/>
+        </w:rPr>
+        <w:t>Flag every bridge, causeway, blind crest and single-lane pinch with no shoulder — these are the danger points.</w:t>
+      </w:r>
+    </w:p>
+    <w:p>
+      <w:pPr>
+        <w:pStyle w:val="ListNumber"/>
+        <w:spacing w:after="20"/>
+      </w:pPr>
+      <w:r>
+        <w:rPr>
+          <w:color w:val="3B2A1D"/>
+          <w:sz w:val="19"/>
+        </w:rPr>
+        <w:t>Where there is no safe shoulder for a stretch, record the contingency: a parallel back-road, a footpath, or a crew-escort / rolling-block plan.</w:t>
+      </w:r>
+    </w:p>
+    <w:p>
+      <w:pPr>
+        <w:spacing w:before="200" w:after="120"/>
+      </w:pPr>
+      <w:r>
+        <w:rPr>
+          <w:rFonts w:ascii="Calibri" w:hAnsi="Calibri"/>
+          <w:b/>
+          <w:color w:val="26190F"/>
+          <w:sz w:val="24"/>
+        </w:rPr>
+        <w:t>Day 2 · Tamworth -&gt; Wallabadah</w:t>
+      </w:r>
+    </w:p>
+    <w:p>
+      <w:pPr>
+        <w:spacing w:before="0" w:after="80"/>
+      </w:pPr>
+      <w:r>
+        <w:rPr>
+          <w:rFonts w:ascii="Calibri" w:hAnsi="Calibri"/>
+          <w:b w:val="0"/>
+          <w:i/>
+          <w:color w:val="7A6A5C"/>
+          <w:sz w:val="19"/>
+        </w:rPr>
+        <w:t>Mostly unclassified with intermittent shoulder — the biggest verify zone on the route.</w:t>
+      </w:r>
+    </w:p>
+    <w:tbl>
+      <w:tblPr>
+        <w:tblStyle w:val="LightGrid-Accent1"/>
+        <w:tblW w:type="auto" w:w="0"/>
+        <w:tblLook w:firstColumn="1" w:firstRow="1" w:lastColumn="0" w:lastRow="0" w:noHBand="0" w:noVBand="1" w:val="04A0"/>
+      </w:tblPr>
+      <w:tblGrid>
+        <w:gridCol w:w="1994"/>
+        <w:gridCol w:w="1994"/>
+        <w:gridCol w:w="1994"/>
+        <w:gridCol w:w="1994"/>
+        <w:gridCol w:w="1994"/>
+      </w:tblGrid>
+      <w:tr>
+        <w:tc>
+          <w:tcPr>
+            <w:tcW w:type="dxa" w:w="2948"/>
+            <w:shd w:val="clear" w:fill="F1E8DD"/>
+          </w:tcPr>
+          <w:p>
+            <w:r/>
+            <w:r>
+              <w:rPr>
+                <w:b/>
+                <w:color w:val="26190F"/>
+                <w:sz w:val="17"/>
+              </w:rPr>
+              <w:t>Segment (from -&gt; to / landmark)</w:t>
+            </w:r>
+          </w:p>
+        </w:tc>
+        <w:tc>
+          <w:tcPr>
+            <w:tcW w:type="dxa" w:w="737"/>
+            <w:shd w:val="clear" w:fill="F1E8DD"/>
+          </w:tcPr>
+          <w:p>
+            <w:r/>
+            <w:r>
+              <w:rPr>
+                <w:b/>
+                <w:color w:val="26190F"/>
+                <w:sz w:val="17"/>
+              </w:rPr>
+              <w:t>~km</w:t>
+            </w:r>
+          </w:p>
+        </w:tc>
+        <w:tc>
+          <w:tcPr>
+            <w:tcW w:type="dxa" w:w="2154"/>
+            <w:shd w:val="clear" w:fill="F1E8DD"/>
+          </w:tcPr>
+          <w:p>
+            <w:r/>
+            <w:r>
+              <w:rPr>
+                <w:b/>
+                <w:color w:val="26190F"/>
+                <w:sz w:val="17"/>
+              </w:rPr>
+              <w:t>Shoulder: sealed / narrow / none</w:t>
+            </w:r>
+          </w:p>
+        </w:tc>
+        <w:tc>
+          <w:tcPr>
+            <w:tcW w:type="dxa" w:w="1474"/>
+            <w:shd w:val="clear" w:fill="F1E8DD"/>
+          </w:tcPr>
+          <w:p>
+            <w:r/>
+            <w:r>
+              <w:rPr>
+                <w:b/>
+                <w:color w:val="26190F"/>
+                <w:sz w:val="17"/>
+              </w:rPr>
+              <w:t>Bridge / hazard</w:t>
+            </w:r>
+          </w:p>
+        </w:tc>
+        <w:tc>
+          <w:tcPr>
+            <w:tcW w:type="dxa" w:w="2324"/>
+            <w:shd w:val="clear" w:fill="F1E8DD"/>
+          </w:tcPr>
+          <w:p>
+            <w:r/>
+            <w:r>
+              <w:rPr>
+                <w:b/>
+                <w:color w:val="26190F"/>
+                <w:sz w:val="17"/>
+              </w:rPr>
+              <w:t>Action / contingency</w:t>
+            </w:r>
+          </w:p>
+        </w:tc>
+      </w:tr>
+      <w:tr>
+        <w:tc>
+          <w:tcPr>
+            <w:tcW w:type="dxa" w:w="2948"/>
+          </w:tcPr>
+          <w:p>
+            <w:r/>
+            <w:r>
+              <w:rPr>
+                <w:color w:val="3B2A1D"/>
+                <w:sz w:val="18"/>
+              </w:rPr>
+              <w:t>Leaving Tamworth (urban edge)</w:t>
+            </w:r>
+          </w:p>
+        </w:tc>
+        <w:tc>
+          <w:tcPr>
+            <w:tcW w:type="dxa" w:w="737"/>
+          </w:tcPr>
+          <w:p>
+            <w:r/>
+          </w:p>
+        </w:tc>
+        <w:tc>
+          <w:tcPr>
+            <w:tcW w:type="dxa" w:w="2154"/>
+          </w:tcPr>
+          <w:p>
+            <w:r/>
+          </w:p>
+        </w:tc>
+        <w:tc>
+          <w:tcPr>
+            <w:tcW w:type="dxa" w:w="1474"/>
+          </w:tcPr>
+          <w:p>
+            <w:r/>
+          </w:p>
+        </w:tc>
+        <w:tc>
+          <w:tcPr>
+            <w:tcW w:type="dxa" w:w="2324"/>
+          </w:tcPr>
+          <w:p>
+            <w:r/>
+          </w:p>
+        </w:tc>
+      </w:tr>
+      <w:tr>
+        <w:tc>
+          <w:tcPr>
+            <w:tcW w:type="dxa" w:w="2948"/>
+          </w:tcPr>
+          <w:p>
+            <w:r/>
+            <w:r>
+              <w:rPr>
+                <w:color w:val="3B2A1D"/>
+                <w:sz w:val="18"/>
+              </w:rPr>
+              <w:t>Nemingha / Oxley Hwy junction area</w:t>
+            </w:r>
+          </w:p>
+        </w:tc>
+        <w:tc>
+          <w:tcPr>
+            <w:tcW w:type="dxa" w:w="737"/>
+          </w:tcPr>
+          <w:p>
+            <w:r/>
+          </w:p>
+        </w:tc>
+        <w:tc>
+          <w:tcPr>
+            <w:tcW w:type="dxa" w:w="2154"/>
+          </w:tcPr>
+          <w:p>
+            <w:r/>
+          </w:p>
+        </w:tc>
+        <w:tc>
+          <w:tcPr>
+            <w:tcW w:type="dxa" w:w="1474"/>
+          </w:tcPr>
+          <w:p>
+            <w:r/>
+          </w:p>
+        </w:tc>
+        <w:tc>
+          <w:tcPr>
+            <w:tcW w:type="dxa" w:w="2324"/>
+          </w:tcPr>
+          <w:p>
+            <w:r/>
+          </w:p>
+        </w:tc>
+      </w:tr>
+      <w:tr>
+        <w:tc>
+          <w:tcPr>
+            <w:tcW w:type="dxa" w:w="2948"/>
+          </w:tcPr>
+          <w:p>
+            <w:r/>
+            <w:r>
+              <w:rPr>
+                <w:color w:val="3B2A1D"/>
+                <w:sz w:val="18"/>
+              </w:rPr>
+              <w:t>Open highway, mid-leg</w:t>
+            </w:r>
+          </w:p>
+        </w:tc>
+        <w:tc>
+          <w:tcPr>
+            <w:tcW w:type="dxa" w:w="737"/>
+          </w:tcPr>
+          <w:p>
+            <w:r/>
+          </w:p>
+        </w:tc>
+        <w:tc>
+          <w:tcPr>
+            <w:tcW w:type="dxa" w:w="2154"/>
+          </w:tcPr>
+          <w:p>
+            <w:r/>
+          </w:p>
+        </w:tc>
+        <w:tc>
+          <w:tcPr>
+            <w:tcW w:type="dxa" w:w="1474"/>
+          </w:tcPr>
+          <w:p>
+            <w:r/>
+          </w:p>
+        </w:tc>
+        <w:tc>
+          <w:tcPr>
+            <w:tcW w:type="dxa" w:w="2324"/>
+          </w:tcPr>
+          <w:p>
+            <w:r/>
+          </w:p>
+        </w:tc>
+      </w:tr>
+      <w:tr>
+        <w:tc>
+          <w:tcPr>
+            <w:tcW w:type="dxa" w:w="2948"/>
+          </w:tcPr>
+          <w:p>
+            <w:r/>
+            <w:r>
+              <w:rPr>
+                <w:color w:val="3B2A1D"/>
+                <w:sz w:val="18"/>
+              </w:rPr>
+              <w:t>Approach into Wallabadah</w:t>
+            </w:r>
+          </w:p>
+        </w:tc>
+        <w:tc>
+          <w:tcPr>
+            <w:tcW w:type="dxa" w:w="737"/>
+          </w:tcPr>
+          <w:p>
+            <w:r/>
+          </w:p>
+        </w:tc>
+        <w:tc>
+          <w:tcPr>
+            <w:tcW w:type="dxa" w:w="2154"/>
+          </w:tcPr>
+          <w:p>
+            <w:r/>
+          </w:p>
+        </w:tc>
+        <w:tc>
+          <w:tcPr>
+            <w:tcW w:type="dxa" w:w="1474"/>
+          </w:tcPr>
+          <w:p>
+            <w:r/>
+          </w:p>
+        </w:tc>
+        <w:tc>
+          <w:tcPr>
+            <w:tcW w:type="dxa" w:w="2324"/>
+          </w:tcPr>
+          <w:p>
+            <w:r/>
+          </w:p>
+        </w:tc>
+      </w:tr>
+      <w:tr>
+        <w:tc>
+          <w:tcPr>
+            <w:tcW w:type="dxa" w:w="2948"/>
+          </w:tcPr>
+          <w:p>
+            <w:r/>
+          </w:p>
+        </w:tc>
+        <w:tc>
+          <w:tcPr>
+            <w:tcW w:type="dxa" w:w="737"/>
+          </w:tcPr>
+          <w:p>
+            <w:r/>
+          </w:p>
+        </w:tc>
+        <w:tc>
+          <w:tcPr>
+            <w:tcW w:type="dxa" w:w="2154"/>
+          </w:tcPr>
+          <w:p>
+            <w:r/>
+          </w:p>
+        </w:tc>
+        <w:tc>
+          <w:tcPr>
+            <w:tcW w:type="dxa" w:w="1474"/>
+          </w:tcPr>
+          <w:p>
+            <w:r/>
+          </w:p>
+        </w:tc>
+        <w:tc>
+          <w:tcPr>
+            <w:tcW w:type="dxa" w:w="2324"/>
+          </w:tcPr>
+          <w:p>
+            <w:r/>
+          </w:p>
+        </w:tc>
+      </w:tr>
+      <w:tr>
+        <w:tc>
+          <w:tcPr>
+            <w:tcW w:type="dxa" w:w="2948"/>
+          </w:tcPr>
+          <w:p>
+            <w:r/>
+          </w:p>
+        </w:tc>
+        <w:tc>
+          <w:tcPr>
+            <w:tcW w:type="dxa" w:w="737"/>
+          </w:tcPr>
+          <w:p>
+            <w:r/>
+          </w:p>
+        </w:tc>
+        <w:tc>
+          <w:tcPr>
+            <w:tcW w:type="dxa" w:w="2154"/>
+          </w:tcPr>
+          <w:p>
+            <w:r/>
+          </w:p>
+        </w:tc>
+        <w:tc>
+          <w:tcPr>
+            <w:tcW w:type="dxa" w:w="1474"/>
+          </w:tcPr>
+          <w:p>
+            <w:r/>
+          </w:p>
+        </w:tc>
+        <w:tc>
+          <w:tcPr>
+            <w:tcW w:type="dxa" w:w="2324"/>
+          </w:tcPr>
+          <w:p>
+            <w:r/>
+          </w:p>
+        </w:tc>
+      </w:tr>
+    </w:tbl>
+    <w:p>
+      <w:pPr>
+        <w:spacing w:before="200" w:after="120"/>
+      </w:pPr>
+      <w:r>
+        <w:rPr>
+          <w:rFonts w:ascii="Calibri" w:hAnsi="Calibri"/>
+          <w:b/>
+          <w:color w:val="26190F"/>
+          <w:sz w:val="24"/>
+        </w:rPr>
+        <w:t>Day 3 · Wallabadah -&gt; Murrurundi</w:t>
+      </w:r>
+    </w:p>
+    <w:p>
+      <w:pPr>
+        <w:spacing w:before="0" w:after="80"/>
+      </w:pPr>
+      <w:r>
+        <w:rPr>
+          <w:rFonts w:ascii="Calibri" w:hAnsi="Calibri"/>
+          <w:b w:val="0"/>
+          <w:i/>
+          <w:color w:val="7A6A5C"/>
+          <w:sz w:val="19"/>
+        </w:rPr>
+        <w:t>Short shoulder fragments; gaps near Willow Tree and Ardglen; unclassified around the climb to the Gap.</w:t>
+      </w:r>
+    </w:p>
+    <w:tbl>
+      <w:tblPr>
+        <w:tblStyle w:val="LightGrid-Accent1"/>
+        <w:tblW w:type="auto" w:w="0"/>
+        <w:tblLook w:firstColumn="1" w:firstRow="1" w:lastColumn="0" w:lastRow="0" w:noHBand="0" w:noVBand="1" w:val="04A0"/>
+      </w:tblPr>
+      <w:tblGrid>
+        <w:gridCol w:w="1994"/>
+        <w:gridCol w:w="1994"/>
+        <w:gridCol w:w="1994"/>
+        <w:gridCol w:w="1994"/>
+        <w:gridCol w:w="1994"/>
+      </w:tblGrid>
+      <w:tr>
+        <w:tc>
+          <w:tcPr>
+            <w:tcW w:type="dxa" w:w="2948"/>
+            <w:shd w:val="clear" w:fill="F1E8DD"/>
+          </w:tcPr>
+          <w:p>
+            <w:r/>
+            <w:r>
+              <w:rPr>
+                <w:b/>
+                <w:color w:val="26190F"/>
+                <w:sz w:val="17"/>
+              </w:rPr>
+              <w:t>Segment (from -&gt; to / landmark)</w:t>
+            </w:r>
+          </w:p>
+        </w:tc>
+        <w:tc>
+          <w:tcPr>
+            <w:tcW w:type="dxa" w:w="737"/>
+            <w:shd w:val="clear" w:fill="F1E8DD"/>
+          </w:tcPr>
+          <w:p>
+            <w:r/>
+            <w:r>
+              <w:rPr>
+                <w:b/>
+                <w:color w:val="26190F"/>
+                <w:sz w:val="17"/>
+              </w:rPr>
+              <w:t>~km</w:t>
+            </w:r>
+          </w:p>
+        </w:tc>
+        <w:tc>
+          <w:tcPr>
+            <w:tcW w:type="dxa" w:w="2154"/>
+            <w:shd w:val="clear" w:fill="F1E8DD"/>
+          </w:tcPr>
+          <w:p>
+            <w:r/>
+            <w:r>
+              <w:rPr>
+                <w:b/>
+                <w:color w:val="26190F"/>
+                <w:sz w:val="17"/>
+              </w:rPr>
+              <w:t>Shoulder: sealed / narrow / none</w:t>
+            </w:r>
+          </w:p>
+        </w:tc>
+        <w:tc>
+          <w:tcPr>
+            <w:tcW w:type="dxa" w:w="1474"/>
+            <w:shd w:val="clear" w:fill="F1E8DD"/>
+          </w:tcPr>
+          <w:p>
+            <w:r/>
+            <w:r>
+              <w:rPr>
+                <w:b/>
+                <w:color w:val="26190F"/>
+                <w:sz w:val="17"/>
+              </w:rPr>
+              <w:t>Bridge / hazard</w:t>
+            </w:r>
+          </w:p>
+        </w:tc>
+        <w:tc>
+          <w:tcPr>
+            <w:tcW w:type="dxa" w:w="2324"/>
+            <w:shd w:val="clear" w:fill="F1E8DD"/>
+          </w:tcPr>
+          <w:p>
+            <w:r/>
+            <w:r>
+              <w:rPr>
+                <w:b/>
+                <w:color w:val="26190F"/>
+                <w:sz w:val="17"/>
+              </w:rPr>
+              <w:t>Action / contingency</w:t>
+            </w:r>
+          </w:p>
+        </w:tc>
+      </w:tr>
+      <w:tr>
+        <w:tc>
+          <w:tcPr>
+            <w:tcW w:type="dxa" w:w="2948"/>
+          </w:tcPr>
+          <w:p>
+            <w:r/>
+            <w:r>
+              <w:rPr>
+                <w:color w:val="3B2A1D"/>
+                <w:sz w:val="18"/>
+              </w:rPr>
+              <w:t>Wallabadah out to Willow Tree</w:t>
+            </w:r>
+          </w:p>
+        </w:tc>
+        <w:tc>
+          <w:tcPr>
+            <w:tcW w:type="dxa" w:w="737"/>
+          </w:tcPr>
+          <w:p>
+            <w:r/>
+          </w:p>
+        </w:tc>
+        <w:tc>
+          <w:tcPr>
+            <w:tcW w:type="dxa" w:w="2154"/>
+          </w:tcPr>
+          <w:p>
+            <w:r/>
+          </w:p>
+        </w:tc>
+        <w:tc>
+          <w:tcPr>
+            <w:tcW w:type="dxa" w:w="1474"/>
+          </w:tcPr>
+          <w:p>
+            <w:r/>
+          </w:p>
+        </w:tc>
+        <w:tc>
+          <w:tcPr>
+            <w:tcW w:type="dxa" w:w="2324"/>
+          </w:tcPr>
+          <w:p>
+            <w:r/>
+          </w:p>
+        </w:tc>
+      </w:tr>
+      <w:tr>
+        <w:tc>
+          <w:tcPr>
+            <w:tcW w:type="dxa" w:w="2948"/>
+          </w:tcPr>
+          <w:p>
+            <w:r/>
+            <w:r>
+              <w:rPr>
+                <w:color w:val="3B2A1D"/>
+                <w:sz w:val="18"/>
+              </w:rPr>
+              <w:t>Willow Tree village</w:t>
+            </w:r>
+          </w:p>
+        </w:tc>
+        <w:tc>
+          <w:tcPr>
+            <w:tcW w:type="dxa" w:w="737"/>
+          </w:tcPr>
+          <w:p>
+            <w:r/>
+          </w:p>
+        </w:tc>
+        <w:tc>
+          <w:tcPr>
+            <w:tcW w:type="dxa" w:w="2154"/>
+          </w:tcPr>
+          <w:p>
+            <w:r/>
+          </w:p>
+        </w:tc>
+        <w:tc>
+          <w:tcPr>
+            <w:tcW w:type="dxa" w:w="1474"/>
+          </w:tcPr>
+          <w:p>
+            <w:r/>
+          </w:p>
+        </w:tc>
+        <w:tc>
+          <w:tcPr>
+            <w:tcW w:type="dxa" w:w="2324"/>
+          </w:tcPr>
+          <w:p>
+            <w:r/>
+          </w:p>
+        </w:tc>
+      </w:tr>
+      <w:tr>
+        <w:tc>
+          <w:tcPr>
+            <w:tcW w:type="dxa" w:w="2948"/>
+          </w:tcPr>
+          <w:p>
+            <w:r/>
+            <w:r>
+              <w:rPr>
+                <w:color w:val="3B2A1D"/>
+                <w:sz w:val="18"/>
+              </w:rPr>
+              <w:t>Ardglen</w:t>
+            </w:r>
+          </w:p>
+        </w:tc>
+        <w:tc>
+          <w:tcPr>
+            <w:tcW w:type="dxa" w:w="737"/>
+          </w:tcPr>
+          <w:p>
+            <w:r/>
+          </w:p>
+        </w:tc>
+        <w:tc>
+          <w:tcPr>
+            <w:tcW w:type="dxa" w:w="2154"/>
+          </w:tcPr>
+          <w:p>
+            <w:r/>
+          </w:p>
+        </w:tc>
+        <w:tc>
+          <w:tcPr>
+            <w:tcW w:type="dxa" w:w="1474"/>
+          </w:tcPr>
+          <w:p>
+            <w:r/>
+          </w:p>
+        </w:tc>
+        <w:tc>
+          <w:tcPr>
+            <w:tcW w:type="dxa" w:w="2324"/>
+          </w:tcPr>
+          <w:p>
+            <w:r/>
+          </w:p>
+        </w:tc>
+      </w:tr>
+      <w:tr>
+        <w:tc>
+          <w:tcPr>
+            <w:tcW w:type="dxa" w:w="2948"/>
+          </w:tcPr>
+          <w:p>
+            <w:r/>
+            <w:r>
+              <w:rPr>
+                <w:color w:val="3B2A1D"/>
+                <w:sz w:val="18"/>
+              </w:rPr>
+              <w:t>Climb to the Gap / summit</w:t>
+            </w:r>
+          </w:p>
+        </w:tc>
+        <w:tc>
+          <w:tcPr>
+            <w:tcW w:type="dxa" w:w="737"/>
+          </w:tcPr>
+          <w:p>
+            <w:r/>
+          </w:p>
+        </w:tc>
+        <w:tc>
+          <w:tcPr>
+            <w:tcW w:type="dxa" w:w="2154"/>
+          </w:tcPr>
+          <w:p>
+            <w:r/>
+          </w:p>
+        </w:tc>
+        <w:tc>
+          <w:tcPr>
+            <w:tcW w:type="dxa" w:w="1474"/>
+          </w:tcPr>
+          <w:p>
+            <w:r/>
+          </w:p>
+        </w:tc>
+        <w:tc>
+          <w:tcPr>
+            <w:tcW w:type="dxa" w:w="2324"/>
+          </w:tcPr>
+          <w:p>
+            <w:r/>
+          </w:p>
+        </w:tc>
+      </w:tr>
+      <w:tr>
+        <w:tc>
+          <w:tcPr>
+            <w:tcW w:type="dxa" w:w="2948"/>
+          </w:tcPr>
+          <w:p>
+            <w:r/>
+            <w:r>
+              <w:rPr>
+                <w:color w:val="3B2A1D"/>
+                <w:sz w:val="18"/>
+              </w:rPr>
+              <w:t>Descent into Murrurundi</w:t>
+            </w:r>
+          </w:p>
+        </w:tc>
+        <w:tc>
+          <w:tcPr>
+            <w:tcW w:type="dxa" w:w="737"/>
+          </w:tcPr>
+          <w:p>
+            <w:r/>
+          </w:p>
+        </w:tc>
+        <w:tc>
+          <w:tcPr>
+            <w:tcW w:type="dxa" w:w="2154"/>
+          </w:tcPr>
+          <w:p>
+            <w:r/>
+          </w:p>
+        </w:tc>
+        <w:tc>
+          <w:tcPr>
+            <w:tcW w:type="dxa" w:w="1474"/>
+          </w:tcPr>
+          <w:p>
+            <w:r/>
+          </w:p>
+        </w:tc>
+        <w:tc>
+          <w:tcPr>
+            <w:tcW w:type="dxa" w:w="2324"/>
+          </w:tcPr>
+          <w:p>
+            <w:r/>
+          </w:p>
+        </w:tc>
+      </w:tr>
+      <w:tr>
+        <w:tc>
+          <w:tcPr>
+            <w:tcW w:type="dxa" w:w="2948"/>
+          </w:tcPr>
+          <w:p>
+            <w:r/>
+          </w:p>
+        </w:tc>
+        <w:tc>
+          <w:tcPr>
+            <w:tcW w:type="dxa" w:w="737"/>
+          </w:tcPr>
+          <w:p>
+            <w:r/>
+          </w:p>
+        </w:tc>
+        <w:tc>
+          <w:tcPr>
+            <w:tcW w:type="dxa" w:w="2154"/>
+          </w:tcPr>
+          <w:p>
+            <w:r/>
+          </w:p>
+        </w:tc>
+        <w:tc>
+          <w:tcPr>
+            <w:tcW w:type="dxa" w:w="1474"/>
+          </w:tcPr>
+          <w:p>
+            <w:r/>
+          </w:p>
+        </w:tc>
+        <w:tc>
+          <w:tcPr>
+            <w:tcW w:type="dxa" w:w="2324"/>
+          </w:tcPr>
+          <w:p>
+            <w:r/>
+          </w:p>
+        </w:tc>
+      </w:tr>
+      <w:tr>
+        <w:tc>
+          <w:tcPr>
+            <w:tcW w:type="dxa" w:w="2948"/>
+          </w:tcPr>
+          <w:p>
+            <w:r/>
+          </w:p>
+        </w:tc>
+        <w:tc>
+          <w:tcPr>
+            <w:tcW w:type="dxa" w:w="737"/>
+          </w:tcPr>
+          <w:p>
+            <w:r/>
+          </w:p>
+        </w:tc>
+        <w:tc>
+          <w:tcPr>
+            <w:tcW w:type="dxa" w:w="2154"/>
+          </w:tcPr>
+          <w:p>
+            <w:r/>
+          </w:p>
+        </w:tc>
+        <w:tc>
+          <w:tcPr>
+            <w:tcW w:type="dxa" w:w="1474"/>
+          </w:tcPr>
+          <w:p>
+            <w:r/>
+          </w:p>
+        </w:tc>
+        <w:tc>
+          <w:tcPr>
+            <w:tcW w:type="dxa" w:w="2324"/>
+          </w:tcPr>
+          <w:p>
+            <w:r/>
+          </w:p>
+        </w:tc>
+      </w:tr>
+    </w:tbl>
+    <w:p>
+      <w:pPr>
+        <w:spacing w:before="200" w:after="120"/>
+      </w:pPr>
+      <w:r>
+        <w:rPr>
+          <w:rFonts w:ascii="Calibri" w:hAnsi="Calibri"/>
+          <w:b/>
+          <w:color w:val="26190F"/>
+          <w:sz w:val="24"/>
+        </w:rPr>
+        <w:t>Day 4 · Murrurundi -&gt; Scone</w:t>
+      </w:r>
+    </w:p>
+    <w:p>
+      <w:pPr>
+        <w:spacing w:before="0" w:after="80"/>
+      </w:pPr>
+      <w:r>
+        <w:rPr>
+          <w:rFonts w:ascii="Calibri" w:hAnsi="Calibri"/>
+          <w:b w:val="0"/>
+          <w:i/>
+          <w:color w:val="7A6A5C"/>
+          <w:sz w:val="19"/>
+        </w:rPr>
+        <w:t>Shoulder with gaps through the pass; the Murrurundi Gap climb is first up.</w:t>
+      </w:r>
+    </w:p>
+    <w:tbl>
+      <w:tblPr>
+        <w:tblStyle w:val="LightGrid-Accent1"/>
+        <w:tblW w:type="auto" w:w="0"/>
+        <w:tblLook w:firstColumn="1" w:firstRow="1" w:lastColumn="0" w:lastRow="0" w:noHBand="0" w:noVBand="1" w:val="04A0"/>
+      </w:tblPr>
+      <w:tblGrid>
+        <w:gridCol w:w="1994"/>
+        <w:gridCol w:w="1994"/>
+        <w:gridCol w:w="1994"/>
+        <w:gridCol w:w="1994"/>
+        <w:gridCol w:w="1994"/>
+      </w:tblGrid>
+      <w:tr>
+        <w:tc>
+          <w:tcPr>
+            <w:tcW w:type="dxa" w:w="2948"/>
+            <w:shd w:val="clear" w:fill="F1E8DD"/>
+          </w:tcPr>
+          <w:p>
+            <w:r/>
+            <w:r>
+              <w:rPr>
+                <w:b/>
+                <w:color w:val="26190F"/>
+                <w:sz w:val="17"/>
+              </w:rPr>
+              <w:t>Segment (from -&gt; to / landmark)</w:t>
+            </w:r>
+          </w:p>
+        </w:tc>
+        <w:tc>
+          <w:tcPr>
+            <w:tcW w:type="dxa" w:w="737"/>
+            <w:shd w:val="clear" w:fill="F1E8DD"/>
+          </w:tcPr>
+          <w:p>
+            <w:r/>
+            <w:r>
+              <w:rPr>
+                <w:b/>
+                <w:color w:val="26190F"/>
+                <w:sz w:val="17"/>
+              </w:rPr>
+              <w:t>~km</w:t>
+            </w:r>
+          </w:p>
+        </w:tc>
+        <w:tc>
+          <w:tcPr>
+            <w:tcW w:type="dxa" w:w="2154"/>
+            <w:shd w:val="clear" w:fill="F1E8DD"/>
+          </w:tcPr>
+          <w:p>
+            <w:r/>
+            <w:r>
+              <w:rPr>
+                <w:b/>
+                <w:color w:val="26190F"/>
+                <w:sz w:val="17"/>
+              </w:rPr>
+              <w:t>Shoulder: sealed / narrow / none</w:t>
+            </w:r>
+          </w:p>
+        </w:tc>
+        <w:tc>
+          <w:tcPr>
+            <w:tcW w:type="dxa" w:w="1474"/>
+            <w:shd w:val="clear" w:fill="F1E8DD"/>
+          </w:tcPr>
+          <w:p>
+            <w:r/>
+            <w:r>
+              <w:rPr>
+                <w:b/>
+                <w:color w:val="26190F"/>
+                <w:sz w:val="17"/>
+              </w:rPr>
+              <w:t>Bridge / hazard</w:t>
+            </w:r>
+          </w:p>
+        </w:tc>
+        <w:tc>
+          <w:tcPr>
+            <w:tcW w:type="dxa" w:w="2324"/>
+            <w:shd w:val="clear" w:fill="F1E8DD"/>
+          </w:tcPr>
+          <w:p>
+            <w:r/>
+            <w:r>
+              <w:rPr>
+                <w:b/>
+                <w:color w:val="26190F"/>
+                <w:sz w:val="17"/>
+              </w:rPr>
+              <w:t>Action / contingency</w:t>
+            </w:r>
+          </w:p>
+        </w:tc>
+      </w:tr>
+      <w:tr>
+        <w:tc>
+          <w:tcPr>
+            <w:tcW w:type="dxa" w:w="2948"/>
+          </w:tcPr>
+          <w:p>
+            <w:r/>
+            <w:r>
+              <w:rPr>
+                <w:color w:val="3B2A1D"/>
+                <w:sz w:val="18"/>
+              </w:rPr>
+              <w:t>Murrurundi Gap climb</w:t>
+            </w:r>
+          </w:p>
+        </w:tc>
+        <w:tc>
+          <w:tcPr>
+            <w:tcW w:type="dxa" w:w="737"/>
+          </w:tcPr>
+          <w:p>
+            <w:r/>
+          </w:p>
+        </w:tc>
+        <w:tc>
+          <w:tcPr>
+            <w:tcW w:type="dxa" w:w="2154"/>
+          </w:tcPr>
+          <w:p>
+            <w:r/>
+          </w:p>
+        </w:tc>
+        <w:tc>
+          <w:tcPr>
+            <w:tcW w:type="dxa" w:w="1474"/>
+          </w:tcPr>
+          <w:p>
+            <w:r/>
+          </w:p>
+        </w:tc>
+        <w:tc>
+          <w:tcPr>
+            <w:tcW w:type="dxa" w:w="2324"/>
+          </w:tcPr>
+          <w:p>
+            <w:r/>
+          </w:p>
+        </w:tc>
+      </w:tr>
+      <w:tr>
+        <w:tc>
+          <w:tcPr>
+            <w:tcW w:type="dxa" w:w="2948"/>
+          </w:tcPr>
+          <w:p>
+            <w:r/>
+            <w:r>
+              <w:rPr>
+                <w:color w:val="3B2A1D"/>
+                <w:sz w:val="18"/>
+              </w:rPr>
+              <w:t>Through the pass / summit</w:t>
+            </w:r>
+          </w:p>
+        </w:tc>
+        <w:tc>
+          <w:tcPr>
+            <w:tcW w:type="dxa" w:w="737"/>
+          </w:tcPr>
+          <w:p>
+            <w:r/>
+          </w:p>
+        </w:tc>
+        <w:tc>
+          <w:tcPr>
+            <w:tcW w:type="dxa" w:w="2154"/>
+          </w:tcPr>
+          <w:p>
+            <w:r/>
+          </w:p>
+        </w:tc>
+        <w:tc>
+          <w:tcPr>
+            <w:tcW w:type="dxa" w:w="1474"/>
+          </w:tcPr>
+          <w:p>
+            <w:r/>
+          </w:p>
+        </w:tc>
+        <w:tc>
+          <w:tcPr>
+            <w:tcW w:type="dxa" w:w="2324"/>
+          </w:tcPr>
+          <w:p>
+            <w:r/>
+          </w:p>
+        </w:tc>
+      </w:tr>
+      <w:tr>
+        <w:tc>
+          <w:tcPr>
+            <w:tcW w:type="dxa" w:w="2948"/>
+          </w:tcPr>
+          <w:p>
+            <w:r/>
+            <w:r>
+              <w:rPr>
+                <w:color w:val="3B2A1D"/>
+                <w:sz w:val="18"/>
+              </w:rPr>
+              <w:t>Wingen</w:t>
+            </w:r>
+          </w:p>
+        </w:tc>
+        <w:tc>
+          <w:tcPr>
+            <w:tcW w:type="dxa" w:w="737"/>
+          </w:tcPr>
+          <w:p>
+            <w:r/>
+          </w:p>
+        </w:tc>
+        <w:tc>
+          <w:tcPr>
+            <w:tcW w:type="dxa" w:w="2154"/>
+          </w:tcPr>
+          <w:p>
+            <w:r/>
+          </w:p>
+        </w:tc>
+        <w:tc>
+          <w:tcPr>
+            <w:tcW w:type="dxa" w:w="1474"/>
+          </w:tcPr>
+          <w:p>
+            <w:r/>
+          </w:p>
+        </w:tc>
+        <w:tc>
+          <w:tcPr>
+            <w:tcW w:type="dxa" w:w="2324"/>
+          </w:tcPr>
+          <w:p>
+            <w:r/>
+          </w:p>
+        </w:tc>
+      </w:tr>
+      <w:tr>
+        <w:tc>
+          <w:tcPr>
+            <w:tcW w:type="dxa" w:w="2948"/>
+          </w:tcPr>
+          <w:p>
+            <w:r/>
+            <w:r>
+              <w:rPr>
+                <w:color w:val="3B2A1D"/>
+                <w:sz w:val="18"/>
+              </w:rPr>
+              <w:t>Approach into Scone</w:t>
+            </w:r>
+          </w:p>
+        </w:tc>
+        <w:tc>
+          <w:tcPr>
+            <w:tcW w:type="dxa" w:w="737"/>
+          </w:tcPr>
+          <w:p>
+            <w:r/>
+          </w:p>
+        </w:tc>
+        <w:tc>
+          <w:tcPr>
+            <w:tcW w:type="dxa" w:w="2154"/>
+          </w:tcPr>
+          <w:p>
+            <w:r/>
+          </w:p>
+        </w:tc>
+        <w:tc>
+          <w:tcPr>
+            <w:tcW w:type="dxa" w:w="1474"/>
+          </w:tcPr>
+          <w:p>
+            <w:r/>
+          </w:p>
+        </w:tc>
+        <w:tc>
+          <w:tcPr>
+            <w:tcW w:type="dxa" w:w="2324"/>
+          </w:tcPr>
+          <w:p>
+            <w:r/>
+          </w:p>
+        </w:tc>
+      </w:tr>
+      <w:tr>
+        <w:tc>
+          <w:tcPr>
+            <w:tcW w:type="dxa" w:w="2948"/>
+          </w:tcPr>
+          <w:p>
+            <w:r/>
+          </w:p>
+        </w:tc>
+        <w:tc>
+          <w:tcPr>
+            <w:tcW w:type="dxa" w:w="737"/>
+          </w:tcPr>
+          <w:p>
+            <w:r/>
+          </w:p>
+        </w:tc>
+        <w:tc>
+          <w:tcPr>
+            <w:tcW w:type="dxa" w:w="2154"/>
+          </w:tcPr>
+          <w:p>
+            <w:r/>
+          </w:p>
+        </w:tc>
+        <w:tc>
+          <w:tcPr>
+            <w:tcW w:type="dxa" w:w="1474"/>
+          </w:tcPr>
+          <w:p>
+            <w:r/>
+          </w:p>
+        </w:tc>
+        <w:tc>
+          <w:tcPr>
+            <w:tcW w:type="dxa" w:w="2324"/>
+          </w:tcPr>
+          <w:p>
+            <w:r/>
+          </w:p>
+        </w:tc>
+      </w:tr>
+      <w:tr>
+        <w:tc>
+          <w:tcPr>
+            <w:tcW w:type="dxa" w:w="2948"/>
+          </w:tcPr>
+          <w:p>
+            <w:r/>
+          </w:p>
+        </w:tc>
+        <w:tc>
+          <w:tcPr>
+            <w:tcW w:type="dxa" w:w="737"/>
+          </w:tcPr>
+          <w:p>
+            <w:r/>
+          </w:p>
+        </w:tc>
+        <w:tc>
+          <w:tcPr>
+            <w:tcW w:type="dxa" w:w="2154"/>
+          </w:tcPr>
+          <w:p>
+            <w:r/>
+          </w:p>
+        </w:tc>
+        <w:tc>
+          <w:tcPr>
+            <w:tcW w:type="dxa" w:w="1474"/>
+          </w:tcPr>
+          <w:p>
+            <w:r/>
+          </w:p>
+        </w:tc>
+        <w:tc>
+          <w:tcPr>
+            <w:tcW w:type="dxa" w:w="2324"/>
+          </w:tcPr>
+          <w:p>
+            <w:r/>
+          </w:p>
+        </w:tc>
+      </w:tr>
+    </w:tbl>
+    <w:p>
+      <w:pPr>
+        <w:spacing w:before="200" w:after="120"/>
+      </w:pPr>
+      <w:r>
+        <w:rPr>
+          <w:rFonts w:ascii="Calibri" w:hAnsi="Calibri"/>
+          <w:b/>
+          <w:color w:val="26190F"/>
+          <w:sz w:val="24"/>
+        </w:rPr>
+        <w:t>Day 6 · Muswellbrook -&gt; Singleton</w:t>
+      </w:r>
+    </w:p>
+    <w:p>
+      <w:pPr>
+        <w:spacing w:before="0" w:after="80"/>
+      </w:pPr>
+      <w:r>
+        <w:rPr>
+          <w:rFonts w:ascii="Calibri" w:hAnsi="Calibri"/>
+          <w:b w:val="0"/>
+          <w:i/>
+          <w:color w:val="7A6A5C"/>
+          <w:sz w:val="19"/>
+        </w:rPr>
+        <w:t>Patchy — shoulder with unclassified stretches; a coal-traffic corridor, so shoulder quality matters most here.</w:t>
+      </w:r>
+    </w:p>
+    <w:tbl>
+      <w:tblPr>
+        <w:tblStyle w:val="LightGrid-Accent1"/>
+        <w:tblW w:type="auto" w:w="0"/>
+        <w:tblLook w:firstColumn="1" w:firstRow="1" w:lastColumn="0" w:lastRow="0" w:noHBand="0" w:noVBand="1" w:val="04A0"/>
+      </w:tblPr>
+      <w:tblGrid>
+        <w:gridCol w:w="1994"/>
+        <w:gridCol w:w="1994"/>
+        <w:gridCol w:w="1994"/>
+        <w:gridCol w:w="1994"/>
+        <w:gridCol w:w="1994"/>
+      </w:tblGrid>
+      <w:tr>
+        <w:tc>
+          <w:tcPr>
+            <w:tcW w:type="dxa" w:w="2948"/>
+            <w:shd w:val="clear" w:fill="F1E8DD"/>
+          </w:tcPr>
+          <w:p>
+            <w:r/>
+            <w:r>
+              <w:rPr>
+                <w:b/>
+                <w:color w:val="26190F"/>
+                <w:sz w:val="17"/>
+              </w:rPr>
+              <w:t>Segment (from -&gt; to / landmark)</w:t>
+            </w:r>
+          </w:p>
+        </w:tc>
+        <w:tc>
+          <w:tcPr>
+            <w:tcW w:type="dxa" w:w="737"/>
+            <w:shd w:val="clear" w:fill="F1E8DD"/>
+          </w:tcPr>
+          <w:p>
+            <w:r/>
+            <w:r>
+              <w:rPr>
+                <w:b/>
+                <w:color w:val="26190F"/>
+                <w:sz w:val="17"/>
+              </w:rPr>
+              <w:t>~km</w:t>
+            </w:r>
+          </w:p>
+        </w:tc>
+        <w:tc>
+          <w:tcPr>
+            <w:tcW w:type="dxa" w:w="2154"/>
+            <w:shd w:val="clear" w:fill="F1E8DD"/>
+          </w:tcPr>
+          <w:p>
+            <w:r/>
+            <w:r>
+              <w:rPr>
+                <w:b/>
+                <w:color w:val="26190F"/>
+                <w:sz w:val="17"/>
+              </w:rPr>
+              <w:t>Shoulder: sealed / narrow / none</w:t>
+            </w:r>
+          </w:p>
+        </w:tc>
+        <w:tc>
+          <w:tcPr>
+            <w:tcW w:type="dxa" w:w="1474"/>
+            <w:shd w:val="clear" w:fill="F1E8DD"/>
+          </w:tcPr>
+          <w:p>
+            <w:r/>
+            <w:r>
+              <w:rPr>
+                <w:b/>
+                <w:color w:val="26190F"/>
+                <w:sz w:val="17"/>
+              </w:rPr>
+              <w:t>Bridge / hazard</w:t>
+            </w:r>
+          </w:p>
+        </w:tc>
+        <w:tc>
+          <w:tcPr>
+            <w:tcW w:type="dxa" w:w="2324"/>
+            <w:shd w:val="clear" w:fill="F1E8DD"/>
+          </w:tcPr>
+          <w:p>
+            <w:r/>
+            <w:r>
+              <w:rPr>
+                <w:b/>
+                <w:color w:val="26190F"/>
+                <w:sz w:val="17"/>
+              </w:rPr>
+              <w:t>Action / contingency</w:t>
+            </w:r>
+          </w:p>
+        </w:tc>
+      </w:tr>
+      <w:tr>
+        <w:tc>
+          <w:tcPr>
+            <w:tcW w:type="dxa" w:w="2948"/>
+          </w:tcPr>
+          <w:p>
+            <w:r/>
+            <w:r>
+              <w:rPr>
+                <w:color w:val="3B2A1D"/>
+                <w:sz w:val="18"/>
+              </w:rPr>
+              <w:t>Leaving Muswellbrook</w:t>
+            </w:r>
+          </w:p>
+        </w:tc>
+        <w:tc>
+          <w:tcPr>
+            <w:tcW w:type="dxa" w:w="737"/>
+          </w:tcPr>
+          <w:p>
+            <w:r/>
+          </w:p>
+        </w:tc>
+        <w:tc>
+          <w:tcPr>
+            <w:tcW w:type="dxa" w:w="2154"/>
+          </w:tcPr>
+          <w:p>
+            <w:r/>
+          </w:p>
+        </w:tc>
+        <w:tc>
+          <w:tcPr>
+            <w:tcW w:type="dxa" w:w="1474"/>
+          </w:tcPr>
+          <w:p>
+            <w:r/>
+          </w:p>
+        </w:tc>
+        <w:tc>
+          <w:tcPr>
+            <w:tcW w:type="dxa" w:w="2324"/>
+          </w:tcPr>
+          <w:p>
+            <w:r/>
+          </w:p>
+        </w:tc>
+      </w:tr>
+      <w:tr>
+        <w:tc>
+          <w:tcPr>
+            <w:tcW w:type="dxa" w:w="2948"/>
+          </w:tcPr>
+          <w:p>
+            <w:r/>
+            <w:r>
+              <w:rPr>
+                <w:color w:val="3B2A1D"/>
+                <w:sz w:val="18"/>
+              </w:rPr>
+              <w:t>Open highway / coal corridor</w:t>
+            </w:r>
+          </w:p>
+        </w:tc>
+        <w:tc>
+          <w:tcPr>
+            <w:tcW w:type="dxa" w:w="737"/>
+          </w:tcPr>
+          <w:p>
+            <w:r/>
+          </w:p>
+        </w:tc>
+        <w:tc>
+          <w:tcPr>
+            <w:tcW w:type="dxa" w:w="2154"/>
+          </w:tcPr>
+          <w:p>
+            <w:r/>
+          </w:p>
+        </w:tc>
+        <w:tc>
+          <w:tcPr>
+            <w:tcW w:type="dxa" w:w="1474"/>
+          </w:tcPr>
+          <w:p>
+            <w:r/>
+          </w:p>
+        </w:tc>
+        <w:tc>
+          <w:tcPr>
+            <w:tcW w:type="dxa" w:w="2324"/>
+          </w:tcPr>
+          <w:p>
+            <w:r/>
+          </w:p>
+        </w:tc>
+      </w:tr>
+      <w:tr>
+        <w:tc>
+          <w:tcPr>
+            <w:tcW w:type="dxa" w:w="2948"/>
+          </w:tcPr>
+          <w:p>
+            <w:r/>
+            <w:r>
+              <w:rPr>
+                <w:color w:val="3B2A1D"/>
+                <w:sz w:val="18"/>
+              </w:rPr>
+              <w:t>Bridges &amp; creek crossings</w:t>
+            </w:r>
+          </w:p>
+        </w:tc>
+        <w:tc>
+          <w:tcPr>
+            <w:tcW w:type="dxa" w:w="737"/>
+          </w:tcPr>
+          <w:p>
+            <w:r/>
+          </w:p>
+        </w:tc>
+        <w:tc>
+          <w:tcPr>
+            <w:tcW w:type="dxa" w:w="2154"/>
+          </w:tcPr>
+          <w:p>
+            <w:r/>
+          </w:p>
+        </w:tc>
+        <w:tc>
+          <w:tcPr>
+            <w:tcW w:type="dxa" w:w="1474"/>
+          </w:tcPr>
+          <w:p>
+            <w:r/>
+          </w:p>
+        </w:tc>
+        <w:tc>
+          <w:tcPr>
+            <w:tcW w:type="dxa" w:w="2324"/>
+          </w:tcPr>
+          <w:p>
+            <w:r/>
+          </w:p>
+        </w:tc>
+      </w:tr>
+      <w:tr>
+        <w:tc>
+          <w:tcPr>
+            <w:tcW w:type="dxa" w:w="2948"/>
+          </w:tcPr>
+          <w:p>
+            <w:r/>
+            <w:r>
+              <w:rPr>
+                <w:color w:val="3B2A1D"/>
+                <w:sz w:val="18"/>
+              </w:rPr>
+              <w:t>Approach into Singleton</w:t>
+            </w:r>
+          </w:p>
+        </w:tc>
+        <w:tc>
+          <w:tcPr>
+            <w:tcW w:type="dxa" w:w="737"/>
+          </w:tcPr>
+          <w:p>
+            <w:r/>
+          </w:p>
+        </w:tc>
+        <w:tc>
+          <w:tcPr>
+            <w:tcW w:type="dxa" w:w="2154"/>
+          </w:tcPr>
+          <w:p>
+            <w:r/>
+          </w:p>
+        </w:tc>
+        <w:tc>
+          <w:tcPr>
+            <w:tcW w:type="dxa" w:w="1474"/>
+          </w:tcPr>
+          <w:p>
+            <w:r/>
+          </w:p>
+        </w:tc>
+        <w:tc>
+          <w:tcPr>
+            <w:tcW w:type="dxa" w:w="2324"/>
+          </w:tcPr>
+          <w:p>
+            <w:r/>
+          </w:p>
+        </w:tc>
+      </w:tr>
+      <w:tr>
+        <w:tc>
+          <w:tcPr>
+            <w:tcW w:type="dxa" w:w="2948"/>
+          </w:tcPr>
+          <w:p>
+            <w:r/>
+          </w:p>
+        </w:tc>
+        <w:tc>
+          <w:tcPr>
+            <w:tcW w:type="dxa" w:w="737"/>
+          </w:tcPr>
+          <w:p>
+            <w:r/>
+          </w:p>
+        </w:tc>
+        <w:tc>
+          <w:tcPr>
+            <w:tcW w:type="dxa" w:w="2154"/>
+          </w:tcPr>
+          <w:p>
+            <w:r/>
+          </w:p>
+        </w:tc>
+        <w:tc>
+          <w:tcPr>
+            <w:tcW w:type="dxa" w:w="1474"/>
+          </w:tcPr>
+          <w:p>
+            <w:r/>
+          </w:p>
+        </w:tc>
+        <w:tc>
+          <w:tcPr>
+            <w:tcW w:type="dxa" w:w="2324"/>
+          </w:tcPr>
+          <w:p>
+            <w:r/>
+          </w:p>
+        </w:tc>
+      </w:tr>
+      <w:tr>
+        <w:tc>
+          <w:tcPr>
+            <w:tcW w:type="dxa" w:w="2948"/>
+          </w:tcPr>
+          <w:p>
+            <w:r/>
+          </w:p>
+        </w:tc>
+        <w:tc>
+          <w:tcPr>
+            <w:tcW w:type="dxa" w:w="737"/>
+          </w:tcPr>
+          <w:p>
+            <w:r/>
+          </w:p>
+        </w:tc>
+        <w:tc>
+          <w:tcPr>
+            <w:tcW w:type="dxa" w:w="2154"/>
+          </w:tcPr>
+          <w:p>
+            <w:r/>
+          </w:p>
+        </w:tc>
+        <w:tc>
+          <w:tcPr>
+            <w:tcW w:type="dxa" w:w="1474"/>
+          </w:tcPr>
+          <w:p>
+            <w:r/>
+          </w:p>
+        </w:tc>
+        <w:tc>
+          <w:tcPr>
+            <w:tcW w:type="dxa" w:w="2324"/>
+          </w:tcPr>
+          <w:p>
+            <w:r/>
+          </w:p>
+        </w:tc>
+      </w:tr>
+    </w:tbl>
+    <w:p>
+      <w:pPr>
+        <w:spacing w:before="0" w:after="80"/>
+      </w:pPr>
+    </w:p>
+    <w:p>
+      <w:pPr>
+        <w:spacing w:before="0" w:after="80"/>
+      </w:pPr>
+      <w:r>
+        <w:rPr>
+          <w:rFonts w:ascii="Calibri" w:hAnsi="Calibri"/>
+          <w:b w:val="0"/>
+          <w:i/>
+          <w:color w:val="7A6A5C"/>
+          <w:sz w:val="18"/>
+        </w:rPr>
+        <w:t>When every row on all four stages reads a safe shoulder or a recorded contingency, the route is cleared to lock.</w:t>
       </w:r>
     </w:p>
     <w:p>

</xml_diff>

<commit_message>
Add camping & accommodation options per overnight town
Research (web, Jul 2026) real camping/caravan options for all 12 overnight
towns and add a 'Camping & accommodation by stop' table to the route book,
plus a 'Camping & stays' note in the app: Paceway (Tamworth), Wallabadah
Park free camp, Murrurundi Caravan Park, Muswellbrook & Singleton
showgrounds, Maitland Coachstop, Stockton Beach & Budgewoi holiday parks,
Mooney Mooney rest area, and Lane Cove River Tourist Park before the SCG.
Flagged as researched-not-booked; confirm powered sites/tent policy/price
and book early. Bumps cache to limn-v17.

Co-Authored-By: Claude Opus 4.8 <noreply@anthropic.com>
Claude-Session: https://claude.ai/code/session_013RVgf2bvsePuKFKTHq9q9K
</commit_message>
<xml_diff>
--- a/Love-in-Motion-Route-Book.docx
+++ b/Love-in-Motion-Route-Book.docx
@@ -1425,6 +1425,696 @@
           <w:sz w:val="20"/>
         </w:rPr>
         <w:t>________________________________________________</w:t>
+      </w:r>
+    </w:p>
+    <w:p>
+      <w:r>
+        <w:br w:type="page"/>
+      </w:r>
+    </w:p>
+    <w:p>
+      <w:pPr>
+        <w:spacing w:before="0" w:after="120"/>
+      </w:pPr>
+      <w:r>
+        <w:rPr>
+          <w:rFonts w:ascii="Calibri" w:hAnsi="Calibri"/>
+          <w:b/>
+          <w:color w:val="9C4526"/>
+          <w:sz w:val="30"/>
+        </w:rPr>
+        <w:t>Camping &amp; accommodation by stop</w:t>
+      </w:r>
+    </w:p>
+    <w:p>
+      <w:pPr>
+        <w:spacing w:before="0" w:after="160"/>
+      </w:pPr>
+      <w:r>
+        <w:rPr>
+          <w:rFonts w:ascii="Calibri" w:hAnsi="Calibri"/>
+          <w:b w:val="0"/>
+          <w:i w:val="0"/>
+          <w:color w:val="3B2A1D"/>
+          <w:sz w:val="21"/>
+        </w:rPr>
+        <w:t>Researched options for each overnight town (web, Jul 2026) — NOT yet booked. Confirm powered sites, tent policy, price and availability, then book early: the run is peak summer / school holidays. Record the booked site and reference on each day's stage sheet.</w:t>
+      </w:r>
+    </w:p>
+    <w:tbl>
+      <w:tblPr>
+        <w:tblStyle w:val="LightGrid-Accent1"/>
+        <w:tblW w:type="auto" w:w="0"/>
+        <w:tblLook w:firstColumn="1" w:firstRow="1" w:lastColumn="0" w:lastRow="0" w:noHBand="0" w:noVBand="1" w:val="04A0"/>
+      </w:tblPr>
+      <w:tblGrid>
+        <w:gridCol w:w="3324"/>
+        <w:gridCol w:w="3324"/>
+        <w:gridCol w:w="3324"/>
+      </w:tblGrid>
+      <w:tr>
+        <w:tc>
+          <w:tcPr>
+            <w:tcW w:type="dxa" w:w="680"/>
+            <w:shd w:val="clear" w:fill="F1E8DD"/>
+          </w:tcPr>
+          <w:p>
+            <w:r/>
+            <w:r>
+              <w:rPr>
+                <w:b/>
+                <w:color w:val="26190F"/>
+                <w:sz w:val="18"/>
+              </w:rPr>
+              <w:t>Day</w:t>
+            </w:r>
+          </w:p>
+        </w:tc>
+        <w:tc>
+          <w:tcPr>
+            <w:tcW w:type="dxa" w:w="1814"/>
+            <w:shd w:val="clear" w:fill="F1E8DD"/>
+          </w:tcPr>
+          <w:p>
+            <w:r/>
+            <w:r>
+              <w:rPr>
+                <w:b/>
+                <w:color w:val="26190F"/>
+                <w:sz w:val="18"/>
+              </w:rPr>
+              <w:t>Overnight</w:t>
+            </w:r>
+          </w:p>
+        </w:tc>
+        <w:tc>
+          <w:tcPr>
+            <w:tcW w:type="dxa" w:w="7143"/>
+            <w:shd w:val="clear" w:fill="F1E8DD"/>
+          </w:tcPr>
+          <w:p>
+            <w:r/>
+            <w:r>
+              <w:rPr>
+                <w:b/>
+                <w:color w:val="26190F"/>
+                <w:sz w:val="18"/>
+              </w:rPr>
+              <w:t>Camping / caravan options  (confirm &amp; book)</w:t>
+            </w:r>
+          </w:p>
+        </w:tc>
+      </w:tr>
+      <w:tr>
+        <w:tc>
+          <w:tcPr>
+            <w:tcW w:type="dxa" w:w="680"/>
+          </w:tcPr>
+          <w:p>
+            <w:r/>
+            <w:r>
+              <w:rPr>
+                <w:color w:val="3B2A1D"/>
+                <w:sz w:val="18"/>
+              </w:rPr>
+              <w:t>1</w:t>
+            </w:r>
+          </w:p>
+        </w:tc>
+        <w:tc>
+          <w:tcPr>
+            <w:tcW w:type="dxa" w:w="1814"/>
+          </w:tcPr>
+          <w:p>
+            <w:r/>
+            <w:r>
+              <w:rPr>
+                <w:b/>
+                <w:color w:val="3B2A1D"/>
+                <w:sz w:val="18"/>
+              </w:rPr>
+              <w:t>Tamworth</w:t>
+            </w:r>
+          </w:p>
+        </w:tc>
+        <w:tc>
+          <w:tcPr>
+            <w:tcW w:type="dxa" w:w="7143"/>
+          </w:tcPr>
+          <w:p>
+            <w:r/>
+            <w:r>
+              <w:rPr>
+                <w:color w:val="3B2A1D"/>
+                <w:sz w:val="17"/>
+              </w:rPr>
+              <w:t>Paceway (old Tamworth Showground), 24-60 Showground Rd — powered &amp; unpowered, 02 6765 9382 (bookings from 1 Jul). Also Piallamore Recreation Reserve, Tamworth Pony Club, Tamworth Rugby Park.</w:t>
+            </w:r>
+          </w:p>
+        </w:tc>
+      </w:tr>
+      <w:tr>
+        <w:tc>
+          <w:tcPr>
+            <w:tcW w:type="dxa" w:w="680"/>
+          </w:tcPr>
+          <w:p>
+            <w:r/>
+            <w:r>
+              <w:rPr>
+                <w:color w:val="3B2A1D"/>
+                <w:sz w:val="18"/>
+              </w:rPr>
+              <w:t>2</w:t>
+            </w:r>
+          </w:p>
+        </w:tc>
+        <w:tc>
+          <w:tcPr>
+            <w:tcW w:type="dxa" w:w="1814"/>
+          </w:tcPr>
+          <w:p>
+            <w:r/>
+            <w:r>
+              <w:rPr>
+                <w:b/>
+                <w:color w:val="3B2A1D"/>
+                <w:sz w:val="18"/>
+              </w:rPr>
+              <w:t>Wallabadah</w:t>
+            </w:r>
+          </w:p>
+        </w:tc>
+        <w:tc>
+          <w:tcPr>
+            <w:tcW w:type="dxa" w:w="7143"/>
+          </w:tcPr>
+          <w:p>
+            <w:r/>
+            <w:r>
+              <w:rPr>
+                <w:color w:val="3B2A1D"/>
+                <w:sz w:val="17"/>
+              </w:rPr>
+              <w:t>Wallabadah Park free camp, behind First Fleet Park via Coach St — $10 donation, hot showers, potable water, free electric BBQs, 72-hr limit.</w:t>
+            </w:r>
+          </w:p>
+        </w:tc>
+      </w:tr>
+      <w:tr>
+        <w:tc>
+          <w:tcPr>
+            <w:tcW w:type="dxa" w:w="680"/>
+          </w:tcPr>
+          <w:p>
+            <w:r/>
+            <w:r>
+              <w:rPr>
+                <w:color w:val="3B2A1D"/>
+                <w:sz w:val="18"/>
+              </w:rPr>
+              <w:t>3</w:t>
+            </w:r>
+          </w:p>
+        </w:tc>
+        <w:tc>
+          <w:tcPr>
+            <w:tcW w:type="dxa" w:w="1814"/>
+          </w:tcPr>
+          <w:p>
+            <w:r/>
+            <w:r>
+              <w:rPr>
+                <w:b/>
+                <w:color w:val="3B2A1D"/>
+                <w:sz w:val="18"/>
+              </w:rPr>
+              <w:t>Murrurundi</w:t>
+            </w:r>
+          </w:p>
+        </w:tc>
+        <w:tc>
+          <w:tcPr>
+            <w:tcW w:type="dxa" w:w="7143"/>
+          </w:tcPr>
+          <w:p>
+            <w:r/>
+            <w:r>
+              <w:rPr>
+                <w:color w:val="3B2A1D"/>
+                <w:sz w:val="17"/>
+              </w:rPr>
+              <w:t>Murrurundi Caravan Park, 11 Bernard St — powered / unpowered / self-contained, 02 6546 6288; toilets, showers, laundry, camp kitchen, BBQs.</w:t>
+            </w:r>
+          </w:p>
+        </w:tc>
+      </w:tr>
+      <w:tr>
+        <w:tc>
+          <w:tcPr>
+            <w:tcW w:type="dxa" w:w="680"/>
+          </w:tcPr>
+          <w:p>
+            <w:r/>
+            <w:r>
+              <w:rPr>
+                <w:color w:val="3B2A1D"/>
+                <w:sz w:val="18"/>
+              </w:rPr>
+              <w:t>4</w:t>
+            </w:r>
+          </w:p>
+        </w:tc>
+        <w:tc>
+          <w:tcPr>
+            <w:tcW w:type="dxa" w:w="1814"/>
+          </w:tcPr>
+          <w:p>
+            <w:r/>
+            <w:r>
+              <w:rPr>
+                <w:b/>
+                <w:color w:val="3B2A1D"/>
+                <w:sz w:val="18"/>
+              </w:rPr>
+              <w:t>Scone</w:t>
+            </w:r>
+          </w:p>
+        </w:tc>
+        <w:tc>
+          <w:tcPr>
+            <w:tcW w:type="dxa" w:w="7143"/>
+          </w:tcPr>
+          <w:p>
+            <w:r/>
+            <w:r>
+              <w:rPr>
+                <w:color w:val="3B2A1D"/>
+                <w:sz w:val="17"/>
+              </w:rPr>
+              <w:t>Scone caravan parks (e.g. Highway Caravan Park / Scone Caravan Park) — confirm powered sites &amp; availability. Scone council info 02 6540 2300.</w:t>
+            </w:r>
+          </w:p>
+        </w:tc>
+      </w:tr>
+      <w:tr>
+        <w:tc>
+          <w:tcPr>
+            <w:tcW w:type="dxa" w:w="680"/>
+          </w:tcPr>
+          <w:p>
+            <w:r/>
+            <w:r>
+              <w:rPr>
+                <w:color w:val="3B2A1D"/>
+                <w:sz w:val="18"/>
+              </w:rPr>
+              <w:t>5</w:t>
+            </w:r>
+          </w:p>
+        </w:tc>
+        <w:tc>
+          <w:tcPr>
+            <w:tcW w:type="dxa" w:w="1814"/>
+          </w:tcPr>
+          <w:p>
+            <w:r/>
+            <w:r>
+              <w:rPr>
+                <w:b/>
+                <w:color w:val="3B2A1D"/>
+                <w:sz w:val="18"/>
+              </w:rPr>
+              <w:t>Muswellbrook</w:t>
+            </w:r>
+          </w:p>
+        </w:tc>
+        <w:tc>
+          <w:tcPr>
+            <w:tcW w:type="dxa" w:w="7143"/>
+          </w:tcPr>
+          <w:p>
+            <w:r/>
+            <w:r>
+              <w:rPr>
+                <w:color w:val="3B2A1D"/>
+                <w:sz w:val="17"/>
+              </w:rPr>
+              <w:t>Muswellbrook Showground — powered sites ~$20/night, new amenities near the office, walk to shops.</w:t>
+            </w:r>
+          </w:p>
+        </w:tc>
+      </w:tr>
+      <w:tr>
+        <w:tc>
+          <w:tcPr>
+            <w:tcW w:type="dxa" w:w="680"/>
+          </w:tcPr>
+          <w:p>
+            <w:r/>
+            <w:r>
+              <w:rPr>
+                <w:color w:val="3B2A1D"/>
+                <w:sz w:val="18"/>
+              </w:rPr>
+              <w:t>6</w:t>
+            </w:r>
+          </w:p>
+        </w:tc>
+        <w:tc>
+          <w:tcPr>
+            <w:tcW w:type="dxa" w:w="1814"/>
+          </w:tcPr>
+          <w:p>
+            <w:r/>
+            <w:r>
+              <w:rPr>
+                <w:b/>
+                <w:color w:val="3B2A1D"/>
+                <w:sz w:val="18"/>
+              </w:rPr>
+              <w:t>Singleton</w:t>
+            </w:r>
+          </w:p>
+        </w:tc>
+        <w:tc>
+          <w:tcPr>
+            <w:tcW w:type="dxa" w:w="7143"/>
+          </w:tcPr>
+          <w:p>
+            <w:r/>
+            <w:r>
+              <w:rPr>
+                <w:color w:val="3B2A1D"/>
+                <w:sz w:val="17"/>
+              </w:rPr>
+              <w:t>Singleton Showground — short-stay camping. Council free camps nearby: McNamara Park (Broke), Bulga, Jerrys Plains (2-night limit).</w:t>
+            </w:r>
+          </w:p>
+        </w:tc>
+      </w:tr>
+      <w:tr>
+        <w:tc>
+          <w:tcPr>
+            <w:tcW w:type="dxa" w:w="680"/>
+          </w:tcPr>
+          <w:p>
+            <w:r/>
+            <w:r>
+              <w:rPr>
+                <w:color w:val="3B2A1D"/>
+                <w:sz w:val="18"/>
+              </w:rPr>
+              <w:t>7</w:t>
+            </w:r>
+          </w:p>
+        </w:tc>
+        <w:tc>
+          <w:tcPr>
+            <w:tcW w:type="dxa" w:w="1814"/>
+          </w:tcPr>
+          <w:p>
+            <w:r/>
+            <w:r>
+              <w:rPr>
+                <w:b/>
+                <w:color w:val="3B2A1D"/>
+                <w:sz w:val="18"/>
+              </w:rPr>
+              <w:t>Maitland</w:t>
+            </w:r>
+          </w:p>
+        </w:tc>
+        <w:tc>
+          <w:tcPr>
+            <w:tcW w:type="dxa" w:w="7143"/>
+          </w:tcPr>
+          <w:p>
+            <w:r/>
+            <w:r>
+              <w:rPr>
+                <w:color w:val="3B2A1D"/>
+                <w:sz w:val="17"/>
+              </w:rPr>
+              <w:t>Coachstop Caravan Park (near the showground); Maitland Caravan Park, 25 High St (24 powered / 34 unpowered); Maitland Showground powered sites.</w:t>
+            </w:r>
+          </w:p>
+        </w:tc>
+      </w:tr>
+      <w:tr>
+        <w:tc>
+          <w:tcPr>
+            <w:tcW w:type="dxa" w:w="680"/>
+          </w:tcPr>
+          <w:p>
+            <w:r/>
+            <w:r>
+              <w:rPr>
+                <w:color w:val="3B2A1D"/>
+                <w:sz w:val="18"/>
+              </w:rPr>
+              <w:t>8</w:t>
+            </w:r>
+          </w:p>
+        </w:tc>
+        <w:tc>
+          <w:tcPr>
+            <w:tcW w:type="dxa" w:w="1814"/>
+          </w:tcPr>
+          <w:p>
+            <w:r/>
+            <w:r>
+              <w:rPr>
+                <w:b/>
+                <w:color w:val="3B2A1D"/>
+                <w:sz w:val="18"/>
+              </w:rPr>
+              <w:t>Newcastle</w:t>
+            </w:r>
+          </w:p>
+        </w:tc>
+        <w:tc>
+          <w:tcPr>
+            <w:tcW w:type="dxa" w:w="7143"/>
+          </w:tcPr>
+          <w:p>
+            <w:r/>
+            <w:r>
+              <w:rPr>
+                <w:color w:val="3B2A1D"/>
+                <w:sz w:val="17"/>
+              </w:rPr>
+              <w:t>NRMA Stockton Beach Holiday Park — 177 powered/unpowered sites, camp kitchen, BBQs, amenities (across the harbour from the CBD).</w:t>
+            </w:r>
+          </w:p>
+        </w:tc>
+      </w:tr>
+      <w:tr>
+        <w:tc>
+          <w:tcPr>
+            <w:tcW w:type="dxa" w:w="680"/>
+          </w:tcPr>
+          <w:p>
+            <w:r/>
+            <w:r>
+              <w:rPr>
+                <w:color w:val="3B2A1D"/>
+                <w:sz w:val="18"/>
+              </w:rPr>
+              <w:t>9</w:t>
+            </w:r>
+          </w:p>
+        </w:tc>
+        <w:tc>
+          <w:tcPr>
+            <w:tcW w:type="dxa" w:w="1814"/>
+          </w:tcPr>
+          <w:p>
+            <w:r/>
+            <w:r>
+              <w:rPr>
+                <w:b/>
+                <w:color w:val="3B2A1D"/>
+                <w:sz w:val="18"/>
+              </w:rPr>
+              <w:t>Budgewoi</w:t>
+            </w:r>
+          </w:p>
+        </w:tc>
+        <w:tc>
+          <w:tcPr>
+            <w:tcW w:type="dxa" w:w="7143"/>
+          </w:tcPr>
+          <w:p>
+            <w:r/>
+            <w:r>
+              <w:rPr>
+                <w:color w:val="3B2A1D"/>
+                <w:sz w:val="17"/>
+              </w:rPr>
+              <w:t>NRMA Budgewoi Holiday Park, Lake Munmorah — powered, ensuite &amp; unpowered sites plus cabins; ~90 min from Sydney.</w:t>
+            </w:r>
+          </w:p>
+        </w:tc>
+      </w:tr>
+      <w:tr>
+        <w:tc>
+          <w:tcPr>
+            <w:tcW w:type="dxa" w:w="680"/>
+          </w:tcPr>
+          <w:p>
+            <w:r/>
+            <w:r>
+              <w:rPr>
+                <w:color w:val="3B2A1D"/>
+                <w:sz w:val="18"/>
+              </w:rPr>
+              <w:t>10</w:t>
+            </w:r>
+          </w:p>
+        </w:tc>
+        <w:tc>
+          <w:tcPr>
+            <w:tcW w:type="dxa" w:w="1814"/>
+          </w:tcPr>
+          <w:p>
+            <w:r/>
+            <w:r>
+              <w:rPr>
+                <w:b/>
+                <w:color w:val="3B2A1D"/>
+                <w:sz w:val="18"/>
+              </w:rPr>
+              <w:t>Gosford</w:t>
+            </w:r>
+          </w:p>
+        </w:tc>
+        <w:tc>
+          <w:tcPr>
+            <w:tcW w:type="dxa" w:w="7143"/>
+          </w:tcPr>
+          <w:p>
+            <w:r/>
+            <w:r>
+              <w:rPr>
+                <w:color w:val="3B2A1D"/>
+                <w:sz w:val="17"/>
+              </w:rPr>
+              <w:t>Camping limited in central Gosford — check Central Coast holiday parks nearby, or hinterland self-contained sites (e.g. Mangrove Mountain). Verify.</w:t>
+            </w:r>
+          </w:p>
+        </w:tc>
+      </w:tr>
+      <w:tr>
+        <w:tc>
+          <w:tcPr>
+            <w:tcW w:type="dxa" w:w="680"/>
+          </w:tcPr>
+          <w:p>
+            <w:r/>
+            <w:r>
+              <w:rPr>
+                <w:color w:val="3B2A1D"/>
+                <w:sz w:val="18"/>
+              </w:rPr>
+              <w:t>11</w:t>
+            </w:r>
+          </w:p>
+        </w:tc>
+        <w:tc>
+          <w:tcPr>
+            <w:tcW w:type="dxa" w:w="1814"/>
+          </w:tcPr>
+          <w:p>
+            <w:r/>
+            <w:r>
+              <w:rPr>
+                <w:b/>
+                <w:color w:val="3B2A1D"/>
+                <w:sz w:val="18"/>
+              </w:rPr>
+              <w:t>Mooney Mooney</w:t>
+            </w:r>
+          </w:p>
+        </w:tc>
+        <w:tc>
+          <w:tcPr>
+            <w:tcW w:type="dxa" w:w="7143"/>
+          </w:tcPr>
+          <w:p>
+            <w:r/>
+            <w:r>
+              <w:rPr>
+                <w:color w:val="3B2A1D"/>
+                <w:sz w:val="17"/>
+              </w:rPr>
+              <w:t>Mooney Mooney Point Rest Area (Peats Ferry Rd) — riverside overnight, amenities 24/7; Deerubbun Reserve free camp nearby. Confirm tent / overnight rules.</w:t>
+            </w:r>
+          </w:p>
+        </w:tc>
+      </w:tr>
+      <w:tr>
+        <w:tc>
+          <w:tcPr>
+            <w:tcW w:type="dxa" w:w="680"/>
+          </w:tcPr>
+          <w:p>
+            <w:r/>
+            <w:r>
+              <w:rPr>
+                <w:color w:val="3B2A1D"/>
+                <w:sz w:val="18"/>
+              </w:rPr>
+              <w:t>12</w:t>
+            </w:r>
+          </w:p>
+        </w:tc>
+        <w:tc>
+          <w:tcPr>
+            <w:tcW w:type="dxa" w:w="1814"/>
+          </w:tcPr>
+          <w:p>
+            <w:r/>
+            <w:r>
+              <w:rPr>
+                <w:b/>
+                <w:color w:val="3B2A1D"/>
+                <w:sz w:val="18"/>
+              </w:rPr>
+              <w:t>Hornsby</w:t>
+            </w:r>
+          </w:p>
+        </w:tc>
+        <w:tc>
+          <w:tcPr>
+            <w:tcW w:type="dxa" w:w="7143"/>
+          </w:tcPr>
+          <w:p>
+            <w:r/>
+            <w:r>
+              <w:rPr>
+                <w:color w:val="3B2A1D"/>
+                <w:sz w:val="17"/>
+              </w:rPr>
+              <w:t>Lane Cove River Tourist Park, 13 Plassey Rd, Macquarie Park (Lane Cove NP) — powered / unpowered, well equipped, ~10 km N of the Harbour Bridge. Handy last-night base before the SCG finish.</w:t>
+            </w:r>
+          </w:p>
+        </w:tc>
+      </w:tr>
+    </w:tbl>
+    <w:p>
+      <w:pPr>
+        <w:spacing w:before="120" w:after="80"/>
+      </w:pPr>
+      <w:r>
+        <w:rPr>
+          <w:rFonts w:ascii="Calibri" w:hAnsi="Calibri"/>
+          <w:b w:val="0"/>
+          <w:i/>
+          <w:color w:val="7A6A5C"/>
+          <w:sz w:val="18"/>
+        </w:rPr>
+        <w:t>Day 13 finishes at the SCG — arrange Sydney accommodation separately (city / Moore Park area).</w:t>
       </w:r>
     </w:p>
     <w:p>

</xml_diff>

<commit_message>
Rebrand The 415 → The 500 and remove km stat from campaign tiles
- Rename the-415/ → the-500/ (new URL) with a meta-refresh redirect
  stub at the-415/ so previously shared links still resolve
- Update all pages, nav, tabs, countdowns and og:url to The 500 /
  ~500 km / start 23 Dec 2026 → finish Mon 4 Jan 2027 (Pink Test)
- README rebranded to The 500 with the-500/ link
- Regenerate all 10 campaign hero graphics with the "≈500 km /
  Attunga → Sydney / on foot" stat block removed; tiles now read
  Love IN MOTION → "Every kilometre turned into care." → route line
- Route book: add booking-calls accommodation table; refresh cover
- Bump service worker cache to limn-v18 and precache the-500/
</commit_message>
<xml_diff>
--- a/Love-in-Motion-Route-Book.docx
+++ b/Love-in-Motion-Route-Book.docx
@@ -2115,6 +2115,1080 @@
           <w:sz w:val="18"/>
         </w:rPr>
         <w:t>Day 13 finishes at the SCG — arrange Sydney accommodation separately (city / Moore Park area).</w:t>
+      </w:r>
+    </w:p>
+    <w:p>
+      <w:r>
+        <w:br w:type="page"/>
+      </w:r>
+    </w:p>
+    <w:p>
+      <w:pPr>
+        <w:spacing w:before="0" w:after="120"/>
+      </w:pPr>
+      <w:r>
+        <w:rPr>
+          <w:rFonts w:ascii="Calibri" w:hAnsi="Calibri"/>
+          <w:b/>
+          <w:color w:val="9C4526"/>
+          <w:sz w:val="30"/>
+        </w:rPr>
+        <w:t>Booking calls — accommodation</w:t>
+      </w:r>
+    </w:p>
+    <w:p>
+      <w:pPr>
+        <w:spacing w:before="0" w:after="160"/>
+      </w:pPr>
+      <w:r>
+        <w:rPr>
+          <w:rFonts w:ascii="Calibri" w:hAnsi="Calibri"/>
+          <w:b w:val="0"/>
+          <w:i w:val="0"/>
+          <w:color w:val="3B2A1D"/>
+          <w:sz w:val="21"/>
+        </w:rPr>
+        <w:t>A call sheet for locking every night (23 Dec - 3 Jan). Peak summer + New Year — book NOW. On each call confirm the exact date, powered site, tent policy (some showgrounds are caravan-only), price and deposit / cancellation, then record the booking reference. Numbers researched Jul 2026; [look up] = still to find.</w:t>
+      </w:r>
+    </w:p>
+    <w:tbl>
+      <w:tblPr>
+        <w:tblStyle w:val="LightGrid-Accent1"/>
+        <w:tblW w:type="auto" w:w="0"/>
+        <w:tblLook w:firstColumn="1" w:firstRow="1" w:lastColumn="0" w:lastRow="0" w:noHBand="0" w:noVBand="1" w:val="04A0"/>
+      </w:tblPr>
+      <w:tblGrid>
+        <w:gridCol w:w="1994"/>
+        <w:gridCol w:w="1994"/>
+        <w:gridCol w:w="1994"/>
+        <w:gridCol w:w="1994"/>
+        <w:gridCol w:w="1994"/>
+      </w:tblGrid>
+      <w:tr>
+        <w:tc>
+          <w:tcPr>
+            <w:tcW w:type="dxa" w:w="1247"/>
+            <w:shd w:val="clear" w:fill="F1E8DD"/>
+          </w:tcPr>
+          <w:p>
+            <w:r/>
+            <w:r>
+              <w:rPr>
+                <w:b/>
+                <w:color w:val="26190F"/>
+                <w:sz w:val="17"/>
+              </w:rPr>
+              <w:t>Night</w:t>
+            </w:r>
+          </w:p>
+        </w:tc>
+        <w:tc>
+          <w:tcPr>
+            <w:tcW w:type="dxa" w:w="1474"/>
+            <w:shd w:val="clear" w:fill="F1E8DD"/>
+          </w:tcPr>
+          <w:p>
+            <w:r/>
+            <w:r>
+              <w:rPr>
+                <w:b/>
+                <w:color w:val="26190F"/>
+                <w:sz w:val="17"/>
+              </w:rPr>
+              <w:t>Town</w:t>
+            </w:r>
+          </w:p>
+        </w:tc>
+        <w:tc>
+          <w:tcPr>
+            <w:tcW w:type="dxa" w:w="3061"/>
+            <w:shd w:val="clear" w:fill="F1E8DD"/>
+          </w:tcPr>
+          <w:p>
+            <w:r/>
+            <w:r>
+              <w:rPr>
+                <w:b/>
+                <w:color w:val="26190F"/>
+                <w:sz w:val="17"/>
+              </w:rPr>
+              <w:t>Place &amp; phone</w:t>
+            </w:r>
+          </w:p>
+        </w:tc>
+        <w:tc>
+          <w:tcPr>
+            <w:tcW w:type="dxa" w:w="2494"/>
+            <w:shd w:val="clear" w:fill="F1E8DD"/>
+          </w:tcPr>
+          <w:p>
+            <w:r/>
+            <w:r>
+              <w:rPr>
+                <w:b/>
+                <w:color w:val="26190F"/>
+                <w:sz w:val="17"/>
+              </w:rPr>
+              <w:t>What to ask</w:t>
+            </w:r>
+          </w:p>
+        </w:tc>
+        <w:tc>
+          <w:tcPr>
+            <w:tcW w:type="dxa" w:w="1361"/>
+            <w:shd w:val="clear" w:fill="F1E8DD"/>
+          </w:tcPr>
+          <w:p>
+            <w:r/>
+            <w:r>
+              <w:rPr>
+                <w:b/>
+                <w:color w:val="26190F"/>
+                <w:sz w:val="17"/>
+              </w:rPr>
+              <w:t>Booked / ref</w:t>
+            </w:r>
+          </w:p>
+        </w:tc>
+      </w:tr>
+      <w:tr>
+        <w:tc>
+          <w:tcPr>
+            <w:tcW w:type="dxa" w:w="1247"/>
+          </w:tcPr>
+          <w:p>
+            <w:r/>
+            <w:r>
+              <w:rPr>
+                <w:color w:val="3B2A1D"/>
+                <w:sz w:val="17"/>
+              </w:rPr>
+              <w:t>Tue 23 Dec</w:t>
+            </w:r>
+          </w:p>
+        </w:tc>
+        <w:tc>
+          <w:tcPr>
+            <w:tcW w:type="dxa" w:w="1474"/>
+          </w:tcPr>
+          <w:p>
+            <w:r/>
+            <w:r>
+              <w:rPr>
+                <w:b/>
+                <w:color w:val="3B2A1D"/>
+                <w:sz w:val="17"/>
+              </w:rPr>
+              <w:t>Tamworth</w:t>
+            </w:r>
+          </w:p>
+        </w:tc>
+        <w:tc>
+          <w:tcPr>
+            <w:tcW w:type="dxa" w:w="3061"/>
+          </w:tcPr>
+          <w:p>
+            <w:r/>
+            <w:r>
+              <w:rPr>
+                <w:color w:val="3B2A1D"/>
+                <w:sz w:val="17"/>
+              </w:rPr>
+              <w:t>Paceway (old showground) - 02 6765 9382</w:t>
+            </w:r>
+          </w:p>
+        </w:tc>
+        <w:tc>
+          <w:tcPr>
+            <w:tcW w:type="dxa" w:w="2494"/>
+          </w:tcPr>
+          <w:p>
+            <w:r/>
+            <w:r>
+              <w:rPr>
+                <w:color w:val="3B2A1D"/>
+                <w:sz w:val="17"/>
+              </w:rPr>
+              <w:t>Powered site, tent OK, price, how to hold</w:t>
+            </w:r>
+          </w:p>
+        </w:tc>
+        <w:tc>
+          <w:tcPr>
+            <w:tcW w:type="dxa" w:w="1361"/>
+          </w:tcPr>
+          <w:p>
+            <w:r/>
+            <w:r>
+              <w:rPr>
+                <w:color w:val="3B2A1D"/>
+                <w:sz w:val="17"/>
+              </w:rPr>
+            </w:r>
+          </w:p>
+        </w:tc>
+      </w:tr>
+      <w:tr>
+        <w:tc>
+          <w:tcPr>
+            <w:tcW w:type="dxa" w:w="1247"/>
+          </w:tcPr>
+          <w:p>
+            <w:r/>
+            <w:r>
+              <w:rPr>
+                <w:color w:val="3B2A1D"/>
+                <w:sz w:val="17"/>
+              </w:rPr>
+              <w:t>Wed 24 Dec</w:t>
+            </w:r>
+          </w:p>
+        </w:tc>
+        <w:tc>
+          <w:tcPr>
+            <w:tcW w:type="dxa" w:w="1474"/>
+          </w:tcPr>
+          <w:p>
+            <w:r/>
+            <w:r>
+              <w:rPr>
+                <w:b/>
+                <w:color w:val="3B2A1D"/>
+                <w:sz w:val="17"/>
+              </w:rPr>
+              <w:t>Wallabadah</w:t>
+            </w:r>
+          </w:p>
+        </w:tc>
+        <w:tc>
+          <w:tcPr>
+            <w:tcW w:type="dxa" w:w="3061"/>
+          </w:tcPr>
+          <w:p>
+            <w:r/>
+            <w:r>
+              <w:rPr>
+                <w:color w:val="3B2A1D"/>
+                <w:sz w:val="17"/>
+              </w:rPr>
+              <w:t>Wallabadah Park free camp - no booking ($10 donation)</w:t>
+            </w:r>
+          </w:p>
+        </w:tc>
+        <w:tc>
+          <w:tcPr>
+            <w:tcW w:type="dxa" w:w="2494"/>
+          </w:tcPr>
+          <w:p>
+            <w:r/>
+            <w:r>
+              <w:rPr>
+                <w:color w:val="3B2A1D"/>
+                <w:sz w:val="17"/>
+              </w:rPr>
+              <w:t>First-come - arrive early (72-hr limit, popular)</w:t>
+            </w:r>
+          </w:p>
+        </w:tc>
+        <w:tc>
+          <w:tcPr>
+            <w:tcW w:type="dxa" w:w="1361"/>
+          </w:tcPr>
+          <w:p>
+            <w:r/>
+            <w:r>
+              <w:rPr>
+                <w:color w:val="3B2A1D"/>
+                <w:sz w:val="17"/>
+              </w:rPr>
+            </w:r>
+          </w:p>
+        </w:tc>
+      </w:tr>
+      <w:tr>
+        <w:tc>
+          <w:tcPr>
+            <w:tcW w:type="dxa" w:w="1247"/>
+          </w:tcPr>
+          <w:p>
+            <w:r/>
+            <w:r>
+              <w:rPr>
+                <w:color w:val="3B2A1D"/>
+                <w:sz w:val="17"/>
+              </w:rPr>
+              <w:t>Thu 25 Dec</w:t>
+            </w:r>
+          </w:p>
+        </w:tc>
+        <w:tc>
+          <w:tcPr>
+            <w:tcW w:type="dxa" w:w="1474"/>
+          </w:tcPr>
+          <w:p>
+            <w:r/>
+            <w:r>
+              <w:rPr>
+                <w:b/>
+                <w:color w:val="3B2A1D"/>
+                <w:sz w:val="17"/>
+              </w:rPr>
+              <w:t>Murrurundi</w:t>
+            </w:r>
+          </w:p>
+        </w:tc>
+        <w:tc>
+          <w:tcPr>
+            <w:tcW w:type="dxa" w:w="3061"/>
+          </w:tcPr>
+          <w:p>
+            <w:r/>
+            <w:r>
+              <w:rPr>
+                <w:color w:val="3B2A1D"/>
+                <w:sz w:val="17"/>
+              </w:rPr>
+              <w:t>Murrurundi Caravan Park - 02 6546 6288</w:t>
+            </w:r>
+          </w:p>
+        </w:tc>
+        <w:tc>
+          <w:tcPr>
+            <w:tcW w:type="dxa" w:w="2494"/>
+          </w:tcPr>
+          <w:p>
+            <w:r/>
+            <w:r>
+              <w:rPr>
+                <w:color w:val="3B2A1D"/>
+                <w:sz w:val="17"/>
+              </w:rPr>
+              <w:t>Open Christmas Day? Powered, price</w:t>
+            </w:r>
+          </w:p>
+        </w:tc>
+        <w:tc>
+          <w:tcPr>
+            <w:tcW w:type="dxa" w:w="1361"/>
+          </w:tcPr>
+          <w:p>
+            <w:r/>
+            <w:r>
+              <w:rPr>
+                <w:color w:val="3B2A1D"/>
+                <w:sz w:val="17"/>
+              </w:rPr>
+            </w:r>
+          </w:p>
+        </w:tc>
+      </w:tr>
+      <w:tr>
+        <w:tc>
+          <w:tcPr>
+            <w:tcW w:type="dxa" w:w="1247"/>
+          </w:tcPr>
+          <w:p>
+            <w:r/>
+            <w:r>
+              <w:rPr>
+                <w:color w:val="3B2A1D"/>
+                <w:sz w:val="17"/>
+              </w:rPr>
+              <w:t>Fri 26 Dec</w:t>
+            </w:r>
+          </w:p>
+        </w:tc>
+        <w:tc>
+          <w:tcPr>
+            <w:tcW w:type="dxa" w:w="1474"/>
+          </w:tcPr>
+          <w:p>
+            <w:r/>
+            <w:r>
+              <w:rPr>
+                <w:b/>
+                <w:color w:val="3B2A1D"/>
+                <w:sz w:val="17"/>
+              </w:rPr>
+              <w:t>Scone</w:t>
+            </w:r>
+          </w:p>
+        </w:tc>
+        <w:tc>
+          <w:tcPr>
+            <w:tcW w:type="dxa" w:w="3061"/>
+          </w:tcPr>
+          <w:p>
+            <w:r/>
+            <w:r>
+              <w:rPr>
+                <w:color w:val="3B2A1D"/>
+                <w:sz w:val="17"/>
+              </w:rPr>
+              <w:t>Scone caravan park - council info 02 6540 2300</w:t>
+            </w:r>
+          </w:p>
+        </w:tc>
+        <w:tc>
+          <w:tcPr>
+            <w:tcW w:type="dxa" w:w="2494"/>
+          </w:tcPr>
+          <w:p>
+            <w:r/>
+            <w:r>
+              <w:rPr>
+                <w:color w:val="3B2A1D"/>
+                <w:sz w:val="17"/>
+              </w:rPr>
+              <w:t>Which park, powered, price, availability</w:t>
+            </w:r>
+          </w:p>
+        </w:tc>
+        <w:tc>
+          <w:tcPr>
+            <w:tcW w:type="dxa" w:w="1361"/>
+          </w:tcPr>
+          <w:p>
+            <w:r/>
+            <w:r>
+              <w:rPr>
+                <w:color w:val="3B2A1D"/>
+                <w:sz w:val="17"/>
+              </w:rPr>
+            </w:r>
+          </w:p>
+        </w:tc>
+      </w:tr>
+      <w:tr>
+        <w:tc>
+          <w:tcPr>
+            <w:tcW w:type="dxa" w:w="1247"/>
+          </w:tcPr>
+          <w:p>
+            <w:r/>
+            <w:r>
+              <w:rPr>
+                <w:color w:val="3B2A1D"/>
+                <w:sz w:val="17"/>
+              </w:rPr>
+              <w:t>Sat 27 Dec</w:t>
+            </w:r>
+          </w:p>
+        </w:tc>
+        <w:tc>
+          <w:tcPr>
+            <w:tcW w:type="dxa" w:w="1474"/>
+          </w:tcPr>
+          <w:p>
+            <w:r/>
+            <w:r>
+              <w:rPr>
+                <w:b/>
+                <w:color w:val="3B2A1D"/>
+                <w:sz w:val="17"/>
+              </w:rPr>
+              <w:t>Muswellbrook</w:t>
+            </w:r>
+          </w:p>
+        </w:tc>
+        <w:tc>
+          <w:tcPr>
+            <w:tcW w:type="dxa" w:w="3061"/>
+          </w:tcPr>
+          <w:p>
+            <w:r/>
+            <w:r>
+              <w:rPr>
+                <w:color w:val="3B2A1D"/>
+                <w:sz w:val="17"/>
+              </w:rPr>
+              <w:t>Muswellbrook Showground - [look up] bookings</w:t>
+            </w:r>
+          </w:p>
+        </w:tc>
+        <w:tc>
+          <w:tcPr>
+            <w:tcW w:type="dxa" w:w="2494"/>
+          </w:tcPr>
+          <w:p>
+            <w:r/>
+            <w:r>
+              <w:rPr>
+                <w:color w:val="3B2A1D"/>
+                <w:sz w:val="17"/>
+              </w:rPr>
+              <w:t>Powered (~$20), amenities, tent OK</w:t>
+            </w:r>
+          </w:p>
+        </w:tc>
+        <w:tc>
+          <w:tcPr>
+            <w:tcW w:type="dxa" w:w="1361"/>
+          </w:tcPr>
+          <w:p>
+            <w:r/>
+            <w:r>
+              <w:rPr>
+                <w:color w:val="3B2A1D"/>
+                <w:sz w:val="17"/>
+              </w:rPr>
+            </w:r>
+          </w:p>
+        </w:tc>
+      </w:tr>
+      <w:tr>
+        <w:tc>
+          <w:tcPr>
+            <w:tcW w:type="dxa" w:w="1247"/>
+          </w:tcPr>
+          <w:p>
+            <w:r/>
+            <w:r>
+              <w:rPr>
+                <w:color w:val="3B2A1D"/>
+                <w:sz w:val="17"/>
+              </w:rPr>
+              <w:t>Sun 28 Dec</w:t>
+            </w:r>
+          </w:p>
+        </w:tc>
+        <w:tc>
+          <w:tcPr>
+            <w:tcW w:type="dxa" w:w="1474"/>
+          </w:tcPr>
+          <w:p>
+            <w:r/>
+            <w:r>
+              <w:rPr>
+                <w:b/>
+                <w:color w:val="3B2A1D"/>
+                <w:sz w:val="17"/>
+              </w:rPr>
+              <w:t>Singleton</w:t>
+            </w:r>
+          </w:p>
+        </w:tc>
+        <w:tc>
+          <w:tcPr>
+            <w:tcW w:type="dxa" w:w="3061"/>
+          </w:tcPr>
+          <w:p>
+            <w:r/>
+            <w:r>
+              <w:rPr>
+                <w:color w:val="3B2A1D"/>
+                <w:sz w:val="17"/>
+              </w:rPr>
+              <w:t>Singleton Showground - [look up] council</w:t>
+            </w:r>
+          </w:p>
+        </w:tc>
+        <w:tc>
+          <w:tcPr>
+            <w:tcW w:type="dxa" w:w="2494"/>
+          </w:tcPr>
+          <w:p>
+            <w:r/>
+            <w:r>
+              <w:rPr>
+                <w:color w:val="3B2A1D"/>
+                <w:sz w:val="17"/>
+              </w:rPr>
+              <w:t>Short-stay camping, powered, tent OK</w:t>
+            </w:r>
+          </w:p>
+        </w:tc>
+        <w:tc>
+          <w:tcPr>
+            <w:tcW w:type="dxa" w:w="1361"/>
+          </w:tcPr>
+          <w:p>
+            <w:r/>
+            <w:r>
+              <w:rPr>
+                <w:color w:val="3B2A1D"/>
+                <w:sz w:val="17"/>
+              </w:rPr>
+            </w:r>
+          </w:p>
+        </w:tc>
+      </w:tr>
+      <w:tr>
+        <w:tc>
+          <w:tcPr>
+            <w:tcW w:type="dxa" w:w="1247"/>
+          </w:tcPr>
+          <w:p>
+            <w:r/>
+            <w:r>
+              <w:rPr>
+                <w:color w:val="3B2A1D"/>
+                <w:sz w:val="17"/>
+              </w:rPr>
+              <w:t>Mon 29 Dec</w:t>
+            </w:r>
+          </w:p>
+        </w:tc>
+        <w:tc>
+          <w:tcPr>
+            <w:tcW w:type="dxa" w:w="1474"/>
+          </w:tcPr>
+          <w:p>
+            <w:r/>
+            <w:r>
+              <w:rPr>
+                <w:b/>
+                <w:color w:val="3B2A1D"/>
+                <w:sz w:val="17"/>
+              </w:rPr>
+              <w:t>Maitland</w:t>
+            </w:r>
+          </w:p>
+        </w:tc>
+        <w:tc>
+          <w:tcPr>
+            <w:tcW w:type="dxa" w:w="3061"/>
+          </w:tcPr>
+          <w:p>
+            <w:r/>
+            <w:r>
+              <w:rPr>
+                <w:color w:val="3B2A1D"/>
+                <w:sz w:val="17"/>
+              </w:rPr>
+              <w:t>Coachstop or Maitland Caravan Park, 25 High St - [look up]</w:t>
+            </w:r>
+          </w:p>
+        </w:tc>
+        <w:tc>
+          <w:tcPr>
+            <w:tcW w:type="dxa" w:w="2494"/>
+          </w:tcPr>
+          <w:p>
+            <w:r/>
+            <w:r>
+              <w:rPr>
+                <w:color w:val="3B2A1D"/>
+                <w:sz w:val="17"/>
+              </w:rPr>
+              <w:t>Powered, price</w:t>
+            </w:r>
+          </w:p>
+        </w:tc>
+        <w:tc>
+          <w:tcPr>
+            <w:tcW w:type="dxa" w:w="1361"/>
+          </w:tcPr>
+          <w:p>
+            <w:r/>
+            <w:r>
+              <w:rPr>
+                <w:color w:val="3B2A1D"/>
+                <w:sz w:val="17"/>
+              </w:rPr>
+            </w:r>
+          </w:p>
+        </w:tc>
+      </w:tr>
+      <w:tr>
+        <w:tc>
+          <w:tcPr>
+            <w:tcW w:type="dxa" w:w="1247"/>
+          </w:tcPr>
+          <w:p>
+            <w:r/>
+            <w:r>
+              <w:rPr>
+                <w:color w:val="3B2A1D"/>
+                <w:sz w:val="17"/>
+              </w:rPr>
+              <w:t>Tue 30 Dec</w:t>
+            </w:r>
+          </w:p>
+        </w:tc>
+        <w:tc>
+          <w:tcPr>
+            <w:tcW w:type="dxa" w:w="1474"/>
+          </w:tcPr>
+          <w:p>
+            <w:r/>
+            <w:r>
+              <w:rPr>
+                <w:b/>
+                <w:color w:val="3B2A1D"/>
+                <w:sz w:val="17"/>
+              </w:rPr>
+              <w:t>Newcastle</w:t>
+            </w:r>
+          </w:p>
+        </w:tc>
+        <w:tc>
+          <w:tcPr>
+            <w:tcW w:type="dxa" w:w="3061"/>
+          </w:tcPr>
+          <w:p>
+            <w:r/>
+            <w:r>
+              <w:rPr>
+                <w:color w:val="3B2A1D"/>
+                <w:sz w:val="17"/>
+              </w:rPr>
+              <w:t>NRMA Stockton Beach Holiday Park - 02 4928 1393</w:t>
+            </w:r>
+          </w:p>
+        </w:tc>
+        <w:tc>
+          <w:tcPr>
+            <w:tcW w:type="dxa" w:w="2494"/>
+          </w:tcPr>
+          <w:p>
+            <w:r/>
+            <w:r>
+              <w:rPr>
+                <w:color w:val="3B2A1D"/>
+                <w:sz w:val="17"/>
+              </w:rPr>
+              <w:t>Powered / tent, price (peak)</w:t>
+            </w:r>
+          </w:p>
+        </w:tc>
+        <w:tc>
+          <w:tcPr>
+            <w:tcW w:type="dxa" w:w="1361"/>
+          </w:tcPr>
+          <w:p>
+            <w:r/>
+            <w:r>
+              <w:rPr>
+                <w:color w:val="3B2A1D"/>
+                <w:sz w:val="17"/>
+              </w:rPr>
+            </w:r>
+          </w:p>
+        </w:tc>
+      </w:tr>
+      <w:tr>
+        <w:tc>
+          <w:tcPr>
+            <w:tcW w:type="dxa" w:w="1247"/>
+          </w:tcPr>
+          <w:p>
+            <w:r/>
+            <w:r>
+              <w:rPr>
+                <w:color w:val="3B2A1D"/>
+                <w:sz w:val="17"/>
+              </w:rPr>
+              <w:t>Wed 31 Dec</w:t>
+            </w:r>
+          </w:p>
+        </w:tc>
+        <w:tc>
+          <w:tcPr>
+            <w:tcW w:type="dxa" w:w="1474"/>
+          </w:tcPr>
+          <w:p>
+            <w:r/>
+            <w:r>
+              <w:rPr>
+                <w:b/>
+                <w:color w:val="3B2A1D"/>
+                <w:sz w:val="17"/>
+              </w:rPr>
+              <w:t>Budgewoi</w:t>
+            </w:r>
+          </w:p>
+        </w:tc>
+        <w:tc>
+          <w:tcPr>
+            <w:tcW w:type="dxa" w:w="3061"/>
+          </w:tcPr>
+          <w:p>
+            <w:r/>
+            <w:r>
+              <w:rPr>
+                <w:color w:val="3B2A1D"/>
+                <w:sz w:val="17"/>
+              </w:rPr>
+              <w:t>NRMA Budgewoi Holiday Park - 02 4390 9019</w:t>
+            </w:r>
+          </w:p>
+        </w:tc>
+        <w:tc>
+          <w:tcPr>
+            <w:tcW w:type="dxa" w:w="2494"/>
+          </w:tcPr>
+          <w:p>
+            <w:r/>
+            <w:r>
+              <w:rPr>
+                <w:color w:val="3B2A1D"/>
+                <w:sz w:val="17"/>
+              </w:rPr>
+              <w:t>NYE availability! Powered, price</w:t>
+            </w:r>
+          </w:p>
+        </w:tc>
+        <w:tc>
+          <w:tcPr>
+            <w:tcW w:type="dxa" w:w="1361"/>
+          </w:tcPr>
+          <w:p>
+            <w:r/>
+            <w:r>
+              <w:rPr>
+                <w:color w:val="3B2A1D"/>
+                <w:sz w:val="17"/>
+              </w:rPr>
+            </w:r>
+          </w:p>
+        </w:tc>
+      </w:tr>
+      <w:tr>
+        <w:tc>
+          <w:tcPr>
+            <w:tcW w:type="dxa" w:w="1247"/>
+          </w:tcPr>
+          <w:p>
+            <w:r/>
+            <w:r>
+              <w:rPr>
+                <w:color w:val="3B2A1D"/>
+                <w:sz w:val="17"/>
+              </w:rPr>
+              <w:t>Thu 1 Jan</w:t>
+            </w:r>
+          </w:p>
+        </w:tc>
+        <w:tc>
+          <w:tcPr>
+            <w:tcW w:type="dxa" w:w="1474"/>
+          </w:tcPr>
+          <w:p>
+            <w:r/>
+            <w:r>
+              <w:rPr>
+                <w:b/>
+                <w:color w:val="3B2A1D"/>
+                <w:sz w:val="17"/>
+              </w:rPr>
+              <w:t>Gosford</w:t>
+            </w:r>
+          </w:p>
+        </w:tc>
+        <w:tc>
+          <w:tcPr>
+            <w:tcW w:type="dxa" w:w="3061"/>
+          </w:tcPr>
+          <w:p>
+            <w:r/>
+            <w:r>
+              <w:rPr>
+                <w:color w:val="3B2A1D"/>
+                <w:sz w:val="17"/>
+              </w:rPr>
+              <w:t>Central Coast park - [look up]</w:t>
+            </w:r>
+          </w:p>
+        </w:tc>
+        <w:tc>
+          <w:tcPr>
+            <w:tcW w:type="dxa" w:w="2494"/>
+          </w:tcPr>
+          <w:p>
+            <w:r/>
+            <w:r>
+              <w:rPr>
+                <w:color w:val="3B2A1D"/>
+                <w:sz w:val="17"/>
+              </w:rPr>
+              <w:t>Availability, powered - Gosford CBD is thin</w:t>
+            </w:r>
+          </w:p>
+        </w:tc>
+        <w:tc>
+          <w:tcPr>
+            <w:tcW w:type="dxa" w:w="1361"/>
+          </w:tcPr>
+          <w:p>
+            <w:r/>
+            <w:r>
+              <w:rPr>
+                <w:color w:val="3B2A1D"/>
+                <w:sz w:val="17"/>
+              </w:rPr>
+            </w:r>
+          </w:p>
+        </w:tc>
+      </w:tr>
+      <w:tr>
+        <w:tc>
+          <w:tcPr>
+            <w:tcW w:type="dxa" w:w="1247"/>
+          </w:tcPr>
+          <w:p>
+            <w:r/>
+            <w:r>
+              <w:rPr>
+                <w:color w:val="3B2A1D"/>
+                <w:sz w:val="17"/>
+              </w:rPr>
+              <w:t>Fri 2 Jan</w:t>
+            </w:r>
+          </w:p>
+        </w:tc>
+        <w:tc>
+          <w:tcPr>
+            <w:tcW w:type="dxa" w:w="1474"/>
+          </w:tcPr>
+          <w:p>
+            <w:r/>
+            <w:r>
+              <w:rPr>
+                <w:b/>
+                <w:color w:val="3B2A1D"/>
+                <w:sz w:val="17"/>
+              </w:rPr>
+              <w:t>Mooney Mooney</w:t>
+            </w:r>
+          </w:p>
+        </w:tc>
+        <w:tc>
+          <w:tcPr>
+            <w:tcW w:type="dxa" w:w="3061"/>
+          </w:tcPr>
+          <w:p>
+            <w:r/>
+            <w:r>
+              <w:rPr>
+                <w:color w:val="3B2A1D"/>
+                <w:sz w:val="17"/>
+              </w:rPr>
+              <w:t>Mooney Mooney Point rest area / Deerubbun Reserve - no booking</w:t>
+            </w:r>
+          </w:p>
+        </w:tc>
+        <w:tc>
+          <w:tcPr>
+            <w:tcW w:type="dxa" w:w="2494"/>
+          </w:tcPr>
+          <w:p>
+            <w:r/>
+            <w:r>
+              <w:rPr>
+                <w:color w:val="3B2A1D"/>
+                <w:sz w:val="17"/>
+              </w:rPr>
+              <w:t>Confirm overnight &amp; tent rules on the day</w:t>
+            </w:r>
+          </w:p>
+        </w:tc>
+        <w:tc>
+          <w:tcPr>
+            <w:tcW w:type="dxa" w:w="1361"/>
+          </w:tcPr>
+          <w:p>
+            <w:r/>
+            <w:r>
+              <w:rPr>
+                <w:color w:val="3B2A1D"/>
+                <w:sz w:val="17"/>
+              </w:rPr>
+            </w:r>
+          </w:p>
+        </w:tc>
+      </w:tr>
+      <w:tr>
+        <w:tc>
+          <w:tcPr>
+            <w:tcW w:type="dxa" w:w="1247"/>
+          </w:tcPr>
+          <w:p>
+            <w:r/>
+            <w:r>
+              <w:rPr>
+                <w:color w:val="3B2A1D"/>
+                <w:sz w:val="17"/>
+              </w:rPr>
+              <w:t>Sat 3 Jan</w:t>
+            </w:r>
+          </w:p>
+        </w:tc>
+        <w:tc>
+          <w:tcPr>
+            <w:tcW w:type="dxa" w:w="1474"/>
+          </w:tcPr>
+          <w:p>
+            <w:r/>
+            <w:r>
+              <w:rPr>
+                <w:b/>
+                <w:color w:val="3B2A1D"/>
+                <w:sz w:val="17"/>
+              </w:rPr>
+              <w:t>Hornsby</w:t>
+            </w:r>
+          </w:p>
+        </w:tc>
+        <w:tc>
+          <w:tcPr>
+            <w:tcW w:type="dxa" w:w="3061"/>
+          </w:tcPr>
+          <w:p>
+            <w:r/>
+            <w:r>
+              <w:rPr>
+                <w:color w:val="3B2A1D"/>
+                <w:sz w:val="17"/>
+              </w:rPr>
+              <w:t>Lane Cove River Tourist Park - 02 9888 9133 / 1300 729 133</w:t>
+            </w:r>
+          </w:p>
+        </w:tc>
+        <w:tc>
+          <w:tcPr>
+            <w:tcW w:type="dxa" w:w="2494"/>
+          </w:tcPr>
+          <w:p>
+            <w:r/>
+            <w:r>
+              <w:rPr>
+                <w:color w:val="3B2A1D"/>
+                <w:sz w:val="17"/>
+              </w:rPr>
+              <w:t>Powered / tent, price - last night before the SCG</w:t>
+            </w:r>
+          </w:p>
+        </w:tc>
+        <w:tc>
+          <w:tcPr>
+            <w:tcW w:type="dxa" w:w="1361"/>
+          </w:tcPr>
+          <w:p>
+            <w:r/>
+            <w:r>
+              <w:rPr>
+                <w:color w:val="3B2A1D"/>
+                <w:sz w:val="17"/>
+              </w:rPr>
+            </w:r>
+          </w:p>
+        </w:tc>
+      </w:tr>
+    </w:tbl>
+    <w:p>
+      <w:pPr>
+        <w:spacing w:before="120" w:after="80"/>
+      </w:pPr>
+      <w:r>
+        <w:rPr>
+          <w:rFonts w:ascii="Calibri" w:hAnsi="Calibri"/>
+          <w:b w:val="0"/>
+          <w:i/>
+          <w:color w:val="7A6A5C"/>
+          <w:sz w:val="18"/>
+        </w:rPr>
+        <w:t>Day 13 (Sun 4 Jan) finishes at the SCG — book Sydney accommodation (city / Moore Park) separately. Ask every park about tent sites specifically — several are caravan/RV-focused.</w:t>
       </w:r>
     </w:p>
     <w:p>

</xml_diff>

<commit_message>
Add "Road kit — the full packing list" chapter to the route book
New chapter between the crew checklist and the verification log:
- Seven tick-box categories: on the runner, feet & body care, heat
  management (safety-critical), crew vehicle, camp & sleep, kitchen
  & fuelling, and campaign kit — the pack-the-car list that expands
  the daily crew quick-check
- "The one that bites" callout: Christmas closures — Day 3
  (Christmas Day) is Wallabadah → Murrurundi, so the full stock-up
  happens in Tamworth on Day 1-2 and Day 3-4 food travels in the car
- Budget cross-reference: most items already costed in the $9,500
  road budget; new purchases are the shade shelter, PLB and camp kit
- Bump service worker cache to limn-v24
</commit_message>
<xml_diff>
--- a/Love-in-Motion-Route-Book.docx
+++ b/Love-in-Motion-Route-Book.docx
@@ -22056,6 +22056,912 @@
         </w:tc>
       </w:tr>
     </w:tbl>
+    <w:p>
+      <w:r>
+        <w:br w:type="page"/>
+      </w:r>
+    </w:p>
+    <w:p>
+      <w:pPr>
+        <w:spacing w:before="0" w:after="120"/>
+      </w:pPr>
+      <w:r>
+        <w:rPr>
+          <w:rFonts w:ascii="Calibri" w:hAnsi="Calibri"/>
+          <w:b/>
+          <w:color w:val="9C4526"/>
+          <w:sz w:val="30"/>
+        </w:rPr>
+        <w:t>Road kit — the full packing list</w:t>
+      </w:r>
+    </w:p>
+    <w:p>
+      <w:pPr>
+        <w:spacing w:before="0" w:after="160"/>
+      </w:pPr>
+      <w:r>
+        <w:rPr>
+          <w:rFonts w:ascii="Calibri" w:hAnsi="Calibri"/>
+          <w:b w:val="0"/>
+          <w:i w:val="0"/>
+          <w:color w:val="3B2A1D"/>
+          <w:sz w:val="20"/>
+        </w:rPr>
+        <w:t>Everything 13 days on the road needs, by category. The crew checklist on the previous page is the daily quick check; this is the pack-the-car list. Tick each item as it's loaded.</w:t>
+      </w:r>
+    </w:p>
+    <w:tbl>
+      <w:tblPr>
+        <w:tblStyle w:val="TableGrid"/>
+        <w:tblW w:type="auto" w:w="0"/>
+        <w:tblLook w:firstColumn="1" w:firstRow="1" w:lastColumn="0" w:lastRow="0" w:noHBand="0" w:noVBand="1" w:val="04A0"/>
+      </w:tblPr>
+      <w:tblGrid>
+        <w:gridCol w:w="4986"/>
+        <w:gridCol w:w="4986"/>
+      </w:tblGrid>
+      <w:tr>
+        <w:tc>
+          <w:tcPr>
+            <w:tcW w:type="dxa" w:w="4762"/>
+          </w:tcPr>
+          <w:p>
+            <w:r/>
+            <w:r>
+              <w:rPr>
+                <w:b/>
+                <w:color w:val="9C4526"/>
+                <w:sz w:val="20"/>
+              </w:rPr>
+              <w:t>On the runner</w:t>
+            </w:r>
+          </w:p>
+          <w:p>
+            <w:pPr>
+              <w:spacing w:after="20"/>
+            </w:pPr>
+            <w:r>
+              <w:rPr>
+                <w:color w:val="3B2A1D"/>
+                <w:sz w:val="19"/>
+              </w:rPr>
+              <w:t>☐  3 pairs of shoes — rotated daily, all broken in</w:t>
+            </w:r>
+          </w:p>
+          <w:p>
+            <w:pPr>
+              <w:spacing w:after="20"/>
+            </w:pPr>
+            <w:r>
+              <w:rPr>
+                <w:color w:val="3B2A1D"/>
+                <w:sz w:val="19"/>
+              </w:rPr>
+              <w:t>☐  8–10 pairs of tested run socks</w:t>
+            </w:r>
+          </w:p>
+          <w:p>
+            <w:pPr>
+              <w:spacing w:after="20"/>
+            </w:pPr>
+            <w:r>
+              <w:rPr>
+                <w:color w:val="3B2A1D"/>
+                <w:sz w:val="19"/>
+              </w:rPr>
+              <w:t>☐  2–3 sets of run kit (shorts, singlets)</w:t>
+            </w:r>
+          </w:p>
+          <w:p>
+            <w:pPr>
+              <w:spacing w:after="20"/>
+            </w:pPr>
+            <w:r>
+              <w:rPr>
+                <w:color w:val="3B2A1D"/>
+                <w:sz w:val="19"/>
+              </w:rPr>
+              <w:t>☐  Hi-vis vest/singlet + clip-on lights (pre-dawn starts)</w:t>
+            </w:r>
+          </w:p>
+          <w:p>
+            <w:pPr>
+              <w:spacing w:after="20"/>
+            </w:pPr>
+            <w:r>
+              <w:rPr>
+                <w:color w:val="3B2A1D"/>
+                <w:sz w:val="19"/>
+              </w:rPr>
+              <w:t>☐  Hat with neck coverage, sunglasses, buff</w:t>
+            </w:r>
+          </w:p>
+          <w:p>
+            <w:pPr>
+              <w:spacing w:after="20"/>
+            </w:pPr>
+            <w:r>
+              <w:rPr>
+                <w:color w:val="3B2A1D"/>
+                <w:sz w:val="19"/>
+              </w:rPr>
+              <w:t>☐  Race vest + flasks, plus spare flasks</w:t>
+            </w:r>
+          </w:p>
+          <w:p>
+            <w:pPr>
+              <w:spacing w:after="20"/>
+            </w:pPr>
+            <w:r>
+              <w:rPr>
+                <w:color w:val="3B2A1D"/>
+                <w:sz w:val="19"/>
+              </w:rPr>
+              <w:t>☐  Anti-chafe ×2 — 13 days finds every seam</w:t>
+            </w:r>
+          </w:p>
+          <w:p>
+            <w:pPr>
+              <w:spacing w:after="20"/>
+            </w:pPr>
+            <w:r>
+              <w:rPr>
+                <w:color w:val="3B2A1D"/>
+                <w:sz w:val="19"/>
+              </w:rPr>
+              <w:t>☐  SPF50+ sunscreen (bulk), zinc stick, SPF lip balm</w:t>
+            </w:r>
+          </w:p>
+          <w:p>
+            <w:pPr>
+              <w:spacing w:after="20"/>
+            </w:pPr>
+            <w:r>
+              <w:rPr>
+                <w:color w:val="3B2A1D"/>
+                <w:sz w:val="19"/>
+              </w:rPr>
+              <w:t>☐  Watch, phone, battery banks, all chargers</w:t>
+            </w:r>
+          </w:p>
+          <w:p>
+            <w:pPr>
+              <w:spacing w:after="20"/>
+            </w:pPr>
+            <w:r>
+              <w:rPr>
+                <w:color w:val="3B2A1D"/>
+                <w:sz w:val="19"/>
+              </w:rPr>
+              <w:t>☐  Booty band + long resistance band (travel strength)</w:t>
+            </w:r>
+          </w:p>
+        </w:tc>
+        <w:tc>
+          <w:tcPr>
+            <w:tcW w:type="dxa" w:w="4762"/>
+          </w:tcPr>
+          <w:p>
+            <w:r/>
+            <w:r>
+              <w:rPr>
+                <w:b/>
+                <w:color w:val="9C4526"/>
+                <w:sz w:val="20"/>
+              </w:rPr>
+              <w:t>Feet &amp; body care</w:t>
+            </w:r>
+          </w:p>
+          <w:p>
+            <w:pPr>
+              <w:spacing w:after="20"/>
+            </w:pPr>
+            <w:r>
+              <w:rPr>
+                <w:color w:val="3B2A1D"/>
+                <w:sz w:val="19"/>
+              </w:rPr>
+              <w:t>☐  Blister kit: hydrocolloid dressings, Fixomull/Hypafix tape</w:t>
+            </w:r>
+          </w:p>
+          <w:p>
+            <w:pPr>
+              <w:spacing w:after="20"/>
+            </w:pPr>
+            <w:r>
+              <w:rPr>
+                <w:color w:val="3B2A1D"/>
+                <w:sz w:val="19"/>
+              </w:rPr>
+              <w:t>☐  Needle, antiseptic, small scissors</w:t>
+            </w:r>
+          </w:p>
+          <w:p>
+            <w:pPr>
+              <w:spacing w:after="20"/>
+            </w:pPr>
+            <w:r>
+              <w:rPr>
+                <w:color w:val="3B2A1D"/>
+                <w:sz w:val="19"/>
+              </w:rPr>
+              <w:t>☐  Nightly foot inspection — not when it hurts</w:t>
+            </w:r>
+          </w:p>
+          <w:p>
+            <w:pPr>
+              <w:spacing w:after="20"/>
+            </w:pPr>
+            <w:r>
+              <w:rPr>
+                <w:color w:val="3B2A1D"/>
+                <w:sz w:val="19"/>
+              </w:rPr>
+              <w:t>☐  Full first-aid kit + SNAKE compression bandage</w:t>
+            </w:r>
+          </w:p>
+          <w:p>
+            <w:pPr>
+              <w:spacing w:after="20"/>
+            </w:pPr>
+            <w:r>
+              <w:rPr>
+                <w:color w:val="3B2A1D"/>
+                <w:sz w:val="19"/>
+              </w:rPr>
+              <w:t>☐  Antihistamines, paracetamol (easy on NSAIDs in heat)</w:t>
+            </w:r>
+          </w:p>
+          <w:p>
+            <w:pPr>
+              <w:spacing w:after="20"/>
+            </w:pPr>
+            <w:r>
+              <w:rPr>
+                <w:color w:val="3B2A1D"/>
+                <w:sz w:val="19"/>
+              </w:rPr>
+              <w:t>☐  Gastro meds, thermometer</w:t>
+            </w:r>
+          </w:p>
+          <w:p>
+            <w:pPr>
+              <w:spacing w:after="20"/>
+            </w:pPr>
+            <w:r>
+              <w:rPr>
+                <w:color w:val="3B2A1D"/>
+                <w:sz w:val="19"/>
+              </w:rPr>
+              <w:t>☐  Massage gun (USB/12V), roller, spiky ball</w:t>
+            </w:r>
+          </w:p>
+          <w:p>
+            <w:pPr>
+              <w:spacing w:after="20"/>
+            </w:pPr>
+            <w:r>
+              <w:rPr>
+                <w:color w:val="3B2A1D"/>
+                <w:sz w:val="19"/>
+              </w:rPr>
+              <w:t>☐  Magnesium + usual meds &amp; supplements</w:t>
+            </w:r>
+          </w:p>
+        </w:tc>
+      </w:tr>
+    </w:tbl>
+    <w:p>
+      <w:pPr>
+        <w:spacing w:before="0" w:after="40"/>
+      </w:pPr>
+    </w:p>
+    <w:tbl>
+      <w:tblPr>
+        <w:tblStyle w:val="TableGrid"/>
+        <w:tblW w:type="auto" w:w="0"/>
+        <w:tblLook w:firstColumn="1" w:firstRow="1" w:lastColumn="0" w:lastRow="0" w:noHBand="0" w:noVBand="1" w:val="04A0"/>
+      </w:tblPr>
+      <w:tblGrid>
+        <w:gridCol w:w="4986"/>
+        <w:gridCol w:w="4986"/>
+      </w:tblGrid>
+      <w:tr>
+        <w:tc>
+          <w:tcPr>
+            <w:tcW w:type="dxa" w:w="4762"/>
+          </w:tcPr>
+          <w:p>
+            <w:r/>
+            <w:r>
+              <w:rPr>
+                <w:b/>
+                <w:color w:val="9C4526"/>
+                <w:sz w:val="20"/>
+              </w:rPr>
+              <w:t>Heat management — safety-critical</w:t>
+            </w:r>
+          </w:p>
+          <w:p>
+            <w:pPr>
+              <w:spacing w:after="20"/>
+            </w:pPr>
+            <w:r>
+              <w:rPr>
+                <w:color w:val="3B2A1D"/>
+                <w:sz w:val="19"/>
+              </w:rPr>
+              <w:t>☐  Ice bandana / neck wraps</w:t>
+            </w:r>
+          </w:p>
+          <w:p>
+            <w:pPr>
+              <w:spacing w:after="20"/>
+            </w:pPr>
+            <w:r>
+              <w:rPr>
+                <w:color w:val="3B2A1D"/>
+                <w:sz w:val="19"/>
+              </w:rPr>
+              <w:t>☐  Spray bottle; ice-slurry capability at crew stops</w:t>
+            </w:r>
+          </w:p>
+          <w:p>
+            <w:pPr>
+              <w:spacing w:after="20"/>
+            </w:pPr>
+            <w:r>
+              <w:rPr>
+                <w:color w:val="3B2A1D"/>
+                <w:sz w:val="19"/>
+              </w:rPr>
+              <w:t>☐  Pop-up shade shelter — no shade on the highway at 1 pm</w:t>
+            </w:r>
+          </w:p>
+          <w:p>
+            <w:pPr>
+              <w:spacing w:after="20"/>
+            </w:pPr>
+            <w:r>
+              <w:rPr>
+                <w:color w:val="3B2A1D"/>
+                <w:sz w:val="19"/>
+              </w:rPr>
+              <w:t>☐  Big esky or 12V car fridge</w:t>
+            </w:r>
+          </w:p>
+          <w:p>
+            <w:pPr>
+              <w:spacing w:after="20"/>
+            </w:pPr>
+            <w:r>
+              <w:rPr>
+                <w:color w:val="3B2A1D"/>
+                <w:sz w:val="19"/>
+              </w:rPr>
+              <w:t>☐  Instant cold packs</w:t>
+            </w:r>
+          </w:p>
+          <w:p>
+            <w:pPr>
+              <w:spacing w:after="20"/>
+            </w:pPr>
+            <w:r>
+              <w:rPr>
+                <w:color w:val="3B2A1D"/>
+                <w:sz w:val="19"/>
+              </w:rPr>
+              <w:t>☐  Electrolytes in BULK — can't restock on Boxing Day</w:t>
+            </w:r>
+          </w:p>
+        </w:tc>
+        <w:tc>
+          <w:tcPr>
+            <w:tcW w:type="dxa" w:w="4762"/>
+          </w:tcPr>
+          <w:p>
+            <w:r/>
+            <w:r>
+              <w:rPr>
+                <w:b/>
+                <w:color w:val="9C4526"/>
+                <w:sz w:val="20"/>
+              </w:rPr>
+              <w:t>Crew vehicle</w:t>
+            </w:r>
+          </w:p>
+          <w:p>
+            <w:pPr>
+              <w:spacing w:after="20"/>
+            </w:pPr>
+            <w:r>
+              <w:rPr>
+                <w:color w:val="3B2A1D"/>
+                <w:sz w:val="19"/>
+              </w:rPr>
+              <w:t>☐  CAUTION — RUNNER AHEAD signage (magnetic/corflute)</w:t>
+            </w:r>
+          </w:p>
+          <w:p>
+            <w:pPr>
+              <w:spacing w:after="20"/>
+            </w:pPr>
+            <w:r>
+              <w:rPr>
+                <w:color w:val="3B2A1D"/>
+                <w:sz w:val="19"/>
+              </w:rPr>
+              <w:t>☐  Amber flashing beacon</w:t>
+            </w:r>
+          </w:p>
+          <w:p>
+            <w:pPr>
+              <w:spacing w:after="20"/>
+            </w:pPr>
+            <w:r>
+              <w:rPr>
+                <w:color w:val="3B2A1D"/>
+                <w:sz w:val="19"/>
+              </w:rPr>
+              <w:t>☐  2 × UHF handhelds + car charger (pass-country dead zones)</w:t>
+            </w:r>
+          </w:p>
+          <w:p>
+            <w:pPr>
+              <w:spacing w:after="20"/>
+            </w:pPr>
+            <w:r>
+              <w:rPr>
+                <w:color w:val="3B2A1D"/>
+                <w:sz w:val="19"/>
+              </w:rPr>
+              <w:t>☐  PLB or satellite communicator (shoulder-gap days)</w:t>
+            </w:r>
+          </w:p>
+          <w:p>
+            <w:pPr>
+              <w:spacing w:after="20"/>
+            </w:pPr>
+            <w:r>
+              <w:rPr>
+                <w:color w:val="3B2A1D"/>
+                <w:sz w:val="19"/>
+              </w:rPr>
+              <w:t>☐  20 L+ water, refilled every town</w:t>
+            </w:r>
+          </w:p>
+          <w:p>
+            <w:pPr>
+              <w:spacing w:after="20"/>
+            </w:pPr>
+            <w:r>
+              <w:rPr>
+                <w:color w:val="3B2A1D"/>
+                <w:sz w:val="19"/>
+              </w:rPr>
+              <w:t>☐  12V inverter, jump starter, checked spare tyre</w:t>
+            </w:r>
+          </w:p>
+          <w:p>
+            <w:pPr>
+              <w:spacing w:after="20"/>
+            </w:pPr>
+            <w:r>
+              <w:rPr>
+                <w:color w:val="3B2A1D"/>
+                <w:sz w:val="19"/>
+              </w:rPr>
+              <w:t>☐  Fire extinguisher (summer, rural NSW)</w:t>
+            </w:r>
+          </w:p>
+          <w:p>
+            <w:pPr>
+              <w:spacing w:after="20"/>
+            </w:pPr>
+            <w:r>
+              <w:rPr>
+                <w:color w:val="3B2A1D"/>
+                <w:sz w:val="19"/>
+              </w:rPr>
+              <w:t>☐  PRINTED route book + paper maps</w:t>
+            </w:r>
+          </w:p>
+          <w:p>
+            <w:pPr>
+              <w:spacing w:after="20"/>
+            </w:pPr>
+            <w:r>
+              <w:rPr>
+                <w:color w:val="3B2A1D"/>
+                <w:sz w:val="19"/>
+              </w:rPr>
+              <w:t>☐  Insurance docs &amp; booking confirmations, cash, ID/Medicare</w:t>
+            </w:r>
+          </w:p>
+        </w:tc>
+      </w:tr>
+    </w:tbl>
+    <w:p>
+      <w:pPr>
+        <w:spacing w:before="0" w:after="40"/>
+      </w:pPr>
+    </w:p>
+    <w:tbl>
+      <w:tblPr>
+        <w:tblStyle w:val="TableGrid"/>
+        <w:tblW w:type="auto" w:w="0"/>
+        <w:tblLook w:firstColumn="1" w:firstRow="1" w:lastColumn="0" w:lastRow="0" w:noHBand="0" w:noVBand="1" w:val="04A0"/>
+      </w:tblPr>
+      <w:tblGrid>
+        <w:gridCol w:w="4986"/>
+        <w:gridCol w:w="4986"/>
+      </w:tblGrid>
+      <w:tr>
+        <w:tc>
+          <w:tcPr>
+            <w:tcW w:type="dxa" w:w="4762"/>
+          </w:tcPr>
+          <w:p>
+            <w:r/>
+            <w:r>
+              <w:rPr>
+                <w:b/>
+                <w:color w:val="9C4526"/>
+                <w:sz w:val="20"/>
+              </w:rPr>
+              <w:t>Camp &amp; sleep</w:t>
+            </w:r>
+          </w:p>
+          <w:p>
+            <w:pPr>
+              <w:spacing w:after="20"/>
+            </w:pPr>
+            <w:r>
+              <w:rPr>
+                <w:color w:val="3B2A1D"/>
+                <w:sz w:val="19"/>
+              </w:rPr>
+              <w:t>☐  Tent / swags for camp nights</w:t>
+            </w:r>
+          </w:p>
+          <w:p>
+            <w:pPr>
+              <w:spacing w:after="20"/>
+            </w:pPr>
+            <w:r>
+              <w:rPr>
+                <w:color w:val="3B2A1D"/>
+                <w:sz w:val="19"/>
+              </w:rPr>
+              <w:t>☐  Pillow from home — sleep is recovery</w:t>
+            </w:r>
+          </w:p>
+          <w:p>
+            <w:pPr>
+              <w:spacing w:after="20"/>
+            </w:pPr>
+            <w:r>
+              <w:rPr>
+                <w:color w:val="3B2A1D"/>
+                <w:sz w:val="19"/>
+              </w:rPr>
+              <w:t>☐  USB fan, earplugs + eye mask (NY caravan parks are loud)</w:t>
+            </w:r>
+          </w:p>
+          <w:p>
+            <w:pPr>
+              <w:spacing w:after="20"/>
+            </w:pPr>
+            <w:r>
+              <w:rPr>
+                <w:color w:val="3B2A1D"/>
+                <w:sz w:val="19"/>
+              </w:rPr>
+              <w:t>☐  Headlamps, lantern, camp chairs, table</w:t>
+            </w:r>
+          </w:p>
+          <w:p>
+            <w:pPr>
+              <w:spacing w:after="20"/>
+            </w:pPr>
+            <w:r>
+              <w:rPr>
+                <w:color w:val="3B2A1D"/>
+                <w:sz w:val="19"/>
+              </w:rPr>
+              <w:t>☐  Power board + long extension lead (powered sites)</w:t>
+            </w:r>
+          </w:p>
+          <w:p>
+            <w:pPr>
+              <w:spacing w:after="20"/>
+            </w:pPr>
+            <w:r>
+              <w:rPr>
+                <w:color w:val="3B2A1D"/>
+                <w:sz w:val="19"/>
+              </w:rPr>
+              <w:t>☐  Washing line, pegs, travel laundry powder — wash kit daily</w:t>
+            </w:r>
+          </w:p>
+          <w:p>
+            <w:pPr>
+              <w:spacing w:after="20"/>
+            </w:pPr>
+            <w:r>
+              <w:rPr>
+                <w:color w:val="3B2A1D"/>
+                <w:sz w:val="19"/>
+              </w:rPr>
+              <w:t>☐  Towels, sink plug</w:t>
+            </w:r>
+          </w:p>
+          <w:p>
+            <w:pPr>
+              <w:spacing w:after="20"/>
+            </w:pPr>
+            <w:r>
+              <w:rPr>
+                <w:color w:val="3B2A1D"/>
+                <w:sz w:val="19"/>
+              </w:rPr>
+              <w:t>☐  Mozzie repellent + coils</w:t>
+            </w:r>
+          </w:p>
+        </w:tc>
+        <w:tc>
+          <w:tcPr>
+            <w:tcW w:type="dxa" w:w="4762"/>
+          </w:tcPr>
+          <w:p>
+            <w:r/>
+            <w:r>
+              <w:rPr>
+                <w:b/>
+                <w:color w:val="9C4526"/>
+                <w:sz w:val="20"/>
+              </w:rPr>
+              <w:t>Kitchen &amp; fuelling</w:t>
+            </w:r>
+          </w:p>
+          <w:p>
+            <w:pPr>
+              <w:spacing w:after="20"/>
+            </w:pPr>
+            <w:r>
+              <w:rPr>
+                <w:color w:val="3B2A1D"/>
+                <w:sz w:val="19"/>
+              </w:rPr>
+              <w:t>☐  Butane stove + spare cartridges, billy, utensils</w:t>
+            </w:r>
+          </w:p>
+          <w:p>
+            <w:pPr>
+              <w:spacing w:after="20"/>
+            </w:pPr>
+            <w:r>
+              <w:rPr>
+                <w:color w:val="3B2A1D"/>
+                <w:sz w:val="19"/>
+              </w:rPr>
+              <w:t>☐  Carb powder &amp; gels in bulk (~$45/day worth)</w:t>
+            </w:r>
+          </w:p>
+          <w:p>
+            <w:pPr>
+              <w:spacing w:after="20"/>
+            </w:pPr>
+            <w:r>
+              <w:rPr>
+                <w:color w:val="3B2A1D"/>
+                <w:sz w:val="19"/>
+              </w:rPr>
+              <w:t>☐  Recovery shakes + UHT milk</w:t>
+            </w:r>
+          </w:p>
+          <w:p>
+            <w:pPr>
+              <w:spacing w:after="20"/>
+            </w:pPr>
+            <w:r>
+              <w:rPr>
+                <w:color w:val="3B2A1D"/>
+                <w:sz w:val="19"/>
+              </w:rPr>
+              <w:t>☐  Real-food staples, restocked in towns</w:t>
+            </w:r>
+          </w:p>
+          <w:p>
+            <w:pPr>
+              <w:spacing w:after="20"/>
+            </w:pPr>
+            <w:r>
+              <w:rPr>
+                <w:color w:val="3B2A1D"/>
+                <w:sz w:val="19"/>
+              </w:rPr>
+              <w:t>☐  2 × 10 L water containers</w:t>
+            </w:r>
+          </w:p>
+          <w:p>
+            <w:pPr>
+              <w:spacing w:after="20"/>
+            </w:pPr>
+            <w:r>
+              <w:rPr>
+                <w:color w:val="3B2A1D"/>
+                <w:sz w:val="19"/>
+              </w:rPr>
+              <w:t>☐  Coffee kit — morale is equipment</w:t>
+            </w:r>
+          </w:p>
+        </w:tc>
+      </w:tr>
+    </w:tbl>
+    <w:p>
+      <w:pPr>
+        <w:spacing w:before="0" w:after="40"/>
+      </w:pPr>
+    </w:p>
+    <w:tbl>
+      <w:tblPr>
+        <w:tblStyle w:val="TableGrid"/>
+        <w:tblW w:type="auto" w:w="0"/>
+        <w:tblLook w:firstColumn="1" w:firstRow="1" w:lastColumn="0" w:lastRow="0" w:noHBand="0" w:noVBand="1" w:val="04A0"/>
+      </w:tblPr>
+      <w:tblGrid>
+        <w:gridCol w:w="4986"/>
+        <w:gridCol w:w="4986"/>
+      </w:tblGrid>
+      <w:tr>
+        <w:tc>
+          <w:tcPr>
+            <w:tcW w:type="dxa" w:w="4762"/>
+          </w:tcPr>
+          <w:p>
+            <w:r/>
+            <w:r>
+              <w:rPr>
+                <w:b/>
+                <w:color w:val="9C4526"/>
+                <w:sz w:val="20"/>
+              </w:rPr>
+              <w:t>Campaign kit</w:t>
+            </w:r>
+          </w:p>
+          <w:p>
+            <w:pPr>
+              <w:spacing w:after="20"/>
+            </w:pPr>
+            <w:r>
+              <w:rPr>
+                <w:color w:val="3B2A1D"/>
+                <w:sz w:val="19"/>
+              </w:rPr>
+              <w:t>☐  Phone tripod / gimbal + spare storage (daily stage content)</w:t>
+            </w:r>
+          </w:p>
+          <w:p>
+            <w:pPr>
+              <w:spacing w:after="20"/>
+            </w:pPr>
+            <w:r>
+              <w:rPr>
+                <w:color w:val="3B2A1D"/>
+                <w:sz w:val="19"/>
+              </w:rPr>
+              <w:t>☐  QR-code cards → Pink Is The Colour fundraiser</w:t>
+            </w:r>
+          </w:p>
+          <w:p>
+            <w:pPr>
+              <w:spacing w:after="20"/>
+            </w:pPr>
+            <w:r>
+              <w:rPr>
+                <w:color w:val="3B2A1D"/>
+                <w:sz w:val="19"/>
+              </w:rPr>
+              <w:t xml:space="preserve">     (roadside cash offers go to the Foundation, not pockets)</w:t>
+            </w:r>
+          </w:p>
+          <w:p>
+            <w:pPr>
+              <w:spacing w:after="20"/>
+            </w:pPr>
+            <w:r>
+              <w:rPr>
+                <w:color w:val="3B2A1D"/>
+                <w:sz w:val="19"/>
+              </w:rPr>
+              <w:t>☐  Sponsor banner + finish-line banner</w:t>
+            </w:r>
+          </w:p>
+          <w:p>
+            <w:pPr>
+              <w:spacing w:after="20"/>
+            </w:pPr>
+            <w:r>
+              <w:rPr>
+                <w:color w:val="3B2A1D"/>
+                <w:sz w:val="19"/>
+              </w:rPr>
+              <w:t>☐  Sponsor thank-you board</w:t>
+            </w:r>
+          </w:p>
+          <w:p>
+            <w:pPr>
+              <w:spacing w:after="20"/>
+            </w:pPr>
+            <w:r>
+              <w:rPr>
+                <w:color w:val="3B2A1D"/>
+                <w:sz w:val="19"/>
+              </w:rPr>
+              <w:t>☐  Travel-strength one-pager (printed) for rest-day sessions</w:t>
+            </w:r>
+          </w:p>
+        </w:tc>
+        <w:tc>
+          <w:tcPr>
+            <w:tcW w:type="dxa" w:w="4762"/>
+          </w:tcPr>
+          <w:p>
+            <w:r/>
+          </w:p>
+        </w:tc>
+      </w:tr>
+    </w:tbl>
+    <w:p>
+      <w:pPr>
+        <w:spacing w:before="0" w:after="40"/>
+      </w:pPr>
+    </w:p>
+    <w:p>
+      <w:pPr>
+        <w:spacing w:after="40"/>
+      </w:pPr>
+      <w:r>
+        <w:rPr>
+          <w:rFonts w:ascii="Calibri" w:hAnsi="Calibri"/>
+          <w:b/>
+          <w:color w:val="BC335F"/>
+          <w:sz w:val="18"/>
+        </w:rPr>
+        <w:t>THE ONE THAT BITES — CHRISTMAS CLOSURES</w:t>
+      </w:r>
+    </w:p>
+    <w:p>
+      <w:pPr>
+        <w:spacing w:before="0" w:after="120"/>
+      </w:pPr>
+      <w:r>
+        <w:rPr>
+          <w:rFonts w:ascii="Calibri" w:hAnsi="Calibri"/>
+          <w:b w:val="0"/>
+          <w:i w:val="0"/>
+          <w:color w:val="3B2A1D"/>
+          <w:sz w:val="20"/>
+        </w:rPr>
+        <w:t>The run starts Wed 23 Dec. Christmas Day is Day 3, Wallabadah → Murrurundi — the smallest towns on the whole route, with everything shut Christmas Day and Boxing Day. The full grocery and consumables stock-up happens in TAMWORTH on Day 1–2, and Day 3–4 food travels in the car. Anything you can't buy in Wallabadah on Christmas morning — because you can't buy anything in Wallabadah on Christmas morning — is already in the esky.</w:t>
+      </w:r>
+    </w:p>
+    <w:p>
+      <w:pPr>
+        <w:spacing w:before="0" w:after="80"/>
+      </w:pPr>
+      <w:r>
+        <w:rPr>
+          <w:rFonts w:ascii="Calibri" w:hAnsi="Calibri"/>
+          <w:b w:val="0"/>
+          <w:i w:val="0"/>
+          <w:color w:val="7A6A5C"/>
+          <w:sz w:val="19"/>
+        </w:rPr>
+        <w:t>Most of this list is already costed inside the $9,500 road budget (see the sponsorship prospectus). The genuinely new purchases are the shade shelter, the PLB and the camp kit — check the shed before the shops.</w:t>
+      </w:r>
+    </w:p>
     <w:p>
       <w:r>
         <w:br w:type="page"/>

</xml_diff>